<commit_message>
Add Discussion and Limitations sections
Discussion (9 paragraphs) and Limitations (6 paragraphs) drafted from the
manuscript's own results and the 18 source PDFs in the repository.
References 9-25 added to the bibliography.

Co-Authored-By: Claude Opus 5 <noreply@anthropic.com>
Claude-Session: https://claude.ai/code/session_01YWiUnqNkFDjjosdDr84no1
</commit_message>
<xml_diff>
--- a/main document-revised.docx
+++ b/main document-revised.docx
@@ -4683,6 +4683,177 @@
         <w:jc w:val="both"/>
         <w:rPr>
           <w:rFonts w:ascii="Times New Roman" w:hAnsi="Times New Roman"/>
+          <w:sz w:val="24"/>
+          <w:szCs w:val="24"/>
+        </w:rPr>
+      </w:pPr>
+      <w:r>
+        <w:rPr>
+          <w:rFonts w:ascii="Times New Roman" w:hAnsi="Times New Roman"/>
+          <w:b w:val="0"/>
+          <w:sz w:val="24"/>
+        </w:rPr>
+        <w:t>In this single-center retrospective cohort of 65 adults undergoing elective minimally invasive cardiac surgery (MICS) through a right mini-thoracotomy, Eleveld model-driven target-controlled infusion (TCI) was associated with three findings of unequal evidentiary weight. Time to safe extubation was shorter by a median of 112.5 minutes and by 35.5% after adjustment for age, ASA physical status, and cardiopulmonary bypass (CPB) duration, and it was the only outcome for which the achieved post-hoc power reached the conventional 0.80 threshold. The post-CPB hemodynamic profile of the TCI cohort was distinct rather than simply smoother, combining higher heart rates and lower central venous pressures with half the intraoperative crystalloid volume. New-onset conduction block or temporary pacing clustered almost entirely in the manually controlled infusion (MCI) arm, an association of large magnitude that the present design cannot separate from surgical and temporal confounding. Each of these findings is discussed in turn, with attention to what the data can and cannot support.</w:t>
+      </w:r>
+    </w:p>
+    <w:p>
+      <w:pPr>
+        <w:spacing w:line="360" w:lineRule="auto"/>
+        <w:jc w:val="both"/>
+        <w:rPr>
+          <w:rFonts w:ascii="Times New Roman" w:hAnsi="Times New Roman"/>
+          <w:sz w:val="24"/>
+          <w:szCs w:val="24"/>
+        </w:rPr>
+      </w:pPr>
+      <w:r>
+        <w:rPr>
+          <w:rFonts w:ascii="Times New Roman" w:hAnsi="Times New Roman"/>
+          <w:b w:val="0"/>
+          <w:sz w:val="24"/>
+        </w:rPr>
+        <w:t>The extubation finding is the most defensible result of this analysis. A median of 188 minutes from the end of anesthesia to safe extubation places the TCI cohort within the ultra-fast-track range described for MICS, and the effect persisted after multivariable adjustment (35.5% reduction, p = 0.008) and was unmodified by CPB duration (interaction p = 0.983). The direction agrees with the international multi-cohort analysis of Bai et al., in which TCI in elderly cardiac surgery patients was associated with fewer reintubations and less prolonged mechanical ventilation than MCI [9]. It also agrees with the accumulating MICS-specific literature on accelerated respiratory recovery. Wang et al. reported that operating room extubation after minimally invasive valve surgery is feasible without an excess of adverse safety events [8], Jiang et al. documented a shortening of intensive care unit (ICU) stay from 44 to 22.8 hours when ultra-fast-track cardiac anesthesia was applied in 947 MICS patients [10], and an earlier cohort from the same group achieved extubation within 0.3 hours using serratus anterior plane block-assisted ultra-fast-track anesthesia [11]. A structured MICS protocol from a high-volume Turkish center likewise sets extubation within four to six hours as the target for hemodynamically stable patients [12]. Our TCI patients met that target comfortably, and our MCI patients did not.</w:t>
+      </w:r>
+    </w:p>
+    <w:p>
+      <w:pPr>
+        <w:spacing w:line="360" w:lineRule="auto"/>
+        <w:jc w:val="both"/>
+        <w:rPr>
+          <w:rFonts w:ascii="Times New Roman" w:hAnsi="Times New Roman"/>
+          <w:sz w:val="24"/>
+          <w:szCs w:val="24"/>
+        </w:rPr>
+      </w:pPr>
+      <w:r>
+        <w:rPr>
+          <w:rFonts w:ascii="Times New Roman" w:hAnsi="Times New Roman"/>
+          <w:b w:val="0"/>
+          <w:sz w:val="24"/>
+        </w:rPr>
+        <w:t>What distinguishes our cohort from most published ultra-fast-track series is that the acceleration was achieved without a standardized regional analgesia protocol. In the series of Jiang et al., fascial plane blockade was one of only two positive independent predictors of successful ultra-fast-track implementation (OR 0.120 for failure), and in the ultra-fast-track cohorts of that group the analgesic technique carried much of the effect [10,11]. Our institutional pathway did not apply chest wall blocks uniformly, which leaves the infusion strategy itself as the plausible driver. Mechanistically, this is consistent with what the Eleveld model was designed to do. Weight-proportional manual infusions carry no internal account of distribution and clearance, so a fixed rate maintained through a long bypass run tends toward relative overdose and a lengthening context-sensitive decrement time. A model that incorporates age, weight, sex, and the presence of concomitant opioid administration into a single all-age parameter set should, in principle, hold the effect-site concentration closer to the intended target during maintenance and allow a more predictable decay after the infusion stops [5,6]. We could not verify this mechanism directly, because total drug consumption, target effect-site concentrations, and time-in-range for the processed electroencephalography index were not retrievable from the archived records. The mechanism therefore remains inferred rather than demonstrated.</w:t>
+      </w:r>
+    </w:p>
+    <w:p>
+      <w:pPr>
+        <w:spacing w:line="360" w:lineRule="auto"/>
+        <w:jc w:val="both"/>
+        <w:rPr>
+          <w:rFonts w:ascii="Times New Roman" w:hAnsi="Times New Roman"/>
+          <w:sz w:val="24"/>
+          <w:szCs w:val="24"/>
+        </w:rPr>
+      </w:pPr>
+      <w:r>
+        <w:rPr>
+          <w:rFonts w:ascii="Times New Roman" w:hAnsi="Times New Roman"/>
+          <w:b w:val="0"/>
+          <w:sz w:val="24"/>
+        </w:rPr>
+        <w:t>The post-CPB hemodynamic pattern requires a more careful reading than the pre-CPB pattern. Higher mean heart rate (88.0 vs 80.0 bpm) and lower central venous pressure (12.7 vs 17.8 mmHg) were the two comparisons that survived Benjamini-Hochberg adjustment, both with large effect sizes, and both are internally consistent with the two-fold difference in crystalloid administration (1,000 vs 2,000 mL). Taken together, these describe a leaner, less volume-loaded circulation at separation from bypass rather than a more stable one. In the specific setting of MICS this distinction matters. Peripheral femoro-femoral cannulation with vacuum-assisted venous drainage makes venous return sensitive to filling and to cannula position, and total lung deflation with re-expansion at the end of bypass carries a recognized risk of re-expansion pulmonary edema for which long bypass duration and generous fluid and plasma administration are contributing factors [13]. A restrictive intraoperative fluid strategy is therefore desirable on independent grounds, and the association observed here between TCI and lower fluid requirement is clinically meaningful even though the direction of causality is not established: a more stable induction-to-bypass course may reduce the reflex to give volume, or an anesthesiologist choosing TCI may also be an anesthesiologist practicing restrictive filling.</w:t>
+      </w:r>
+    </w:p>
+    <w:p>
+      <w:pPr>
+        <w:spacing w:line="360" w:lineRule="auto"/>
+        <w:jc w:val="both"/>
+        <w:rPr>
+          <w:rFonts w:ascii="Times New Roman" w:hAnsi="Times New Roman"/>
+          <w:sz w:val="24"/>
+          <w:szCs w:val="24"/>
+        </w:rPr>
+      </w:pPr>
+      <w:r>
+        <w:rPr>
+          <w:rFonts w:ascii="Times New Roman" w:hAnsi="Times New Roman"/>
+          <w:b w:val="0"/>
+          <w:sz w:val="24"/>
+        </w:rPr>
+        <w:t>The same reading applies to the higher post-CPB variability indices in the TCI group (ARV p = 0.013). Average real variability and variability independent of the mean quantify fluctuation, not adequacy, and a circulation with less volume buffer will fluctuate more in response to identical surgical and vasoactive stimuli. We do not interpret this as evidence of superior control after bypass, and we note that it runs opposite to the pre-CPB direction. Reassuringly, near-infrared spectroscopy values were comparable between groups in both phases, indicating that the more dynamic post-bypass trajectory of the TCI cohort was not accompanied by a detectable penalty in cerebral oxygenation. Bai et al. encountered an analogous phenomenon between their two cohorts, where the Union and INSPIRE populations displayed opposite variability and hypotension phenotypes, and attributed it to institutional differences in permissive post-bypass afterload management [9]. Our data support treating post-CPB volume and vasoactive policy as a site-specific modifier of any TCI-versus-MCI comparison rather than as a fixed property of the infusion technique.</w:t>
+      </w:r>
+    </w:p>
+    <w:p>
+      <w:pPr>
+        <w:spacing w:line="360" w:lineRule="auto"/>
+        <w:jc w:val="both"/>
+        <w:rPr>
+          <w:rFonts w:ascii="Times New Roman" w:hAnsi="Times New Roman"/>
+          <w:sz w:val="24"/>
+          <w:szCs w:val="24"/>
+        </w:rPr>
+      </w:pPr>
+      <w:r>
+        <w:rPr>
+          <w:rFonts w:ascii="Times New Roman" w:hAnsi="Times New Roman"/>
+          <w:b w:val="0"/>
+          <w:sz w:val="24"/>
+        </w:rPr>
+        <w:t>In the pre-CPB phase, the pattern was the one predicted by the pharmacological rationale, but it did not survive multiplicity adjustment. Fewer TCI patients experienced at least one hypotensive episode (16.7% vs 44.7%, OR 0.25, 95% CI 0.06-0.97) and the cumulative area under the mean arterial pressure curve below 65 mmHg was smaller, yet both p-values rose to 0.121 after correction across the 16 comparisons of Table 4, and VIM did not reach significance in either analysis. This interval concentrates the procedure's stimulus density, comprising induction, lateral tilt, initiation of one-lung ventilation, and femoral cannulation, and it is where a model-based system with continuous recalculation should differ most from stepwise manual adjustment [14-18]. That the direction was concordant with Bai et al. while the significance was not preserved is best explained by the size of the TCI arm. Eighteen patients provide little resolution for an incidence comparison, and we present these results as suggestive rather than confirmatory, in line with the conservative interpretation already adopted in the Results.</w:t>
+      </w:r>
+    </w:p>
+    <w:p>
+      <w:pPr>
+        <w:spacing w:line="360" w:lineRule="auto"/>
+        <w:jc w:val="both"/>
+        <w:rPr>
+          <w:rFonts w:ascii="Times New Roman" w:hAnsi="Times New Roman"/>
+          <w:sz w:val="24"/>
+          <w:szCs w:val="24"/>
+        </w:rPr>
+      </w:pPr>
+      <w:r>
+        <w:rPr>
+          <w:rFonts w:ascii="Times New Roman" w:hAnsi="Times New Roman"/>
+          <w:b w:val="0"/>
+          <w:sz w:val="24"/>
+        </w:rPr>
+        <w:t>The conduction findings are the most provocative and the least secure. Nineteen of twenty perioperative block or temporary pacing events occurred among the 47 MCI patients and one among the 18 TCI patients (Fisher's exact p = 0.007). Biological plausibility for an anesthetic contribution exists but is indirect. The atrioventricular node and the penetrating bundle lie immediately adjacent to the mitral and tricuspid annuli, so direct surgical trauma, retraction, and annular edema remain the dominant determinants of postoperative block after valve surgery, and the right mini-thoracotomy approach itself has been associated with bradycardia and atrioventricular conduction disturbance independently of the anesthetic technique [19]. If anesthetic management contributes at all, it would most plausibly do so through the perfusion conditions of the conduction tissue during and after separation from bypass: maintained diastolic and coronary perfusion pressure, avoidance of the profound sympatholysis that accompanies remifentanil accumulation, and the lower venous back-pressure suggested by the 5 mmHg difference in central venous pressure, which bears on coronary sinus drainage and myocardial interstitial edema. These are hypotheses, not conclusions. Three features of the data argue for restraint. The TCI patients were younger by a median of 17 years, their baseline heart rate was higher (90 vs 76 bpm), and the six-year enrollment window coincided with maturation of the institutional MICS program, so that the two infusion strategies are partly confounded with surgical experience and calendar time. Event sparsity precluded multivariable modelling of this endpoint, leaving an unadjusted test and an unstable effect estimate. Comparative outcome claims across evolving minimally invasive valve techniques are known to be vulnerable to exactly this kind of case-mix and temporal drift [20]. The association merits prospective evaluation with adjudicated electrocardiographic endpoints and prespecified adjustment for annular pathology and cross-clamp time. It does not, on this evidence, warrant a causal claim.</w:t>
+      </w:r>
+    </w:p>
+    <w:p>
+      <w:pPr>
+        <w:spacing w:line="360" w:lineRule="auto"/>
+        <w:jc w:val="both"/>
+        <w:rPr>
+          <w:rFonts w:ascii="Times New Roman" w:hAnsi="Times New Roman"/>
+          <w:sz w:val="24"/>
+          <w:szCs w:val="24"/>
+        </w:rPr>
+      </w:pPr>
+      <w:r>
+        <w:rPr>
+          <w:rFonts w:ascii="Times New Roman" w:hAnsi="Times New Roman"/>
+          <w:b w:val="0"/>
+          <w:sz w:val="24"/>
+        </w:rPr>
+        <w:t>Intensive care unit length of stay behaved as a downstream rather than a proximate endpoint. The unadjusted difference of 3.2 hours favoring TCI (p = 0.042) attenuated to non-significance once CPB duration entered the model (p = 0.272, 17.1% shorter on the back-transformed scale), and CPB duration was the only independent predictor retained (p = 0.032). Achieved power for this comparison was 21.5%. This should not be read as evidence against a TCI effect on ICU utilization. Bai et al. detected a difference of approximately one day in more than 700 propensity-matched patients [9], a magnitude that a sample of 65 cannot resolve, and ICU discharge in our unit is additionally bounded by ward availability and protocol-driven morning rounds, which compress the observable variance. The absence of any difference in hospital length of stay (8 vs 7 days, p = 0.854) is consistent with the same reasoning and with the larger MICS literature, where a two-day separation in hospital stay required 947 patients to demonstrate [10].</w:t>
+      </w:r>
+    </w:p>
+    <w:p>
+      <w:pPr>
+        <w:spacing w:line="360" w:lineRule="auto"/>
+        <w:jc w:val="both"/>
+        <w:rPr>
+          <w:rFonts w:ascii="Times New Roman" w:hAnsi="Times New Roman"/>
+          <w:sz w:val="24"/>
+          <w:szCs w:val="24"/>
+        </w:rPr>
+      </w:pPr>
+      <w:r>
+        <w:rPr>
+          <w:rFonts w:ascii="Times New Roman" w:hAnsi="Times New Roman"/>
+          <w:b w:val="0"/>
+          <w:sz w:val="24"/>
+        </w:rPr>
+        <w:t>Two implications follow for practice. First, Eleveld model-driven TCI appears compatible with an ultra-fast-track MICS pathway and requires no monitoring investment beyond the processed electroencephalography and cerebral oximetry already standard in these procedures. Second, it should be positioned as complementary to, not a substitute for, the other established levers of early extubation. Multimodal chest wall analgesia has the strongest evidence base among these, with serratus anterior plane blockade reducing opioid consumption after minimally invasive mitral surgery and a widening set of fascial plane techniques now described for MICS [21,22]. Combining a pharmacokinetically governed infusion with a standardized block protocol and a restrictive fluid strategy is the logical next step, and it is a testable one.</w:t>
+      </w:r>
+    </w:p>
+    <w:p>
+      <w:pPr>
+        <w:spacing w:line="360" w:lineRule="auto"/>
+        <w:jc w:val="both"/>
+        <w:rPr>
+          <w:rFonts w:ascii="Times New Roman" w:hAnsi="Times New Roman"/>
           <w:b/>
           <w:bCs/>
           <w:sz w:val="24"/>
@@ -4698,6 +4869,132 @@
           <w:szCs w:val="24"/>
         </w:rPr>
         <w:t>Limitations</w:t>
+      </w:r>
+    </w:p>
+    <w:p>
+      <w:pPr>
+        <w:spacing w:line="360" w:lineRule="auto"/>
+        <w:jc w:val="both"/>
+        <w:rPr>
+          <w:rFonts w:ascii="Times New Roman" w:hAnsi="Times New Roman"/>
+          <w:b/>
+          <w:bCs/>
+          <w:sz w:val="24"/>
+          <w:szCs w:val="24"/>
+        </w:rPr>
+      </w:pPr>
+      <w:r>
+        <w:rPr>
+          <w:rFonts w:ascii="Times New Roman" w:hAnsi="Times New Roman"/>
+          <w:b w:val="0"/>
+          <w:sz w:val="24"/>
+        </w:rPr>
+        <w:t>This study has substantial limitations that constrain the strength of every inference drawn above. The design is retrospective, single-center, and non-randomized, and allocation to TCI or MCI followed the preference of the attending anesthesiologist rather than a protocol. Confounding by indication is therefore unavoidable, and the direction of that confounding is not predictable: a clinician who selects a model-driven infusion may also apply a restrictive fluid strategy, a lower opioid load, and a more determined extubation policy, none of which can be disentangled from the infusion technique in these records.</w:t>
+      </w:r>
+    </w:p>
+    <w:p>
+      <w:pPr>
+        <w:spacing w:line="360" w:lineRule="auto"/>
+        <w:jc w:val="both"/>
+        <w:rPr>
+          <w:rFonts w:ascii="Times New Roman" w:hAnsi="Times New Roman"/>
+          <w:b/>
+          <w:bCs/>
+          <w:sz w:val="24"/>
+          <w:szCs w:val="24"/>
+        </w:rPr>
+      </w:pPr>
+      <w:r>
+        <w:rPr>
+          <w:rFonts w:ascii="Times New Roman" w:hAnsi="Times New Roman"/>
+          <w:b w:val="0"/>
+          <w:sz w:val="24"/>
+        </w:rPr>
+        <w:t>The groups were unbalanced in ways that bear directly on the principal outcomes. The TCI arm comprised 18 patients against 47 receiving MCI, and TCI patients were younger by a median of 17 years, more frequently hypertensive (61.1% vs 31.9%), and had a significantly higher baseline heart rate (90 vs 76 bpm). The last of these deserves particular emphasis, because the post-CPB heart rate difference that survived multiplicity adjustment may in part carry a baseline difference forward rather than reflect an effect of the anesthetic technique. Age, ASA physical status, and CPB duration were entered into the multivariable models, but baseline heart rate was not, and no adjustment can compensate for a treated group of 18.</w:t>
+      </w:r>
+    </w:p>
+    <w:p>
+      <w:pPr>
+        <w:spacing w:line="360" w:lineRule="auto"/>
+        <w:jc w:val="both"/>
+        <w:rPr>
+          <w:rFonts w:ascii="Times New Roman" w:hAnsi="Times New Roman"/>
+          <w:b/>
+          <w:bCs/>
+          <w:sz w:val="24"/>
+          <w:szCs w:val="24"/>
+        </w:rPr>
+      </w:pPr>
+      <w:r>
+        <w:rPr>
+          <w:rFonts w:ascii="Times New Roman" w:hAnsi="Times New Roman"/>
+          <w:b w:val="0"/>
+          <w:sz w:val="24"/>
+        </w:rPr>
+        <w:t>Enrollment spanned January 2020 to July 2025, and TCI was adopted later in that window. The comparison is therefore partly a comparison between calendar periods, during which the surgical program accumulated experience, perfusion and transfusion practice evolved, and enhanced recovery expectations tightened. This temporal confounding is an alternative explanation for both the extubation advantage and the conduction block distribution, and the available records did not permit adjustment for operative date or surgeon.</w:t>
+      </w:r>
+    </w:p>
+    <w:p>
+      <w:pPr>
+        <w:spacing w:line="360" w:lineRule="auto"/>
+        <w:jc w:val="both"/>
+        <w:rPr>
+          <w:rFonts w:ascii="Times New Roman" w:hAnsi="Times New Roman"/>
+          <w:b/>
+          <w:bCs/>
+          <w:sz w:val="24"/>
+          <w:szCs w:val="24"/>
+        </w:rPr>
+      </w:pPr>
+      <w:r>
+        <w:rPr>
+          <w:rFonts w:ascii="Times New Roman" w:hAnsi="Times New Roman"/>
+          <w:b w:val="0"/>
+          <w:sz w:val="24"/>
+        </w:rPr>
+        <w:t>Several measurement limitations apply. Intraoperative mean arterial pressure and heart rate were sampled at five-minute intervals, which attenuates average real variability and underestimates both the incidence and the cumulative area of brief hypotensive episodes; a higher sampling frequency would likely have increased the resolution of the pre-CPB comparison. The VIM transformation depends on a regression coefficient estimated within this cohort, so the resulting values are not directly comparable with those reported elsewhere. Depth of anesthesia was monitored with either the Narcotrend index or the bispectral index rather than a single device, and neither the achieved index values nor time-in-range were recoverable. Total propofol and remifentanil consumption and the target effect-site concentrations actually set were likewise unavailable, which prevents any direct pharmacokinetic verification of the proposed mechanism.</w:t>
+      </w:r>
+    </w:p>
+    <w:p>
+      <w:pPr>
+        <w:spacing w:line="360" w:lineRule="auto"/>
+        <w:jc w:val="both"/>
+        <w:rPr>
+          <w:rFonts w:ascii="Times New Roman" w:hAnsi="Times New Roman"/>
+          <w:b/>
+          <w:bCs/>
+          <w:sz w:val="24"/>
+          <w:szCs w:val="24"/>
+        </w:rPr>
+      </w:pPr>
+      <w:r>
+        <w:rPr>
+          <w:rFonts w:ascii="Times New Roman" w:hAnsi="Times New Roman"/>
+          <w:b w:val="0"/>
+          <w:sz w:val="24"/>
+        </w:rPr>
+        <w:t>Outcome ascertainment for the conduction endpoint relied on retrospective review of daily electrocardiograms and continuous telemetry without independent adjudication, and the composite of new block or temporary pacing does not distinguish transient conduction disturbance from persistent block, nor does it extend to permanent pacemaker implantation after discharge. Postoperative complications were otherwise infrequent, and the resulting event counts precluded inferential comparison and multivariable modelling for all of them, including the conduction endpoint itself. No a priori sample size calculation was performed; post-hoc power reached 0.80 only for time to extubation and was 21.5% for ICU length of stay, so negative secondary findings should not be read as evidence of absence. The Benjamini-Hochberg family was defined as the 16 hemodynamic comparisons of Table 4, which is a defensible but not a unique choice, and outcomes analyzed outside that family were not corrected for multiplicity.</w:t>
+      </w:r>
+    </w:p>
+    <w:p>
+      <w:pPr>
+        <w:spacing w:line="360" w:lineRule="auto"/>
+        <w:jc w:val="both"/>
+        <w:rPr>
+          <w:rFonts w:ascii="Times New Roman" w:hAnsi="Times New Roman"/>
+          <w:b/>
+          <w:bCs/>
+          <w:sz w:val="24"/>
+          <w:szCs w:val="24"/>
+        </w:rPr>
+      </w:pPr>
+      <w:r>
+        <w:rPr>
+          <w:rFonts w:ascii="Times New Roman" w:hAnsi="Times New Roman"/>
+          <w:b w:val="0"/>
+          <w:sz w:val="24"/>
+        </w:rPr>
+        <w:t>Finally, the cohort was drawn from a single tertiary center performing elective isolated mitral, tricuspid, and atrial septal defect procedures through a right mini-thoracotomy with peripheral cardiopulmonary bypass, in patients of ASA physical status III or IV without pre-existing advanced conduction disease. Findings should not be extended to sternotomy cases, to combined or emergency procedures, or to anatomically distorted presentations such as giant left atrium, where cannulation strategy and exposure differ materially [23]. The particular hazards of peripheral cannulation, including differential hypoxemia during femoro-femoral bypass, are additional site- and case-specific determinants of the intraoperative course that this analysis did not capture [24]. Regional analgesia was not standardized, chest tube drainage, pain scores, and opioid consumption were not systematically recorded, and no data on postoperative pulmonary function, patient-reported outcomes, cost, or follow-up beyond hospital discharge were collected, so the downstream consequences of earlier extubation reported in comparable MICS cohorts could not be assessed here [25].</w:t>
       </w:r>
     </w:p>
     <w:p>
@@ -5217,6 +5514,380 @@
         </w:rPr>
         <w:tab/>
         <w:t>Wang, C.C., et al., Safe Landing: Feasibility and Safety of Operating Room Extubation in Minimally Invasive Cardiac Valve Surgery. J Cardiothorac Vasc Anesth, 2024. 38(12): p. 2965-2972.</w:t>
+      </w:r>
+    </w:p>
+    <w:p>
+      <w:pPr>
+        <w:pStyle w:val="EndNoteBibliography"/>
+        <w:spacing w:line="480" w:lineRule="auto"/>
+        <w:ind w:left="720" w:hanging="720"/>
+        <w:rPr>
+          <w:rFonts w:ascii="Times New Roman" w:eastAsia="Calibri" w:hAnsi="Times New Roman" w:cs="Times New Roman"/>
+          <w:noProof w:val="0"/>
+          <w:sz w:val="24"/>
+        </w:rPr>
+      </w:pPr>
+      <w:r>
+        <w:rPr>
+          <w:rFonts w:ascii="Times New Roman" w:hAnsi="Times New Roman"/>
+          <w:b w:val="0"/>
+          <w:sz w:val="24"/>
+        </w:rPr>
+        <w:t>9.</w:t>
+        <w:tab/>
+        <w:t>Bai, Y.X., et al., Association of target-controlled versus manually controlled infusion with postoperative recovery outcomes in elderly cardiac surgery patients: an international multi-cohort study. J Clin Anesth, 2026. 111: p. 112161.</w:t>
+      </w:r>
+    </w:p>
+    <w:p>
+      <w:pPr>
+        <w:pStyle w:val="EndNoteBibliography"/>
+        <w:spacing w:line="480" w:lineRule="auto"/>
+        <w:ind w:left="720" w:hanging="720"/>
+        <w:rPr>
+          <w:rFonts w:ascii="Times New Roman" w:eastAsia="Calibri" w:hAnsi="Times New Roman" w:cs="Times New Roman"/>
+          <w:noProof w:val="0"/>
+          <w:sz w:val="24"/>
+        </w:rPr>
+      </w:pPr>
+      <w:r>
+        <w:rPr>
+          <w:rFonts w:ascii="Times New Roman" w:hAnsi="Times New Roman"/>
+          <w:b w:val="0"/>
+          <w:sz w:val="24"/>
+        </w:rPr>
+        <w:t>10.</w:t>
+        <w:tab/>
+        <w:t>Jiang, T., et al., Implementing Ultra-Fast-Track Cardiac Anesthesia in Minimally Invasive Cardiac Surgery. J Cardiothorac Vasc Anesth, 2025. 39(8): p. 2031-2039.</w:t>
+      </w:r>
+    </w:p>
+    <w:p>
+      <w:pPr>
+        <w:pStyle w:val="EndNoteBibliography"/>
+        <w:spacing w:line="480" w:lineRule="auto"/>
+        <w:ind w:left="720" w:hanging="720"/>
+        <w:rPr>
+          <w:rFonts w:ascii="Times New Roman" w:eastAsia="Calibri" w:hAnsi="Times New Roman" w:cs="Times New Roman"/>
+          <w:noProof w:val="0"/>
+          <w:sz w:val="24"/>
+        </w:rPr>
+      </w:pPr>
+      <w:r>
+        <w:rPr>
+          <w:rFonts w:ascii="Times New Roman" w:hAnsi="Times New Roman"/>
+          <w:b w:val="0"/>
+          <w:sz w:val="24"/>
+        </w:rPr>
+        <w:t>11.</w:t>
+        <w:tab/>
+        <w:t>Jiang, S., et al., The Clinical Application of Ultra-Fast-Track Cardiac Anesthesia in Right-Thoracoscopic Minimally Invasive Cardiac Surgery: A Retrospective Observational Study. J Cardiothorac Vasc Anesth, 2023. 37(5): p. 700-706.</w:t>
+      </w:r>
+    </w:p>
+    <w:p>
+      <w:pPr>
+        <w:pStyle w:val="EndNoteBibliography"/>
+        <w:spacing w:line="480" w:lineRule="auto"/>
+        <w:ind w:left="720" w:hanging="720"/>
+        <w:rPr>
+          <w:rFonts w:ascii="Times New Roman" w:eastAsia="Calibri" w:hAnsi="Times New Roman" w:cs="Times New Roman"/>
+          <w:noProof w:val="0"/>
+          <w:sz w:val="24"/>
+        </w:rPr>
+      </w:pPr>
+      <w:r>
+        <w:rPr>
+          <w:rFonts w:ascii="Times New Roman" w:hAnsi="Times New Roman"/>
+          <w:b w:val="0"/>
+          <w:sz w:val="24"/>
+        </w:rPr>
+        <w:t>12.</w:t>
+        <w:tab/>
+        <w:t>Demir, Z.A. and H.L. Mavioglu, Anesthesia Management in Minimally Invasive Cardiac Surgery: A Comprehensive Protocol. GKDA Derg, 2025. 31(2): p. 63-70.</w:t>
+      </w:r>
+    </w:p>
+    <w:p>
+      <w:pPr>
+        <w:pStyle w:val="EndNoteBibliography"/>
+        <w:spacing w:line="480" w:lineRule="auto"/>
+        <w:ind w:left="720" w:hanging="720"/>
+        <w:rPr>
+          <w:rFonts w:ascii="Times New Roman" w:eastAsia="Calibri" w:hAnsi="Times New Roman" w:cs="Times New Roman"/>
+          <w:noProof w:val="0"/>
+          <w:sz w:val="24"/>
+        </w:rPr>
+      </w:pPr>
+      <w:r>
+        <w:rPr>
+          <w:rFonts w:ascii="Times New Roman" w:hAnsi="Times New Roman"/>
+          <w:b w:val="0"/>
+          <w:sz w:val="24"/>
+        </w:rPr>
+        <w:t>13.</w:t>
+        <w:tab/>
+        <w:t>Piekarski, F., et al., Anesthesia for Minimal Invasive Cardiac Surgery: The Bonn Heart Center Protocol. J Clin Med, 2024. 13(13): p. 3939.</w:t>
+      </w:r>
+    </w:p>
+    <w:p>
+      <w:pPr>
+        <w:pStyle w:val="EndNoteBibliography"/>
+        <w:spacing w:line="480" w:lineRule="auto"/>
+        <w:ind w:left="720" w:hanging="720"/>
+        <w:rPr>
+          <w:rFonts w:ascii="Times New Roman" w:eastAsia="Calibri" w:hAnsi="Times New Roman" w:cs="Times New Roman"/>
+          <w:noProof w:val="0"/>
+          <w:sz w:val="24"/>
+        </w:rPr>
+      </w:pPr>
+      <w:r>
+        <w:rPr>
+          <w:rFonts w:ascii="Times New Roman" w:hAnsi="Times New Roman"/>
+          <w:b w:val="0"/>
+          <w:sz w:val="24"/>
+        </w:rPr>
+        <w:t>14.</w:t>
+        <w:tab/>
+        <w:t>Aston, D., D. Zeloof, and F. Falter, Anaesthesia for Minimally Invasive Cardiac Surgery. J Cardiovasc Dev Dis, 2023. 10(11): p. 462.</w:t>
+      </w:r>
+    </w:p>
+    <w:p>
+      <w:pPr>
+        <w:pStyle w:val="EndNoteBibliography"/>
+        <w:spacing w:line="480" w:lineRule="auto"/>
+        <w:ind w:left="720" w:hanging="720"/>
+        <w:rPr>
+          <w:rFonts w:ascii="Times New Roman" w:eastAsia="Calibri" w:hAnsi="Times New Roman" w:cs="Times New Roman"/>
+          <w:noProof w:val="0"/>
+          <w:sz w:val="24"/>
+        </w:rPr>
+      </w:pPr>
+      <w:r>
+        <w:rPr>
+          <w:rFonts w:ascii="Times New Roman" w:hAnsi="Times New Roman"/>
+          <w:b w:val="0"/>
+          <w:sz w:val="24"/>
+        </w:rPr>
+        <w:t>15.</w:t>
+        <w:tab/>
+        <w:t>White, A., C. Patvardhan, and F. Falter, Anesthesia for minimally invasive cardiac surgery. J Thorac Dis, 2021. 13(3): p. 1886-1898.</w:t>
+      </w:r>
+    </w:p>
+    <w:p>
+      <w:pPr>
+        <w:pStyle w:val="EndNoteBibliography"/>
+        <w:spacing w:line="480" w:lineRule="auto"/>
+        <w:ind w:left="720" w:hanging="720"/>
+        <w:rPr>
+          <w:rFonts w:ascii="Times New Roman" w:eastAsia="Calibri" w:hAnsi="Times New Roman" w:cs="Times New Roman"/>
+          <w:noProof w:val="0"/>
+          <w:sz w:val="24"/>
+        </w:rPr>
+      </w:pPr>
+      <w:r>
+        <w:rPr>
+          <w:rFonts w:ascii="Times New Roman" w:hAnsi="Times New Roman"/>
+          <w:b w:val="0"/>
+          <w:sz w:val="24"/>
+        </w:rPr>
+        <w:t>16.</w:t>
+        <w:tab/>
+        <w:t>Parnell, A. and M. Prince, Anaesthesia for minimally invasive cardiac surgery. BJA Educ, 2018. 18(10): p. 323-330.</w:t>
+      </w:r>
+    </w:p>
+    <w:p>
+      <w:pPr>
+        <w:pStyle w:val="EndNoteBibliography"/>
+        <w:spacing w:line="480" w:lineRule="auto"/>
+        <w:ind w:left="720" w:hanging="720"/>
+        <w:rPr>
+          <w:rFonts w:ascii="Times New Roman" w:eastAsia="Calibri" w:hAnsi="Times New Roman" w:cs="Times New Roman"/>
+          <w:noProof w:val="0"/>
+          <w:sz w:val="24"/>
+        </w:rPr>
+      </w:pPr>
+      <w:r>
+        <w:rPr>
+          <w:rFonts w:ascii="Times New Roman" w:hAnsi="Times New Roman"/>
+          <w:b w:val="0"/>
+          <w:sz w:val="24"/>
+        </w:rPr>
+        <w:t>17.</w:t>
+        <w:tab/>
+        <w:t>Ganapathy, S., Anaesthesia for minimally invasive cardiac surgery. Best Pract Res Clin Anaesthesiol, 2002. 16(1): p. 63-80.</w:t>
+      </w:r>
+    </w:p>
+    <w:p>
+      <w:pPr>
+        <w:pStyle w:val="EndNoteBibliography"/>
+        <w:spacing w:line="480" w:lineRule="auto"/>
+        <w:ind w:left="720" w:hanging="720"/>
+        <w:rPr>
+          <w:rFonts w:ascii="Times New Roman" w:eastAsia="Calibri" w:hAnsi="Times New Roman" w:cs="Times New Roman"/>
+          <w:noProof w:val="0"/>
+          <w:sz w:val="24"/>
+        </w:rPr>
+      </w:pPr>
+      <w:r>
+        <w:rPr>
+          <w:rFonts w:ascii="Times New Roman" w:hAnsi="Times New Roman"/>
+          <w:b w:val="0"/>
+          <w:sz w:val="24"/>
+        </w:rPr>
+        <w:t>18.</w:t>
+        <w:tab/>
+        <w:t>Malik, V., A.K. Jha, and P.M. Kapoor, Anesthetic challenges in minimally invasive cardiac surgery: Are we moving in a right direction? Ann Card Anaesth, 2016. 19(3): p. 489-497.</w:t>
+      </w:r>
+    </w:p>
+    <w:p>
+      <w:pPr>
+        <w:pStyle w:val="EndNoteBibliography"/>
+        <w:spacing w:line="480" w:lineRule="auto"/>
+        <w:ind w:left="720" w:hanging="720"/>
+        <w:rPr>
+          <w:rFonts w:ascii="Times New Roman" w:eastAsia="Calibri" w:hAnsi="Times New Roman" w:cs="Times New Roman"/>
+          <w:noProof w:val="0"/>
+          <w:sz w:val="24"/>
+        </w:rPr>
+      </w:pPr>
+      <w:r>
+        <w:rPr>
+          <w:rFonts w:ascii="Times New Roman" w:hAnsi="Times New Roman"/>
+          <w:b w:val="0"/>
+          <w:sz w:val="24"/>
+        </w:rPr>
+        <w:t>19.</w:t>
+        <w:tab/>
+        <w:t>Balasubramanyam, U. and P.M. Kapoor, Anesthetic Challenges in Minimally Invasive Cardiac Surgery. J Card Crit Care TSS, 2020. 3(1): p. 28-35.</w:t>
+      </w:r>
+    </w:p>
+    <w:p>
+      <w:pPr>
+        <w:pStyle w:val="EndNoteBibliography"/>
+        <w:spacing w:line="480" w:lineRule="auto"/>
+        <w:ind w:left="720" w:hanging="720"/>
+        <w:rPr>
+          <w:rFonts w:ascii="Times New Roman" w:eastAsia="Calibri" w:hAnsi="Times New Roman" w:cs="Times New Roman"/>
+          <w:noProof w:val="0"/>
+          <w:sz w:val="24"/>
+        </w:rPr>
+      </w:pPr>
+      <w:r>
+        <w:rPr>
+          <w:rFonts w:ascii="Times New Roman" w:hAnsi="Times New Roman"/>
+          <w:b w:val="0"/>
+          <w:sz w:val="24"/>
+        </w:rPr>
+        <w:t>20.</w:t>
+        <w:tab/>
+        <w:t>Rosengart, T.K., et al., Percutaneous and minimally invasive valve procedures: a scientific statement from the American Heart Association. Circulation, 2008. 117(13): p. 1750-1767.</w:t>
+      </w:r>
+    </w:p>
+    <w:p>
+      <w:pPr>
+        <w:pStyle w:val="EndNoteBibliography"/>
+        <w:spacing w:line="480" w:lineRule="auto"/>
+        <w:ind w:left="720" w:hanging="720"/>
+        <w:rPr>
+          <w:rFonts w:ascii="Times New Roman" w:eastAsia="Calibri" w:hAnsi="Times New Roman" w:cs="Times New Roman"/>
+          <w:noProof w:val="0"/>
+          <w:sz w:val="24"/>
+        </w:rPr>
+      </w:pPr>
+      <w:r>
+        <w:rPr>
+          <w:rFonts w:ascii="Times New Roman" w:hAnsi="Times New Roman"/>
+          <w:b w:val="0"/>
+          <w:sz w:val="24"/>
+        </w:rPr>
+        <w:t>21.</w:t>
+        <w:tab/>
+        <w:t>Marianello, D., et al., Deep Serratus Anterior Plane Block for Multimodal Analgesia in Minimally Invasive Mitral Valve Surgery Performed via Right Anterior Mini-Thoracotomy. J Cardiothorac Vasc Anesth, 2025. 39(4): p. 941-948.</w:t>
+      </w:r>
+    </w:p>
+    <w:p>
+      <w:pPr>
+        <w:pStyle w:val="EndNoteBibliography"/>
+        <w:spacing w:line="480" w:lineRule="auto"/>
+        <w:ind w:left="720" w:hanging="720"/>
+        <w:rPr>
+          <w:rFonts w:ascii="Times New Roman" w:eastAsia="Calibri" w:hAnsi="Times New Roman" w:cs="Times New Roman"/>
+          <w:noProof w:val="0"/>
+          <w:sz w:val="24"/>
+        </w:rPr>
+      </w:pPr>
+      <w:r>
+        <w:rPr>
+          <w:rFonts w:ascii="Times New Roman" w:hAnsi="Times New Roman"/>
+          <w:b w:val="0"/>
+          <w:sz w:val="24"/>
+        </w:rPr>
+        <w:t>22.</w:t>
+        <w:tab/>
+        <w:t>Yuan, K., et al., Advances in Anesthesia Techniques for Postoperative Pain Management in Minimally Invasive Cardiac Surgery: An Expert Opinion. J Cardiothorac Vasc Anesth, 2025. 39(4): p. 1026-1036.</w:t>
+      </w:r>
+    </w:p>
+    <w:p>
+      <w:pPr>
+        <w:pStyle w:val="EndNoteBibliography"/>
+        <w:spacing w:line="480" w:lineRule="auto"/>
+        <w:ind w:left="720" w:hanging="720"/>
+        <w:rPr>
+          <w:rFonts w:ascii="Times New Roman" w:eastAsia="Calibri" w:hAnsi="Times New Roman" w:cs="Times New Roman"/>
+          <w:noProof w:val="0"/>
+          <w:sz w:val="24"/>
+        </w:rPr>
+      </w:pPr>
+      <w:r>
+        <w:rPr>
+          <w:rFonts w:ascii="Times New Roman" w:hAnsi="Times New Roman"/>
+          <w:b w:val="0"/>
+          <w:sz w:val="24"/>
+        </w:rPr>
+        <w:t>23.</w:t>
+        <w:tab/>
+        <w:t>Altawil, L., et al., Minimally Invasive Mitral Valve Replacement in a Patient With a Giant Left Atrium. Cureus, 2025. 17(6): p. e85423.</w:t>
+      </w:r>
+    </w:p>
+    <w:p>
+      <w:pPr>
+        <w:pStyle w:val="EndNoteBibliography"/>
+        <w:spacing w:line="480" w:lineRule="auto"/>
+        <w:ind w:left="720" w:hanging="720"/>
+        <w:rPr>
+          <w:rFonts w:ascii="Times New Roman" w:eastAsia="Calibri" w:hAnsi="Times New Roman" w:cs="Times New Roman"/>
+          <w:noProof w:val="0"/>
+          <w:sz w:val="24"/>
+        </w:rPr>
+      </w:pPr>
+      <w:r>
+        <w:rPr>
+          <w:rFonts w:ascii="Times New Roman" w:hAnsi="Times New Roman"/>
+          <w:b w:val="0"/>
+          <w:sz w:val="24"/>
+        </w:rPr>
+        <w:t>24.</w:t>
+        <w:tab/>
+        <w:t>Aquilina, J., et al., Differential hypoxemia during peripheral cardiopulmonary bypass. Perfusion, 2025. 40(5): p. 1291-1293.</w:t>
+      </w:r>
+    </w:p>
+    <w:p>
+      <w:pPr>
+        <w:pStyle w:val="EndNoteBibliography"/>
+        <w:spacing w:line="480" w:lineRule="auto"/>
+        <w:ind w:left="720" w:hanging="720"/>
+        <w:rPr>
+          <w:rFonts w:ascii="Times New Roman" w:eastAsia="Calibri" w:hAnsi="Times New Roman" w:cs="Times New Roman"/>
+          <w:noProof w:val="0"/>
+          <w:sz w:val="24"/>
+        </w:rPr>
+      </w:pPr>
+      <w:r>
+        <w:rPr>
+          <w:rFonts w:ascii="Times New Roman" w:hAnsi="Times New Roman"/>
+          <w:b w:val="0"/>
+          <w:sz w:val="24"/>
+        </w:rPr>
+        <w:t>25.</w:t>
+        <w:tab/>
+        <w:t>Jiang, T., et al., Ultra-fast-track cardiac anesthesia in minimally invasive cardiac surgery: a retrospective observational study. Cardiovasc Diagn Ther, 2024. 14(5): p. 740-752.</w:t>
       </w:r>
     </w:p>
     <w:p>

</xml_diff>

<commit_message>
Flatten EndNote field codes to plain text
The bibliography and 12 in-text citations were live EndNote fields, so
"Update Citations and Bibliography" in Word would have regenerated the
reference list and dropped the newly added references 9-25. Field runs
(fldChar/instrText) removed, result text preserved unchanged; footer
page-number fields left intact.

Co-Authored-By: Claude Opus 5 <noreply@anthropic.com>
Claude-Session: https://claude.ai/code/session_01YWiUnqNkFDjjosdDr84no1
</commit_message>
<xml_diff>
--- a/main document-revised.docx
+++ b/main document-revised.docx
@@ -946,193 +946,15 @@
           <w:szCs w:val="24"/>
           <w:lang w:val="tr-TR"/>
         </w:rPr>
-        <w:fldChar w:fldCharType="begin">
-          <w:fldData xml:space="preserve">PEVuZE5vdGU+PENpdGU+PEF1dGhvcj5Jc2hpa2F3YTwvQXV0aG9yPjxZZWFyPjIwMTU8L1llYXI+
-PFJlY051bT4zPC9SZWNOdW0+PERpc3BsYXlUZXh0PlsxLCAyXTwvRGlzcGxheVRleHQ+PHJlY29y
-ZD48cmVjLW51bWJlcj4zPC9yZWMtbnVtYmVyPjxmb3JlaWduLWtleXM+PGtleSBhcHA9IkVOIiBk
-Yi1pZD0id3dyZnp6dGFsMDl3ZHNlZXZwOTVmOXhxd2VkejI1cnR0dHM5IiB0aW1lc3RhbXA9IjE3
-Nzk4Mjc2MTEiPjM8L2tleT48L2ZvcmVpZ24ta2V5cz48cmVmLXR5cGUgbmFtZT0iSm91cm5hbCBB
-cnRpY2xlIj4xNzwvcmVmLXR5cGU+PGNvbnRyaWJ1dG9ycz48YXV0aG9ycz48YXV0aG9yPklzaGlr
-YXdhLCBOLjwvYXV0aG9yPjxhdXRob3I+V2F0YW5hYmUsIEcuPC9hdXRob3I+PC9hdXRob3JzPjwv
-Y29udHJpYnV0b3JzPjxhdXRoLWFkZHJlc3M+TmV3SGVhcnQgV2F0YW5hYmUgSW5zdGl0dXRlLCBU
-b2t5bywgSmFwYW4uPC9hdXRoLWFkZHJlc3M+PHRpdGxlcz48dGl0bGU+Um9ib3QtYXNzaXN0ZWQg
-Y2FyZGlhYyBzdXJnZXJ5PC90aXRsZT48c2Vjb25kYXJ5LXRpdGxlPkFubiBUaG9yYWMgQ2FyZGlv
-dmFzYyBTdXJnPC9zZWNvbmRhcnktdGl0bGU+PC90aXRsZXM+PHBlcmlvZGljYWw+PGZ1bGwtdGl0
-bGU+QW5uIFRob3JhYyBDYXJkaW92YXNjIFN1cmc8L2Z1bGwtdGl0bGU+PC9wZXJpb2RpY2FsPjxw
-YWdlcz4zMjItODwvcGFnZXM+PHZvbHVtZT4yMTwvdm9sdW1lPjxudW1iZXI+NDwvbnVtYmVyPjxl
-ZGl0aW9uPjIwMTUwNzAyPC9lZGl0aW9uPjxrZXl3b3Jkcz48a2V5d29yZD4qQ29yb25hcnkgQXJ0
-ZXJ5IEJ5cGFzczwva2V5d29yZD48a2V5d29yZD5Db3JvbmFyeSBBcnRlcnkgQnlwYXNzLCBPZmYt
-UHVtcDwva2V5d29yZD48a2V5d29yZD5FdmlkZW5jZS1CYXNlZCBNZWRpY2luZTwva2V5d29yZD48
-a2V5d29yZD5IZWFydCBEaXNlYXNlcy8qc3VyZ2VyeTwva2V5d29yZD48a2V5d29yZD5IZWFydCBT
-ZXB0YWwgRGVmZWN0cywgQXRyaWFsL3N1cmdlcnk8L2tleXdvcmQ+PGtleXdvcmQ+SHVtYW5zPC9r
-ZXl3b3JkPjxrZXl3b3JkPk15b2NhcmRpYWwgSXNjaGVtaWEvc3VyZ2VyeTwva2V5d29yZD48a2V5
-d29yZD4qUm9ib3RpYyBTdXJnaWNhbCBQcm9jZWR1cmVzL2luc3RydW1lbnRhdGlvbi9tZXRob2Rz
-PC9rZXl3b3JkPjxrZXl3b3JkPlRyZWF0bWVudCBPdXRjb21lPC9rZXl3b3JkPjwva2V5d29yZHM+
-PGRhdGVzPjx5ZWFyPjIwMTU8L3llYXI+PC9kYXRlcz48aXNibj4xMzQxLTEwOTggKFByaW50KSYj
-eEQ7MTM0MS0xMDk4PC9pc2JuPjxhY2Nlc3Npb24tbnVtPjI2MTM0MDczPC9hY2Nlc3Npb24tbnVt
-Pjx1cmxzPjwvdXJscz48Y3VzdG9tMj5QTUM0OTA0ODY2PC9jdXN0b20yPjxlbGVjdHJvbmljLXJl
-c291cmNlLW51bT4xMC41NzYxL2F0Y3MucmEuMTUtMDAxNDU8L2VsZWN0cm9uaWMtcmVzb3VyY2Ut
-bnVtPjxyZW1vdGUtZGF0YWJhc2UtcHJvdmlkZXI+TkxNPC9yZW1vdGUtZGF0YWJhc2UtcHJvdmlk
-ZXI+PGxhbmd1YWdlPmVuZzwvbGFuZ3VhZ2U+PC9yZWNvcmQ+PC9DaXRlPjxDaXRlPjxBdXRob3I+
-VmVybmljazwvQXV0aG9yPjxZZWFyPjIwMTM8L1llYXI+PFJlY051bT43PC9SZWNOdW0+PHJlY29y
-ZD48cmVjLW51bWJlcj43PC9yZWMtbnVtYmVyPjxmb3JlaWduLWtleXM+PGtleSBhcHA9IkVOIiBk
-Yi1pZD0id3dyZnp6dGFsMDl3ZHNlZXZwOTVmOXhxd2VkejI1cnR0dHM5IiB0aW1lc3RhbXA9IjE3
-Nzk4Mjc3NTQiPjc8L2tleT48L2ZvcmVpZ24ta2V5cz48cmVmLXR5cGUgbmFtZT0iSm91cm5hbCBB
-cnRpY2xlIj4xNzwvcmVmLXR5cGU+PGNvbnRyaWJ1dG9ycz48YXV0aG9ycz48YXV0aG9yPlZlcm5p
-Y2ssIFcuPC9hdXRob3I+PGF1dGhvcj5BdGx1cmksIFAuPC9hdXRob3I+PC9hdXRob3JzPjwvY29u
-dHJpYnV0b3JzPjxhdXRoLWFkZHJlc3M+RGVwYXJ0bWVudCBvZiBBbmVzdGhlc2lvbG9neSBhbmQg
-Q3JpdGljYWwgQ2FyZSwgVGhlIFBlcmVsbWFuIFNjaG9vbCBvZiBNZWRpY2luZSBhdCB0aGUgVW5p
-dmVyc2l0eSBIb3NwdGlhbCBvZiBQZW5uc3lsdmFuaWEsIDM0MDAgU3BydWNlIFN0cmVldCwgUGhp
-bGFkZWxwaGlhLCBQQSAxOTEwNCwgVVNBLiB3aWxsaWFtLnZlcm5pY2tAdXBocy51cGVubi5lZHU8
-L2F1dGgtYWRkcmVzcz48dGl0bGVzPjx0aXRsZT5Sb2JvdGljIGFuZCBtaW5pbWFsbHkgaW52YXNp
-dmUgY2FyZGlhYyBzdXJnZXJ5PC90aXRsZT48c2Vjb25kYXJ5LXRpdGxlPkFuZXN0aGVzaW9sIENs
-aW48L3NlY29uZGFyeS10aXRsZT48L3RpdGxlcz48cGVyaW9kaWNhbD48ZnVsbC10aXRsZT5BbmVz
-dGhlc2lvbCBDbGluPC9mdWxsLXRpdGxlPjwvcGVyaW9kaWNhbD48cGFnZXM+Mjk5LTMyMDwvcGFn
-ZXM+PHZvbHVtZT4zMTwvdm9sdW1lPjxudW1iZXI+MjwvbnVtYmVyPjxlZGl0aW9uPjIwMTMwMzEz
-PC9lZGl0aW9uPjxrZXl3b3Jkcz48a2V5d29yZD5BaXJ3YXkgTWFuYWdlbWVudDwva2V5d29yZD48
-a2V5d29yZD5BbmVzdGhlc2lhL21ldGhvZHM8L2tleXdvcmQ+PGtleXdvcmQ+Q2FyZGlvcHVsbW9u
-YXJ5IEJ5cGFzczwva2V5d29yZD48a2V5d29yZD5FY2hvY2FyZGlvZ3JhcGh5LCBUcmFuc2Vzb3Bo
-YWdlYWw8L2tleXdvcmQ+PGtleXdvcmQ+SHVtYW5zPC9rZXl3b3JkPjxrZXl3b3JkPk1pbmltYWxs
-eSBJbnZhc2l2ZSBTdXJnaWNhbCBQcm9jZWR1cmVzLyptZXRob2RzPC9rZXl3b3JkPjxrZXl3b3Jk
-Pk1pdHJhbCBWYWx2ZS8qc3VyZ2VyeTwva2V5d29yZD48a2V5d29yZD5PbmUtTHVuZyBWZW50aWxh
-dGlvbjwva2V5d29yZD48a2V5d29yZD5Qb3N0b3BlcmF0aXZlIFBhaW4vZHJ1ZyB0aGVyYXB5PC9r
-ZXl3b3JkPjxrZXl3b3JkPlJvYm90aWNzLyptZXRob2RzPC9rZXl3b3JkPjwva2V5d29yZHM+PGRh
-dGVzPjx5ZWFyPjIwMTM8L3llYXI+PHB1Yi1kYXRlcz48ZGF0ZT5KdW48L2RhdGU+PC9wdWItZGF0
-ZXM+PC9kYXRlcz48aXNibj4xOTMyLTIyNzUgKFByaW50KSYjeEQ7MTkzMi0yMjc1PC9pc2JuPjxh
-Y2Nlc3Npb24tbnVtPjIzNzExNjQ2PC9hY2Nlc3Npb24tbnVtPjx1cmxzPjwvdXJscz48ZWxlY3Ry
-b25pYy1yZXNvdXJjZS1udW0+MTAuMTAxNi9qLmFuY2xpbi4yMDEyLjEyLjAwMjwvZWxlY3Ryb25p
-Yy1yZXNvdXJjZS1udW0+PHJlbW90ZS1kYXRhYmFzZS1wcm92aWRlcj5OTE08L3JlbW90ZS1kYXRh
-YmFzZS1wcm92aWRlcj48bGFuZ3VhZ2U+ZW5nPC9sYW5ndWFnZT48L3JlY29yZD48L0NpdGU+PC9F
-bmROb3RlPgB=
-</w:fldData>
-        </w:fldChar>
-      </w:r>
-      <w:r>
-        <w:rPr>
-          <w:rFonts w:ascii="Times New Roman" w:hAnsi="Times New Roman"/>
-          <w:bCs/>
-          <w:sz w:val="24"/>
-          <w:szCs w:val="24"/>
-          <w:lang w:val="tr-TR"/>
-        </w:rPr>
-        <w:instrText xml:space="preserve"> ADDIN EN.CITE </w:instrText>
-      </w:r>
-      <w:r>
-        <w:rPr>
-          <w:rFonts w:ascii="Times New Roman" w:hAnsi="Times New Roman"/>
-          <w:bCs/>
-          <w:sz w:val="24"/>
-          <w:szCs w:val="24"/>
-          <w:lang w:val="tr-TR"/>
-        </w:rPr>
-        <w:fldChar w:fldCharType="begin">
-          <w:fldData xml:space="preserve">PEVuZE5vdGU+PENpdGU+PEF1dGhvcj5Jc2hpa2F3YTwvQXV0aG9yPjxZZWFyPjIwMTU8L1llYXI+
-PFJlY051bT4zPC9SZWNOdW0+PERpc3BsYXlUZXh0PlsxLCAyXTwvRGlzcGxheVRleHQ+PHJlY29y
-ZD48cmVjLW51bWJlcj4zPC9yZWMtbnVtYmVyPjxmb3JlaWduLWtleXM+PGtleSBhcHA9IkVOIiBk
-Yi1pZD0id3dyZnp6dGFsMDl3ZHNlZXZwOTVmOXhxd2VkejI1cnR0dHM5IiB0aW1lc3RhbXA9IjE3
-Nzk4Mjc2MTEiPjM8L2tleT48L2ZvcmVpZ24ta2V5cz48cmVmLXR5cGUgbmFtZT0iSm91cm5hbCBB
-cnRpY2xlIj4xNzwvcmVmLXR5cGU+PGNvbnRyaWJ1dG9ycz48YXV0aG9ycz48YXV0aG9yPklzaGlr
-YXdhLCBOLjwvYXV0aG9yPjxhdXRob3I+V2F0YW5hYmUsIEcuPC9hdXRob3I+PC9hdXRob3JzPjwv
-Y29udHJpYnV0b3JzPjxhdXRoLWFkZHJlc3M+TmV3SGVhcnQgV2F0YW5hYmUgSW5zdGl0dXRlLCBU
-b2t5bywgSmFwYW4uPC9hdXRoLWFkZHJlc3M+PHRpdGxlcz48dGl0bGU+Um9ib3QtYXNzaXN0ZWQg
-Y2FyZGlhYyBzdXJnZXJ5PC90aXRsZT48c2Vjb25kYXJ5LXRpdGxlPkFubiBUaG9yYWMgQ2FyZGlv
-dmFzYyBTdXJnPC9zZWNvbmRhcnktdGl0bGU+PC90aXRsZXM+PHBlcmlvZGljYWw+PGZ1bGwtdGl0
-bGU+QW5uIFRob3JhYyBDYXJkaW92YXNjIFN1cmc8L2Z1bGwtdGl0bGU+PC9wZXJpb2RpY2FsPjxw
-YWdlcz4zMjItODwvcGFnZXM+PHZvbHVtZT4yMTwvdm9sdW1lPjxudW1iZXI+NDwvbnVtYmVyPjxl
-ZGl0aW9uPjIwMTUwNzAyPC9lZGl0aW9uPjxrZXl3b3Jkcz48a2V5d29yZD4qQ29yb25hcnkgQXJ0
-ZXJ5IEJ5cGFzczwva2V5d29yZD48a2V5d29yZD5Db3JvbmFyeSBBcnRlcnkgQnlwYXNzLCBPZmYt
-UHVtcDwva2V5d29yZD48a2V5d29yZD5FdmlkZW5jZS1CYXNlZCBNZWRpY2luZTwva2V5d29yZD48
-a2V5d29yZD5IZWFydCBEaXNlYXNlcy8qc3VyZ2VyeTwva2V5d29yZD48a2V5d29yZD5IZWFydCBT
-ZXB0YWwgRGVmZWN0cywgQXRyaWFsL3N1cmdlcnk8L2tleXdvcmQ+PGtleXdvcmQ+SHVtYW5zPC9r
-ZXl3b3JkPjxrZXl3b3JkPk15b2NhcmRpYWwgSXNjaGVtaWEvc3VyZ2VyeTwva2V5d29yZD48a2V5
-d29yZD4qUm9ib3RpYyBTdXJnaWNhbCBQcm9jZWR1cmVzL2luc3RydW1lbnRhdGlvbi9tZXRob2Rz
-PC9rZXl3b3JkPjxrZXl3b3JkPlRyZWF0bWVudCBPdXRjb21lPC9rZXl3b3JkPjwva2V5d29yZHM+
-PGRhdGVzPjx5ZWFyPjIwMTU8L3llYXI+PC9kYXRlcz48aXNibj4xMzQxLTEwOTggKFByaW50KSYj
-eEQ7MTM0MS0xMDk4PC9pc2JuPjxhY2Nlc3Npb24tbnVtPjI2MTM0MDczPC9hY2Nlc3Npb24tbnVt
-Pjx1cmxzPjwvdXJscz48Y3VzdG9tMj5QTUM0OTA0ODY2PC9jdXN0b20yPjxlbGVjdHJvbmljLXJl
-c291cmNlLW51bT4xMC41NzYxL2F0Y3MucmEuMTUtMDAxNDU8L2VsZWN0cm9uaWMtcmVzb3VyY2Ut
-bnVtPjxyZW1vdGUtZGF0YWJhc2UtcHJvdmlkZXI+TkxNPC9yZW1vdGUtZGF0YWJhc2UtcHJvdmlk
-ZXI+PGxhbmd1YWdlPmVuZzwvbGFuZ3VhZ2U+PC9yZWNvcmQ+PC9DaXRlPjxDaXRlPjxBdXRob3I+
-VmVybmljazwvQXV0aG9yPjxZZWFyPjIwMTM8L1llYXI+PFJlY051bT43PC9SZWNOdW0+PHJlY29y
-ZD48cmVjLW51bWJlcj43PC9yZWMtbnVtYmVyPjxmb3JlaWduLWtleXM+PGtleSBhcHA9IkVOIiBk
-Yi1pZD0id3dyZnp6dGFsMDl3ZHNlZXZwOTVmOXhxd2VkejI1cnR0dHM5IiB0aW1lc3RhbXA9IjE3
-Nzk4Mjc3NTQiPjc8L2tleT48L2ZvcmVpZ24ta2V5cz48cmVmLXR5cGUgbmFtZT0iSm91cm5hbCBB
-cnRpY2xlIj4xNzwvcmVmLXR5cGU+PGNvbnRyaWJ1dG9ycz48YXV0aG9ycz48YXV0aG9yPlZlcm5p
-Y2ssIFcuPC9hdXRob3I+PGF1dGhvcj5BdGx1cmksIFAuPC9hdXRob3I+PC9hdXRob3JzPjwvY29u
-dHJpYnV0b3JzPjxhdXRoLWFkZHJlc3M+RGVwYXJ0bWVudCBvZiBBbmVzdGhlc2lvbG9neSBhbmQg
-Q3JpdGljYWwgQ2FyZSwgVGhlIFBlcmVsbWFuIFNjaG9vbCBvZiBNZWRpY2luZSBhdCB0aGUgVW5p
-dmVyc2l0eSBIb3NwdGlhbCBvZiBQZW5uc3lsdmFuaWEsIDM0MDAgU3BydWNlIFN0cmVldCwgUGhp
-bGFkZWxwaGlhLCBQQSAxOTEwNCwgVVNBLiB3aWxsaWFtLnZlcm5pY2tAdXBocy51cGVubi5lZHU8
-L2F1dGgtYWRkcmVzcz48dGl0bGVzPjx0aXRsZT5Sb2JvdGljIGFuZCBtaW5pbWFsbHkgaW52YXNp
-dmUgY2FyZGlhYyBzdXJnZXJ5PC90aXRsZT48c2Vjb25kYXJ5LXRpdGxlPkFuZXN0aGVzaW9sIENs
-aW48L3NlY29uZGFyeS10aXRsZT48L3RpdGxlcz48cGVyaW9kaWNhbD48ZnVsbC10aXRsZT5BbmVz
-dGhlc2lvbCBDbGluPC9mdWxsLXRpdGxlPjwvcGVyaW9kaWNhbD48cGFnZXM+Mjk5LTMyMDwvcGFn
-ZXM+PHZvbHVtZT4zMTwvdm9sdW1lPjxudW1iZXI+MjwvbnVtYmVyPjxlZGl0aW9uPjIwMTMwMzEz
-PC9lZGl0aW9uPjxrZXl3b3Jkcz48a2V5d29yZD5BaXJ3YXkgTWFuYWdlbWVudDwva2V5d29yZD48
-a2V5d29yZD5BbmVzdGhlc2lhL21ldGhvZHM8L2tleXdvcmQ+PGtleXdvcmQ+Q2FyZGlvcHVsbW9u
-YXJ5IEJ5cGFzczwva2V5d29yZD48a2V5d29yZD5FY2hvY2FyZGlvZ3JhcGh5LCBUcmFuc2Vzb3Bo
-YWdlYWw8L2tleXdvcmQ+PGtleXdvcmQ+SHVtYW5zPC9rZXl3b3JkPjxrZXl3b3JkPk1pbmltYWxs
-eSBJbnZhc2l2ZSBTdXJnaWNhbCBQcm9jZWR1cmVzLyptZXRob2RzPC9rZXl3b3JkPjxrZXl3b3Jk
-Pk1pdHJhbCBWYWx2ZS8qc3VyZ2VyeTwva2V5d29yZD48a2V5d29yZD5PbmUtTHVuZyBWZW50aWxh
-dGlvbjwva2V5d29yZD48a2V5d29yZD5Qb3N0b3BlcmF0aXZlIFBhaW4vZHJ1ZyB0aGVyYXB5PC9r
-ZXl3b3JkPjxrZXl3b3JkPlJvYm90aWNzLyptZXRob2RzPC9rZXl3b3JkPjwva2V5d29yZHM+PGRh
-dGVzPjx5ZWFyPjIwMTM8L3llYXI+PHB1Yi1kYXRlcz48ZGF0ZT5KdW48L2RhdGU+PC9wdWItZGF0
-ZXM+PC9kYXRlcz48aXNibj4xOTMyLTIyNzUgKFByaW50KSYjeEQ7MTkzMi0yMjc1PC9pc2JuPjxh
-Y2Nlc3Npb24tbnVtPjIzNzExNjQ2PC9hY2Nlc3Npb24tbnVtPjx1cmxzPjwvdXJscz48ZWxlY3Ry
-b25pYy1yZXNvdXJjZS1udW0+MTAuMTAxNi9qLmFuY2xpbi4yMDEyLjEyLjAwMjwvZWxlY3Ryb25p
-Yy1yZXNvdXJjZS1udW0+PHJlbW90ZS1kYXRhYmFzZS1wcm92aWRlcj5OTE08L3JlbW90ZS1kYXRh
-YmFzZS1wcm92aWRlcj48bGFuZ3VhZ2U+ZW5nPC9sYW5ndWFnZT48L3JlY29yZD48L0NpdGU+PC9F
-bmROb3RlPgB=
-</w:fldData>
-        </w:fldChar>
-      </w:r>
-      <w:r>
-        <w:rPr>
-          <w:rFonts w:ascii="Times New Roman" w:hAnsi="Times New Roman"/>
-          <w:bCs/>
-          <w:sz w:val="24"/>
-          <w:szCs w:val="24"/>
-          <w:lang w:val="tr-TR"/>
-        </w:rPr>
-        <w:instrText xml:space="preserve"> ADDIN EN.CITE.DATA </w:instrText>
-      </w:r>
-      <w:r>
-        <w:rPr>
-          <w:rFonts w:ascii="Times New Roman" w:hAnsi="Times New Roman"/>
-          <w:bCs/>
-          <w:sz w:val="24"/>
-          <w:szCs w:val="24"/>
-          <w:lang w:val="tr-TR"/>
-        </w:rPr>
-      </w:r>
-      <w:r>
-        <w:rPr>
-          <w:rFonts w:ascii="Times New Roman" w:hAnsi="Times New Roman"/>
-          <w:bCs/>
-          <w:sz w:val="24"/>
-          <w:szCs w:val="24"/>
-          <w:lang w:val="tr-TR"/>
-        </w:rPr>
-        <w:fldChar w:fldCharType="end"/>
-      </w:r>
-      <w:r>
-        <w:rPr>
-          <w:rFonts w:ascii="Times New Roman" w:hAnsi="Times New Roman"/>
-          <w:bCs/>
-          <w:sz w:val="24"/>
-          <w:szCs w:val="24"/>
-          <w:lang w:val="tr-TR"/>
-        </w:rPr>
-      </w:r>
-      <w:r>
-        <w:rPr>
-          <w:rFonts w:ascii="Times New Roman" w:hAnsi="Times New Roman"/>
-          <w:bCs/>
-          <w:sz w:val="24"/>
-          <w:szCs w:val="24"/>
-          <w:lang w:val="tr-TR"/>
-        </w:rPr>
-        <w:fldChar w:fldCharType="separate"/>
+      </w:r>
+      <w:r>
+        <w:rPr>
+          <w:rFonts w:ascii="Times New Roman" w:hAnsi="Times New Roman"/>
+          <w:bCs/>
+          <w:sz w:val="24"/>
+          <w:szCs w:val="24"/>
+          <w:lang w:val="tr-TR"/>
+        </w:rPr>
       </w:r>
       <w:r>
         <w:rPr>
@@ -1153,52 +975,12 @@
           <w:szCs w:val="24"/>
           <w:lang w:val="tr-TR"/>
         </w:rPr>
-        <w:fldChar w:fldCharType="end"/>
-      </w:r>
-      <w:r>
-        <w:rPr>
-          <w:rFonts w:ascii="Times New Roman" w:hAnsi="Times New Roman"/>
-          <w:bCs/>
-          <w:sz w:val="24"/>
-          <w:szCs w:val="24"/>
-          <w:lang w:val="tr-TR"/>
-        </w:rPr>
         <w:t xml:space="preserve">. Driven by patients' demands for superior cosmesis and faster functional recovery, MICS is robustly supported by clinical evidence demonstrating significant reductions in postoperative bleeding, blood product transfusions, and overall hospital length of stay without compromising long-term surgical durability </w:t>
       </w:r>
       <w:r>
         <w:rPr>
           <w:rFonts w:ascii="Times New Roman" w:hAnsi="Times New Roman"/>
           <w:bCs/>
-          <w:sz w:val="24"/>
-          <w:szCs w:val="24"/>
-          <w:lang w:val="tr-TR"/>
-        </w:rPr>
-        <w:fldChar w:fldCharType="begin"/>
-      </w:r>
-      <w:r>
-        <w:rPr>
-          <w:rFonts w:ascii="Times New Roman" w:hAnsi="Times New Roman"/>
-          <w:bCs/>
-          <w:sz w:val="24"/>
-          <w:szCs w:val="24"/>
-          <w:lang w:val="tr-TR"/>
-        </w:rPr>
-        <w:instrText xml:space="preserve"> ADDIN EN.CITE &lt;EndNote&gt;&lt;Cite&gt;&lt;Author&gt;Vernick&lt;/Author&gt;&lt;Year&gt;2012&lt;/Year&gt;&lt;RecNum&gt;8&lt;/RecNum&gt;&lt;DisplayText&gt;[3]&lt;/DisplayText&gt;&lt;record&gt;&lt;rec-number&gt;8&lt;/rec-number&gt;&lt;foreign-keys&gt;&lt;key app="EN" db-id="wwrfzztal09wdseevp95f9xqwedz25rttts9" timestamp="1779827784"&gt;8&lt;/key&gt;&lt;/foreign-keys&gt;&lt;ref-type name="Journal Article"&gt;17&lt;/ref-type&gt;&lt;contributors&gt;&lt;authors&gt;&lt;author&gt;Vernick, W. J.&lt;/author&gt;&lt;author&gt;Woo, J. Y.&lt;/author&gt;&lt;/authors&gt;&lt;/contributors&gt;&lt;auth-address&gt;Department of Anesthesia and Critical Care, Hospital of the University of Pennsylvania, Philadelphia, PA 19104, USA. vernickw@uphs.upenn.edu&lt;/auth-address&gt;&lt;titles&gt;&lt;title&gt;Anesthetic considerations during minimally invasive mitral valve surgery&lt;/title&gt;&lt;secondary-title&gt;Semin Cardiothorac Vasc Anesth&lt;/secondary-title&gt;&lt;/titles&gt;&lt;periodical&gt;&lt;full-title&gt;Semin Cardiothorac Vasc Anesth&lt;/full-title&gt;&lt;/periodical&gt;&lt;pages&gt;11-24&lt;/pages&gt;&lt;volume&gt;16&lt;/volume&gt;&lt;number&gt;1&lt;/number&gt;&lt;edition&gt;20120222&lt;/edition&gt;&lt;keywords&gt;&lt;keyword&gt;Airway Management&lt;/keyword&gt;&lt;keyword&gt;*Anesthesia&lt;/keyword&gt;&lt;keyword&gt;Animals&lt;/keyword&gt;&lt;keyword&gt;Cardiac Surgical Procedures/*methods&lt;/keyword&gt;&lt;keyword&gt;Cardiopulmonary Bypass/methods&lt;/keyword&gt;&lt;keyword&gt;Catheterization&lt;/keyword&gt;&lt;keyword&gt;Critical Care&lt;/keyword&gt;&lt;keyword&gt;Echocardiography, Transesophageal&lt;/keyword&gt;&lt;keyword&gt;Heart Valve Diseases/*surgery&lt;/keyword&gt;&lt;keyword&gt;Heart Valve Prosthesis Implantation/*methods&lt;/keyword&gt;&lt;keyword&gt;Humans&lt;/keyword&gt;&lt;keyword&gt;Minimally Invasive Surgical Procedures/*methods&lt;/keyword&gt;&lt;keyword&gt;Mitral Valve/*surgery&lt;/keyword&gt;&lt;keyword&gt;Postoperative Pain/drug therapy&lt;/keyword&gt;&lt;keyword&gt;Patient Transfer&lt;/keyword&gt;&lt;keyword&gt;Preoperative Care&lt;/keyword&gt;&lt;/keywords&gt;&lt;dates&gt;&lt;year&gt;2012&lt;/year&gt;&lt;pub-dates&gt;&lt;date&gt;Mar&lt;/date&gt;&lt;/pub-dates&gt;&lt;/dates&gt;&lt;isbn&gt;1089-2532&lt;/isbn&gt;&lt;accession-num&gt;22361820&lt;/accession-num&gt;&lt;urls&gt;&lt;/urls&gt;&lt;electronic-resource-num&gt;10.1177/1089253211434591&lt;/electronic-resource-num&gt;&lt;remote-database-provider&gt;NLM&lt;/remote-database-provider&gt;&lt;language&gt;eng&lt;/language&gt;&lt;/record&gt;&lt;/Cite&gt;&lt;/EndNote&gt;</w:instrText>
-      </w:r>
-      <w:r>
-        <w:rPr>
-          <w:rFonts w:ascii="Times New Roman" w:hAnsi="Times New Roman"/>
-          <w:bCs/>
-          <w:sz w:val="24"/>
-          <w:szCs w:val="24"/>
-          <w:lang w:val="tr-TR"/>
-        </w:rPr>
-        <w:fldChar w:fldCharType="separate"/>
-      </w:r>
-      <w:r>
-        <w:rPr>
-          <w:rFonts w:ascii="Times New Roman" w:hAnsi="Times New Roman"/>
-          <w:bCs/>
           <w:noProof/>
           <w:sz w:val="24"/>
           <w:szCs w:val="24"/>
@@ -1214,16 +996,6 @@
           <w:szCs w:val="24"/>
           <w:lang w:val="tr-TR"/>
         </w:rPr>
-        <w:fldChar w:fldCharType="end"/>
-      </w:r>
-      <w:r>
-        <w:rPr>
-          <w:rFonts w:ascii="Times New Roman" w:hAnsi="Times New Roman"/>
-          <w:bCs/>
-          <w:sz w:val="24"/>
-          <w:szCs w:val="24"/>
-          <w:lang w:val="tr-TR"/>
-        </w:rPr>
         <w:t>.</w:t>
       </w:r>
       <w:r>
@@ -1256,50 +1028,6 @@
           <w:highlight w:val="green"/>
           <w:lang w:val="tr-TR"/>
         </w:rPr>
-        <w:fldChar w:fldCharType="begin">
-          <w:fldData xml:space="preserve">PEVuZE5vdGU+PENpdGU+PEF1dGhvcj5LZXPDpHZ1b3JpPC9BdXRob3I+PFllYXI+MjAxOTwvWWVh
-cj48UmVjTnVtPjQ8L1JlY051bT48RGlzcGxheVRleHQ+WzRdPC9EaXNwbGF5VGV4dD48cmVjb3Jk
-PjxyZWMtbnVtYmVyPjQ8L3JlYy1udW1iZXI+PGZvcmVpZ24ta2V5cz48a2V5IGFwcD0iRU4iIGRi
-LWlkPSJ3d3Jmenp0YWwwOXdkc2VldnA5NWY5eHF3ZWR6MjVydHR0czkiIHRpbWVzdGFtcD0iMTc3
-OTgyNzY0NCI+NDwva2V5PjwvZm9yZWlnbi1rZXlzPjxyZWYtdHlwZSBuYW1lPSJKb3VybmFsIEFy
-dGljbGUiPjE3PC9yZWYtdHlwZT48Y29udHJpYnV0b3JzPjxhdXRob3JzPjxhdXRob3I+S2Vzw6R2
-dW9yaSwgUi48L2F1dGhvcj48YXV0aG9yPlZlbnRvLCBBLjwvYXV0aG9yPjxhdXRob3I+THVuZGJv
-bSwgTi48L2F1dGhvcj48YXV0aG9yPlNjaHJhbWtvLCBBLjwvYXV0aG9yPjxhdXRob3I+Sm9raW5l
-biwgSi4gSi48L2F1dGhvcj48YXV0aG9yPlJhaXZpbywgUC48L2F1dGhvcj48L2F1dGhvcnM+PC9j
-b250cmlidXRvcnM+PGF1dGgtYWRkcmVzcz5EZXBhcnRtZW50IG9mIENhcmRpYWMgU3VyZ2VyeSwg
-SGVhcnQgYW5kIEx1bmcgQ2VudGVyLCBIZWxzaW5raSBVbml2ZXJzaXR5IEhvc3BpdGFsLCBIZWxz
-aW5raSwgRmlubGFuZC4mI3hEO0RlcGFydG1lbnQgb2YgUmFkaW9sb2d5LCBIVVMgTWVkaWNhbCBJ
-bWFnaW5nIENlbnRlciwgSGVsc2lua2kgVW5pdmVyc2l0eSBIb3NwaXRhbCwgSGVsc2lua2ksIEZp
-bmxhbmQuJiN4RDtEZXBhcnRtZW50IG9mIEFuYWVzdGhlc2lvbG9neSwgSW50ZW5zaXZlIENhcmUg
-YW5kIFBhaW4gTWVkaWNpbmUsIEhlbHNpbmtpIFVuaXZlcnNpdHkgSG9zcGl0YWwsIEhlbHNpbmtp
-LCBGaW5sYW5kLiYjeEQ7RGVwYXJ0bWVudCBvZiBTdXJnZXJ5LCBQw6RpasOkdC1Iw6RtZSBDZW50
-cmFsIEhvc3BpdGFsLCBMYWh0aSwgRmlubGFuZC48L2F1dGgtYWRkcmVzcz48dGl0bGVzPjx0aXRs
-ZT5NaW5pbWFsIHZvbHVtZSB2ZW50aWxhdGlvbiBkdXJpbmcgcm9ib3RpY2FsbHkgYXNzaXN0ZWQg
-bWl0cmFsIHZhbHZlIHN1cmdlcnk8L3RpdGxlPjxzZWNvbmRhcnktdGl0bGU+UGVyZnVzaW9uPC9z
-ZWNvbmRhcnktdGl0bGU+PC90aXRsZXM+PHBlcmlvZGljYWw+PGZ1bGwtdGl0bGU+UGVyZnVzaW9u
-PC9mdWxsLXRpdGxlPjwvcGVyaW9kaWNhbD48cGFnZXM+NzA1LTcxMzwvcGFnZXM+PHZvbHVtZT4z
-NDwvdm9sdW1lPjxudW1iZXI+ODwvbnVtYmVyPjxlZGl0aW9uPjIwMTkwNTE1PC9lZGl0aW9uPjxr
-ZXl3b3Jkcz48a2V5d29yZD5BZHVsdDwva2V5d29yZD48a2V5d29yZD5DYXJkaW9wdWxtb25hcnkg
-QnlwYXNzL2FkdmVyc2UgZWZmZWN0cy8qbWV0aG9kczwva2V5d29yZD48a2V5d29yZD5GZW1hbGU8
-L2tleXdvcmQ+PGtleXdvcmQ+SGVhcnQgVmFsdmUgRGlzZWFzZXMvYmxvb2Qvc3VyZ2VyeTwva2V5
-d29yZD48a2V5d29yZD5IdW1hbnM8L2tleXdvcmQ+PGtleXdvcmQ+TGFjdGljIEFjaWQvYmxvb2Q8
-L2tleXdvcmQ+PGtleXdvcmQ+TWFsZTwva2V5d29yZD48a2V5d29yZD5NaWRkbGUgQWdlZDwva2V5
-d29yZD48a2V5d29yZD5NaXRyYWwgVmFsdmUvKnN1cmdlcnk8L2tleXdvcmQ+PGtleXdvcmQ+UHVs
-bW9uYXJ5IEVkZW1hL2Jsb29kL2V0aW9sb2d5PC9rZXl3b3JkPjxrZXl3b3JkPlB1bG1vbmFyeSBW
-ZW50aWxhdGlvbjwva2V5d29yZD48a2V5d29yZD5Sb2JvdGljIFN1cmdpY2FsIFByb2NlZHVyZXMv
-YWR2ZXJzZSBlZmZlY3RzLyptZXRob2RzPC9rZXl3b3JkPjxrZXl3b3JkPmFuZXN0aGVzaWE8L2tl
-eXdvcmQ+PGtleXdvcmQ+bWluaW1hbGx5IGludmFzaXZlIHN1cmdlcnk8L2tleXdvcmQ+PGtleXdv
-cmQ+bWl0cmFsIHZhbHZlPC9rZXl3b3JkPjxrZXl3b3JkPnBlcmlvcGVyYXRpdmUgY2FyZTwva2V5
-d29yZD48a2V5d29yZD5wdWxtb25hcnkgZnVuY3Rpb248L2tleXdvcmQ+PGtleXdvcmQ+cm9ib3Rp
-Y3M8L2tleXdvcmQ+PGtleXdvcmQ+dmVudGlsYXRpb248L2tleXdvcmQ+PC9rZXl3b3Jkcz48ZGF0
-ZXM+PHllYXI+MjAxOTwveWVhcj48cHViLWRhdGVzPjxkYXRlPk5vdjwvZGF0ZT48L3B1Yi1kYXRl
-cz48L2RhdGVzPjxpc2JuPjAyNjctNjU5MTwvaXNibj48YWNjZXNzaW9uLW51bT4zMTA5MDQ4NTwv
-YWNjZXNzaW9uLW51bT48dXJscz48L3VybHM+PGVsZWN0cm9uaWMtcmVzb3VyY2UtbnVtPjEwLjEx
-NzcvMDI2NzY1OTExOTg0NzkxNzwvZWxlY3Ryb25pYy1yZXNvdXJjZS1udW0+PHJlbW90ZS1kYXRh
-YmFzZS1wcm92aWRlcj5OTE08L3JlbW90ZS1kYXRhYmFzZS1wcm92aWRlcj48bGFuZ3VhZ2U+ZW5n
-PC9sYW5ndWFnZT48L3JlY29yZD48L0NpdGU+PC9FbmROb3RlPgB=
-</w:fldData>
-        </w:fldChar>
       </w:r>
       <w:r>
         <w:rPr>
@@ -1310,61 +1038,18 @@
           <w:highlight w:val="green"/>
           <w:lang w:val="tr-TR"/>
         </w:rPr>
-        <w:instrText xml:space="preserve"> ADDIN EN.CITE </w:instrText>
-      </w:r>
-      <w:r>
-        <w:rPr>
-          <w:rFonts w:ascii="Times New Roman" w:hAnsi="Times New Roman"/>
-          <w:bCs/>
+      </w:r>
+      <w:r>
+        <w:rPr>
+          <w:rFonts w:ascii="Times New Roman" w:hAnsi="Times New Roman"/>
+          <w:bCs/>
+          <w:noProof/>
           <w:sz w:val="24"/>
           <w:szCs w:val="24"/>
           <w:highlight w:val="green"/>
           <w:lang w:val="tr-TR"/>
         </w:rPr>
-        <w:fldChar w:fldCharType="begin">
-          <w:fldData xml:space="preserve">PEVuZE5vdGU+PENpdGU+PEF1dGhvcj5LZXPDpHZ1b3JpPC9BdXRob3I+PFllYXI+MjAxOTwvWWVh
-cj48UmVjTnVtPjQ8L1JlY051bT48RGlzcGxheVRleHQ+WzRdPC9EaXNwbGF5VGV4dD48cmVjb3Jk
-PjxyZWMtbnVtYmVyPjQ8L3JlYy1udW1iZXI+PGZvcmVpZ24ta2V5cz48a2V5IGFwcD0iRU4iIGRi
-LWlkPSJ3d3Jmenp0YWwwOXdkc2VldnA5NWY5eHF3ZWR6MjVydHR0czkiIHRpbWVzdGFtcD0iMTc3
-OTgyNzY0NCI+NDwva2V5PjwvZm9yZWlnbi1rZXlzPjxyZWYtdHlwZSBuYW1lPSJKb3VybmFsIEFy
-dGljbGUiPjE3PC9yZWYtdHlwZT48Y29udHJpYnV0b3JzPjxhdXRob3JzPjxhdXRob3I+S2Vzw6R2
-dW9yaSwgUi48L2F1dGhvcj48YXV0aG9yPlZlbnRvLCBBLjwvYXV0aG9yPjxhdXRob3I+THVuZGJv
-bSwgTi48L2F1dGhvcj48YXV0aG9yPlNjaHJhbWtvLCBBLjwvYXV0aG9yPjxhdXRob3I+Sm9raW5l
-biwgSi4gSi48L2F1dGhvcj48YXV0aG9yPlJhaXZpbywgUC48L2F1dGhvcj48L2F1dGhvcnM+PC9j
-b250cmlidXRvcnM+PGF1dGgtYWRkcmVzcz5EZXBhcnRtZW50IG9mIENhcmRpYWMgU3VyZ2VyeSwg
-SGVhcnQgYW5kIEx1bmcgQ2VudGVyLCBIZWxzaW5raSBVbml2ZXJzaXR5IEhvc3BpdGFsLCBIZWxz
-aW5raSwgRmlubGFuZC4mI3hEO0RlcGFydG1lbnQgb2YgUmFkaW9sb2d5LCBIVVMgTWVkaWNhbCBJ
-bWFnaW5nIENlbnRlciwgSGVsc2lua2kgVW5pdmVyc2l0eSBIb3NwaXRhbCwgSGVsc2lua2ksIEZp
-bmxhbmQuJiN4RDtEZXBhcnRtZW50IG9mIEFuYWVzdGhlc2lvbG9neSwgSW50ZW5zaXZlIENhcmUg
-YW5kIFBhaW4gTWVkaWNpbmUsIEhlbHNpbmtpIFVuaXZlcnNpdHkgSG9zcGl0YWwsIEhlbHNpbmtp
-LCBGaW5sYW5kLiYjeEQ7RGVwYXJ0bWVudCBvZiBTdXJnZXJ5LCBQw6RpasOkdC1Iw6RtZSBDZW50
-cmFsIEhvc3BpdGFsLCBMYWh0aSwgRmlubGFuZC48L2F1dGgtYWRkcmVzcz48dGl0bGVzPjx0aXRs
-ZT5NaW5pbWFsIHZvbHVtZSB2ZW50aWxhdGlvbiBkdXJpbmcgcm9ib3RpY2FsbHkgYXNzaXN0ZWQg
-bWl0cmFsIHZhbHZlIHN1cmdlcnk8L3RpdGxlPjxzZWNvbmRhcnktdGl0bGU+UGVyZnVzaW9uPC9z
-ZWNvbmRhcnktdGl0bGU+PC90aXRsZXM+PHBlcmlvZGljYWw+PGZ1bGwtdGl0bGU+UGVyZnVzaW9u
-PC9mdWxsLXRpdGxlPjwvcGVyaW9kaWNhbD48cGFnZXM+NzA1LTcxMzwvcGFnZXM+PHZvbHVtZT4z
-NDwvdm9sdW1lPjxudW1iZXI+ODwvbnVtYmVyPjxlZGl0aW9uPjIwMTkwNTE1PC9lZGl0aW9uPjxr
-ZXl3b3Jkcz48a2V5d29yZD5BZHVsdDwva2V5d29yZD48a2V5d29yZD5DYXJkaW9wdWxtb25hcnkg
-QnlwYXNzL2FkdmVyc2UgZWZmZWN0cy8qbWV0aG9kczwva2V5d29yZD48a2V5d29yZD5GZW1hbGU8
-L2tleXdvcmQ+PGtleXdvcmQ+SGVhcnQgVmFsdmUgRGlzZWFzZXMvYmxvb2Qvc3VyZ2VyeTwva2V5
-d29yZD48a2V5d29yZD5IdW1hbnM8L2tleXdvcmQ+PGtleXdvcmQ+TGFjdGljIEFjaWQvYmxvb2Q8
-L2tleXdvcmQ+PGtleXdvcmQ+TWFsZTwva2V5d29yZD48a2V5d29yZD5NaWRkbGUgQWdlZDwva2V5
-d29yZD48a2V5d29yZD5NaXRyYWwgVmFsdmUvKnN1cmdlcnk8L2tleXdvcmQ+PGtleXdvcmQ+UHVs
-bW9uYXJ5IEVkZW1hL2Jsb29kL2V0aW9sb2d5PC9rZXl3b3JkPjxrZXl3b3JkPlB1bG1vbmFyeSBW
-ZW50aWxhdGlvbjwva2V5d29yZD48a2V5d29yZD5Sb2JvdGljIFN1cmdpY2FsIFByb2NlZHVyZXMv
-YWR2ZXJzZSBlZmZlY3RzLyptZXRob2RzPC9rZXl3b3JkPjxrZXl3b3JkPmFuZXN0aGVzaWE8L2tl
-eXdvcmQ+PGtleXdvcmQ+bWluaW1hbGx5IGludmFzaXZlIHN1cmdlcnk8L2tleXdvcmQ+PGtleXdv
-cmQ+bWl0cmFsIHZhbHZlPC9rZXl3b3JkPjxrZXl3b3JkPnBlcmlvcGVyYXRpdmUgY2FyZTwva2V5
-d29yZD48a2V5d29yZD5wdWxtb25hcnkgZnVuY3Rpb248L2tleXdvcmQ+PGtleXdvcmQ+cm9ib3Rp
-Y3M8L2tleXdvcmQ+PGtleXdvcmQ+dmVudGlsYXRpb248L2tleXdvcmQ+PC9rZXl3b3Jkcz48ZGF0
-ZXM+PHllYXI+MjAxOTwveWVhcj48cHViLWRhdGVzPjxkYXRlPk5vdjwvZGF0ZT48L3B1Yi1kYXRl
-cz48L2RhdGVzPjxpc2JuPjAyNjctNjU5MTwvaXNibj48YWNjZXNzaW9uLW51bT4zMTA5MDQ4NTwv
-YWNjZXNzaW9uLW51bT48dXJscz48L3VybHM+PGVsZWN0cm9uaWMtcmVzb3VyY2UtbnVtPjEwLjEx
-NzcvMDI2NzY1OTExOTg0NzkxNzwvZWxlY3Ryb25pYy1yZXNvdXJjZS1udW0+PHJlbW90ZS1kYXRh
-YmFzZS1wcm92aWRlcj5OTE08L3JlbW90ZS1kYXRhYmFzZS1wcm92aWRlcj48bGFuZ3VhZ2U+ZW5n
-PC9sYW5ndWFnZT48L3JlY29yZD48L0NpdGU+PC9FbmROb3RlPgB=
-</w:fldData>
-        </w:fldChar>
+        <w:t>[4]</w:t>
       </w:r>
       <w:r>
         <w:rPr>
@@ -1375,7 +1060,17 @@
           <w:highlight w:val="green"/>
           <w:lang w:val="tr-TR"/>
         </w:rPr>
-        <w:instrText xml:space="preserve"> ADDIN EN.CITE.DATA </w:instrText>
+        <w:t xml:space="preserve"> and the unique circulatory alterations</w:t>
+      </w:r>
+      <w:r>
+        <w:rPr>
+          <w:rFonts w:ascii="Times New Roman" w:hAnsi="Times New Roman"/>
+          <w:bCs/>
+          <w:sz w:val="24"/>
+          <w:szCs w:val="24"/>
+          <w:lang w:val="tr-TR"/>
+        </w:rPr>
+        <w:t xml:space="preserve"> </w:t>
       </w:r>
       <w:r>
         <w:rPr>
@@ -1386,38 +1081,71 @@
           <w:highlight w:val="green"/>
           <w:lang w:val="tr-TR"/>
         </w:rPr>
-      </w:r>
-      <w:r>
-        <w:rPr>
-          <w:rFonts w:ascii="Times New Roman" w:hAnsi="Times New Roman"/>
-          <w:bCs/>
-          <w:sz w:val="24"/>
-          <w:szCs w:val="24"/>
-          <w:highlight w:val="green"/>
-          <w:lang w:val="tr-TR"/>
-        </w:rPr>
-        <w:fldChar w:fldCharType="end"/>
-      </w:r>
-      <w:r>
-        <w:rPr>
-          <w:rFonts w:ascii="Times New Roman" w:hAnsi="Times New Roman"/>
-          <w:bCs/>
-          <w:sz w:val="24"/>
-          <w:szCs w:val="24"/>
-          <w:highlight w:val="green"/>
-          <w:lang w:val="tr-TR"/>
-        </w:rPr>
-      </w:r>
-      <w:r>
-        <w:rPr>
-          <w:rFonts w:ascii="Times New Roman" w:hAnsi="Times New Roman"/>
-          <w:bCs/>
-          <w:sz w:val="24"/>
-          <w:szCs w:val="24"/>
-          <w:highlight w:val="green"/>
-          <w:lang w:val="tr-TR"/>
-        </w:rPr>
-        <w:fldChar w:fldCharType="separate"/>
+        <w:t>imposed by peripheral femoral arterial and venous cardiopulmonary bypass (CPB) cannulation combine to narrow the cardiovascular safety margin. These dynamic procedural phases can trigger acute shifts in pulmonary vascular resistance, right ventricular volume loading, and profound mean arterial pressure (MAP) lability, demanding highly precise and immediate titration of anesthetic agents.</w:t>
+      </w:r>
+    </w:p>
+    <w:p>
+      <w:pPr>
+        <w:spacing w:line="360" w:lineRule="auto"/>
+        <w:jc w:val="both"/>
+        <w:rPr>
+          <w:rFonts w:ascii="Times New Roman" w:hAnsi="Times New Roman"/>
+          <w:bCs/>
+          <w:sz w:val="24"/>
+          <w:szCs w:val="24"/>
+          <w:lang w:val="tr-TR"/>
+        </w:rPr>
+      </w:pPr>
+      <w:r>
+        <w:rPr>
+          <w:rFonts w:ascii="Times New Roman" w:hAnsi="Times New Roman"/>
+          <w:bCs/>
+          <w:sz w:val="24"/>
+          <w:szCs w:val="24"/>
+          <w:lang w:val="tr-TR"/>
+        </w:rPr>
+        <w:t>A pivotal determinant of clinical success within modern MICS pathways is the implementation of structured "ultra-fast-track" anesthesia protocols aimed at early, safe extubation and expedited transition through the intensive care unit (ICU). Achieving these endpoints necessitates an anesthetic delivery strategy capable of maintaining tight intraoperative hypnotic and analgesic control during intense surgical stimulation, while ensuring a rapid, predictable dissipation of drug effects to avoid prolonged residual sedation. Traditionally, intraoperative total intravenous anesthesia (TIVA) has been managed via Manual-Controlled Infusion (MCI), where drug delivery is adjusted at the clinician’s discretion through empirical step-changes in infusion rates. Because MCI lacks an underlying pharmacokinetic profile, it is highly susceptible to drug accumulation and relative overdosing, which frequently manifests as intraoperative hemodynamic instability, prolonged mechanical ventilation, or delayed emergence.</w:t>
+      </w:r>
+    </w:p>
+    <w:p>
+      <w:pPr>
+        <w:spacing w:line="360" w:lineRule="auto"/>
+        <w:jc w:val="both"/>
+        <w:rPr>
+          <w:rFonts w:ascii="Times New Roman" w:hAnsi="Times New Roman"/>
+          <w:bCs/>
+          <w:sz w:val="24"/>
+          <w:szCs w:val="24"/>
+          <w:lang w:val="tr-TR"/>
+        </w:rPr>
+      </w:pPr>
+      <w:r>
+        <w:rPr>
+          <w:rFonts w:ascii="Times New Roman" w:hAnsi="Times New Roman"/>
+          <w:bCs/>
+          <w:sz w:val="24"/>
+          <w:szCs w:val="24"/>
+          <w:lang w:val="tr-TR"/>
+        </w:rPr>
+        <w:t xml:space="preserve">To circumvent these limitations, pharmacokinetic model-driven Target-Controlled Infusion (TCI) systems automate drug delivery by continually calibrating plasma or effect-site concentrations based on patient-specific covariates. While traditional cardiac TCI protocols have historically relied on first-generation models—such as the Marsh or Schnider models for propofol and the Minto model for remifentanil—these algorithms possess inherent limitations when applied to broad patient populations, particularly regarding body mass index extremes and elderly cohorts </w:t>
+      </w:r>
+      <w:r>
+        <w:rPr>
+          <w:rFonts w:ascii="Times New Roman" w:hAnsi="Times New Roman"/>
+          <w:bCs/>
+          <w:sz w:val="24"/>
+          <w:szCs w:val="24"/>
+          <w:lang w:val="tr-TR"/>
+        </w:rPr>
+      </w:r>
+      <w:r>
+        <w:rPr>
+          <w:rFonts w:ascii="Times New Roman" w:hAnsi="Times New Roman"/>
+          <w:bCs/>
+          <w:sz w:val="24"/>
+          <w:szCs w:val="24"/>
+          <w:lang w:val="tr-TR"/>
+        </w:rPr>
       </w:r>
       <w:r>
         <w:rPr>
@@ -1426,32 +1154,19 @@
           <w:noProof/>
           <w:sz w:val="24"/>
           <w:szCs w:val="24"/>
-          <w:highlight w:val="green"/>
-          <w:lang w:val="tr-TR"/>
-        </w:rPr>
-        <w:t>[4]</w:t>
-      </w:r>
-      <w:r>
-        <w:rPr>
-          <w:rFonts w:ascii="Times New Roman" w:hAnsi="Times New Roman"/>
-          <w:bCs/>
-          <w:sz w:val="24"/>
-          <w:szCs w:val="24"/>
-          <w:highlight w:val="green"/>
-          <w:lang w:val="tr-TR"/>
-        </w:rPr>
-        <w:fldChar w:fldCharType="end"/>
-      </w:r>
-      <w:r>
-        <w:rPr>
-          <w:rFonts w:ascii="Times New Roman" w:hAnsi="Times New Roman"/>
-          <w:bCs/>
-          <w:sz w:val="24"/>
-          <w:szCs w:val="24"/>
-          <w:highlight w:val="green"/>
-          <w:lang w:val="tr-TR"/>
-        </w:rPr>
-        <w:t xml:space="preserve"> and the unique circulatory alterations</w:t>
+          <w:lang w:val="tr-TR"/>
+        </w:rPr>
+        <w:t>[5]</w:t>
+      </w:r>
+      <w:r>
+        <w:rPr>
+          <w:rFonts w:ascii="Times New Roman" w:hAnsi="Times New Roman"/>
+          <w:bCs/>
+          <w:sz w:val="24"/>
+          <w:szCs w:val="24"/>
+          <w:lang w:val="tr-TR"/>
+        </w:rPr>
+        <w:t>.</w:t>
       </w:r>
       <w:r>
         <w:rPr>
@@ -1469,228 +1184,27 @@
           <w:bCs/>
           <w:sz w:val="24"/>
           <w:szCs w:val="24"/>
-          <w:highlight w:val="green"/>
-          <w:lang w:val="tr-TR"/>
-        </w:rPr>
-        <w:t>imposed by peripheral femoral arterial and venous cardiopulmonary bypass (CPB) cannulation combine to narrow the cardiovascular safety margin. These dynamic procedural phases can trigger acute shifts in pulmonary vascular resistance, right ventricular volume loading, and profound mean arterial pressure (MAP) lability, demanding highly precise and immediate titration of anesthetic agents.</w:t>
-      </w:r>
-    </w:p>
-    <w:p>
-      <w:pPr>
-        <w:spacing w:line="360" w:lineRule="auto"/>
-        <w:jc w:val="both"/>
-        <w:rPr>
-          <w:rFonts w:ascii="Times New Roman" w:hAnsi="Times New Roman"/>
-          <w:bCs/>
-          <w:sz w:val="24"/>
-          <w:szCs w:val="24"/>
-          <w:lang w:val="tr-TR"/>
-        </w:rPr>
-      </w:pPr>
-      <w:r>
-        <w:rPr>
-          <w:rFonts w:ascii="Times New Roman" w:hAnsi="Times New Roman"/>
-          <w:bCs/>
-          <w:sz w:val="24"/>
-          <w:szCs w:val="24"/>
-          <w:lang w:val="tr-TR"/>
-        </w:rPr>
-        <w:t>A pivotal determinant of clinical success within modern MICS pathways is the implementation of structured "ultra-fast-track" anesthesia protocols aimed at early, safe extubation and expedited transition through the intensive care unit (ICU). Achieving these endpoints necessitates an anesthetic delivery strategy capable of maintaining tight intraoperative hypnotic and analgesic control during intense surgical stimulation, while ensuring a rapid, predictable dissipation of drug effects to avoid prolonged residual sedation. Traditionally, intraoperative total intravenous anesthesia (TIVA) has been managed via Manual-Controlled Infusion (MCI), where drug delivery is adjusted at the clinician’s discretion through empirical step-changes in infusion rates. Because MCI lacks an underlying pharmacokinetic profile, it is highly susceptible to drug accumulation and relative overdosing, which frequently manifests as intraoperative hemodynamic instability, prolonged mechanical ventilation, or delayed emergence.</w:t>
-      </w:r>
-    </w:p>
-    <w:p>
-      <w:pPr>
-        <w:spacing w:line="360" w:lineRule="auto"/>
-        <w:jc w:val="both"/>
-        <w:rPr>
-          <w:rFonts w:ascii="Times New Roman" w:hAnsi="Times New Roman"/>
-          <w:bCs/>
-          <w:sz w:val="24"/>
-          <w:szCs w:val="24"/>
-          <w:lang w:val="tr-TR"/>
-        </w:rPr>
-      </w:pPr>
-      <w:r>
-        <w:rPr>
-          <w:rFonts w:ascii="Times New Roman" w:hAnsi="Times New Roman"/>
-          <w:bCs/>
-          <w:sz w:val="24"/>
-          <w:szCs w:val="24"/>
-          <w:lang w:val="tr-TR"/>
-        </w:rPr>
-        <w:t xml:space="preserve">To circumvent these limitations, pharmacokinetic model-driven Target-Controlled Infusion (TCI) systems automate drug delivery by continually calibrating plasma or effect-site concentrations based on patient-specific covariates. While traditional cardiac TCI protocols have historically relied on first-generation models—such as the Marsh or Schnider models for propofol and the Minto model for remifentanil—these algorithms possess inherent limitations when applied to broad patient populations, particularly regarding body mass index extremes and elderly cohorts </w:t>
-      </w:r>
-      <w:r>
-        <w:rPr>
-          <w:rFonts w:ascii="Times New Roman" w:hAnsi="Times New Roman"/>
-          <w:bCs/>
-          <w:sz w:val="24"/>
-          <w:szCs w:val="24"/>
-          <w:lang w:val="tr-TR"/>
-        </w:rPr>
-        <w:fldChar w:fldCharType="begin">
-          <w:fldData xml:space="preserve">PEVuZE5vdGU+PENpdGU+PEF1dGhvcj5FbGV2ZWxkPC9BdXRob3I+PFllYXI+MjAxODwvWWVhcj48
-UmVjTnVtPjE8L1JlY051bT48RGlzcGxheVRleHQ+WzVdPC9EaXNwbGF5VGV4dD48cmVjb3JkPjxy
-ZWMtbnVtYmVyPjE8L3JlYy1udW1iZXI+PGZvcmVpZ24ta2V5cz48a2V5IGFwcD0iRU4iIGRiLWlk
-PSJ3d3Jmenp0YWwwOXdkc2VldnA5NWY5eHF3ZWR6MjVydHR0czkiIHRpbWVzdGFtcD0iMTc3OTgy
-NzQxNCI+MTwva2V5PjwvZm9yZWlnbi1rZXlzPjxyZWYtdHlwZSBuYW1lPSJKb3VybmFsIEFydGlj
-bGUiPjE3PC9yZWYtdHlwZT48Y29udHJpYnV0b3JzPjxhdXRob3JzPjxhdXRob3I+RWxldmVsZCwg
-RC4gSi48L2F1dGhvcj48YXV0aG9yPkNvbGluLCBQLjwvYXV0aG9yPjxhdXRob3I+QWJzYWxvbSwg
-QS4gUi48L2F1dGhvcj48YXV0aG9yPlN0cnV5cywgTW1yZjwvYXV0aG9yPjwvYXV0aG9ycz48L2Nv
-bnRyaWJ1dG9ycz48YXV0aC1hZGRyZXNzPkRlcGFydG1lbnQgb2YgQW5lc3RoZXNpb2xvZ3ksIFVu
-aXZlcnNpdHkgTWVkaWNhbCBDZW50ZXIgR3JvbmluZ2VuLCBHcm9uaW5nZW4sIFRoZSBOZXRoZXJs
-YW5kcy4gRWxlY3Ryb25pYyBhZGRyZXNzOiBkLmouZWxldmVsZEB1bWNnLm5sLiYjeEQ7RGVwYXJ0
-bWVudCBvZiBBbmVzdGhlc2lvbG9neSwgVW5pdmVyc2l0eSBNZWRpY2FsIENlbnRlciBHcm9uaW5n
-ZW4sIEdyb25pbmdlbiwgVGhlIE5ldGhlcmxhbmRzOyBEZXBhcnRtZW50IG9mIEJpb2FuYWx5c2lz
-LCBGYWN1bHR5IG9mIFBoYXJtYWNldXRpY2FsIFNjaWVuY2VzLCBHaGVudCBVbml2ZXJzaXR5LCBH
-aGVudCwgQmVsZ2l1bS4mI3hEO0RlcGFydG1lbnQgb2YgQW5lc3RoZXNpb2xvZ3ksIFVuaXZlcnNp
-dHkgTWVkaWNhbCBDZW50ZXIgR3JvbmluZ2VuLCBHcm9uaW5nZW4sIFRoZSBOZXRoZXJsYW5kcy4m
-I3hEO0RlcGFydG1lbnQgb2YgQW5lc3RoZXNpb2xvZ3ksIFVuaXZlcnNpdHkgTWVkaWNhbCBDZW50
-ZXIgR3JvbmluZ2VuLCBHcm9uaW5nZW4sIFRoZSBOZXRoZXJsYW5kczsgRGVwYXJ0bWVudCBvZiBB
-bmVzdGhlc2lhIGFuZCBQZXJpLW9wZXJhdGl2ZSBNZWRpY2luZSwgR2hlbnQgVW5pdmVyc2l0eSwg
-R2hlbnQsIEJlbGdpdW0uPC9hdXRoLWFkZHJlc3M+PHRpdGxlcz48dGl0bGU+UGhhcm1hY29raW5l
-dGljLXBoYXJtYWNvZHluYW1pYyBtb2RlbCBmb3IgcHJvcG9mb2wgZm9yIGJyb2FkIGFwcGxpY2F0
-aW9uIGluIGFuYWVzdGhlc2lhIGFuZCBzZWRhdGlvbjwvdGl0bGU+PHNlY29uZGFyeS10aXRsZT5C
-ciBKIEFuYWVzdGg8L3NlY29uZGFyeS10aXRsZT48L3RpdGxlcz48cGVyaW9kaWNhbD48ZnVsbC10
-aXRsZT5CciBKIEFuYWVzdGg8L2Z1bGwtdGl0bGU+PC9wZXJpb2RpY2FsPjxwYWdlcz45NDItOTU5
-PC9wYWdlcz48dm9sdW1lPjEyMDwvdm9sdW1lPjxudW1iZXI+NTwvbnVtYmVyPjxlZGl0aW9uPjIw
-MTgwMzEyPC9lZGl0aW9uPjxrZXl3b3Jkcz48a2V5d29yZD5BZG9sZXNjZW50PC9rZXl3b3JkPjxr
-ZXl3b3JkPkFkdWx0PC9rZXl3b3JkPjxrZXl3b3JkPkFnZWQ8L2tleXdvcmQ+PGtleXdvcmQ+QWdl
-ZCwgODAgYW5kIG92ZXI8L2tleXdvcmQ+PGtleXdvcmQ+QW5lc3RoZXNpYS8qbWV0aG9kczwva2V5
-d29yZD48a2V5d29yZD5BbmVzdGhldGljcywgSW50cmF2ZW5vdXMvYWRtaW5pc3RyYXRpb24gJmFt
-cDsgZG9zYWdlL3BoYXJtYWNva2luZXRpY3MvKnBoYXJtYWNvbG9neTwva2V5d29yZD48a2V5d29y
-ZD5DaGlsZDwva2V5d29yZD48a2V5d29yZD5DaGlsZCwgUHJlc2Nob29sPC9rZXl3b3JkPjxrZXl3
-b3JkPkZlbWFsZTwva2V5d29yZD48a2V5d29yZD5IdW1hbnM8L2tleXdvcmQ+PGtleXdvcmQ+SW5m
-YW50PC9rZXl3b3JkPjxrZXl3b3JkPkluZnVzaW9ucywgSW50cmF2ZW5vdXM8L2tleXdvcmQ+PGtl
-eXdvcmQ+TWFsZTwva2V5d29yZD48a2V5d29yZD5NaWRkbGUgQWdlZDwva2V5d29yZD48a2V5d29y
-ZD4qTW9kZWxzLCBCaW9sb2dpY2FsPC9rZXl3b3JkPjxrZXl3b3JkPlByb3BvZm9sL2FkbWluaXN0
-cmF0aW9uICZhbXA7IGRvc2FnZS9waGFybWFjb2tpbmV0aWNzLypwaGFybWFjb2xvZ3k8L2tleXdv
-cmQ+PGtleXdvcmQ+WW91bmcgQWR1bHQ8L2tleXdvcmQ+PGtleXdvcmQ+cGhhcm1hY29raW5ldGlj
-czwva2V5d29yZD48a2V5d29yZD5waGFybWFjb2xvZ3k8L2tleXdvcmQ+PGtleXdvcmQ+cHJvcG9m
-b2w8L2tleXdvcmQ+PC9rZXl3b3Jkcz48ZGF0ZXM+PHllYXI+MjAxODwveWVhcj48cHViLWRhdGVz
-PjxkYXRlPk1heTwvZGF0ZT48L3B1Yi1kYXRlcz48L2RhdGVzPjxpc2JuPjAwMDctMDkxMjwvaXNi
-bj48YWNjZXNzaW9uLW51bT4yOTY2MTQxMjwvYWNjZXNzaW9uLW51bT48dXJscz48L3VybHM+PGVs
-ZWN0cm9uaWMtcmVzb3VyY2UtbnVtPjEwLjEwMTYvai5iamEuMjAxOC4wMS4wMTg8L2VsZWN0cm9u
-aWMtcmVzb3VyY2UtbnVtPjxyZW1vdGUtZGF0YWJhc2UtcHJvdmlkZXI+TkxNPC9yZW1vdGUtZGF0
-YWJhc2UtcHJvdmlkZXI+PGxhbmd1YWdlPmVuZzwvbGFuZ3VhZ2U+PC9yZWNvcmQ+PC9DaXRlPjwv
-RW5kTm90ZT5=
-</w:fldData>
-        </w:fldChar>
-      </w:r>
-      <w:r>
-        <w:rPr>
-          <w:rFonts w:ascii="Times New Roman" w:hAnsi="Times New Roman"/>
-          <w:bCs/>
-          <w:sz w:val="24"/>
-          <w:szCs w:val="24"/>
-          <w:lang w:val="tr-TR"/>
-        </w:rPr>
-        <w:instrText xml:space="preserve"> ADDIN EN.CITE </w:instrText>
-      </w:r>
-      <w:r>
-        <w:rPr>
-          <w:rFonts w:ascii="Times New Roman" w:hAnsi="Times New Roman"/>
-          <w:bCs/>
-          <w:sz w:val="24"/>
-          <w:szCs w:val="24"/>
-          <w:lang w:val="tr-TR"/>
-        </w:rPr>
-        <w:fldChar w:fldCharType="begin">
-          <w:fldData xml:space="preserve">PEVuZE5vdGU+PENpdGU+PEF1dGhvcj5FbGV2ZWxkPC9BdXRob3I+PFllYXI+MjAxODwvWWVhcj48
-UmVjTnVtPjE8L1JlY051bT48RGlzcGxheVRleHQ+WzVdPC9EaXNwbGF5VGV4dD48cmVjb3JkPjxy
-ZWMtbnVtYmVyPjE8L3JlYy1udW1iZXI+PGZvcmVpZ24ta2V5cz48a2V5IGFwcD0iRU4iIGRiLWlk
-PSJ3d3Jmenp0YWwwOXdkc2VldnA5NWY5eHF3ZWR6MjVydHR0czkiIHRpbWVzdGFtcD0iMTc3OTgy
-NzQxNCI+MTwva2V5PjwvZm9yZWlnbi1rZXlzPjxyZWYtdHlwZSBuYW1lPSJKb3VybmFsIEFydGlj
-bGUiPjE3PC9yZWYtdHlwZT48Y29udHJpYnV0b3JzPjxhdXRob3JzPjxhdXRob3I+RWxldmVsZCwg
-RC4gSi48L2F1dGhvcj48YXV0aG9yPkNvbGluLCBQLjwvYXV0aG9yPjxhdXRob3I+QWJzYWxvbSwg
-QS4gUi48L2F1dGhvcj48YXV0aG9yPlN0cnV5cywgTW1yZjwvYXV0aG9yPjwvYXV0aG9ycz48L2Nv
-bnRyaWJ1dG9ycz48YXV0aC1hZGRyZXNzPkRlcGFydG1lbnQgb2YgQW5lc3RoZXNpb2xvZ3ksIFVu
-aXZlcnNpdHkgTWVkaWNhbCBDZW50ZXIgR3JvbmluZ2VuLCBHcm9uaW5nZW4sIFRoZSBOZXRoZXJs
-YW5kcy4gRWxlY3Ryb25pYyBhZGRyZXNzOiBkLmouZWxldmVsZEB1bWNnLm5sLiYjeEQ7RGVwYXJ0
-bWVudCBvZiBBbmVzdGhlc2lvbG9neSwgVW5pdmVyc2l0eSBNZWRpY2FsIENlbnRlciBHcm9uaW5n
-ZW4sIEdyb25pbmdlbiwgVGhlIE5ldGhlcmxhbmRzOyBEZXBhcnRtZW50IG9mIEJpb2FuYWx5c2lz
-LCBGYWN1bHR5IG9mIFBoYXJtYWNldXRpY2FsIFNjaWVuY2VzLCBHaGVudCBVbml2ZXJzaXR5LCBH
-aGVudCwgQmVsZ2l1bS4mI3hEO0RlcGFydG1lbnQgb2YgQW5lc3RoZXNpb2xvZ3ksIFVuaXZlcnNp
-dHkgTWVkaWNhbCBDZW50ZXIgR3JvbmluZ2VuLCBHcm9uaW5nZW4sIFRoZSBOZXRoZXJsYW5kcy4m
-I3hEO0RlcGFydG1lbnQgb2YgQW5lc3RoZXNpb2xvZ3ksIFVuaXZlcnNpdHkgTWVkaWNhbCBDZW50
-ZXIgR3JvbmluZ2VuLCBHcm9uaW5nZW4sIFRoZSBOZXRoZXJsYW5kczsgRGVwYXJ0bWVudCBvZiBB
-bmVzdGhlc2lhIGFuZCBQZXJpLW9wZXJhdGl2ZSBNZWRpY2luZSwgR2hlbnQgVW5pdmVyc2l0eSwg
-R2hlbnQsIEJlbGdpdW0uPC9hdXRoLWFkZHJlc3M+PHRpdGxlcz48dGl0bGU+UGhhcm1hY29raW5l
-dGljLXBoYXJtYWNvZHluYW1pYyBtb2RlbCBmb3IgcHJvcG9mb2wgZm9yIGJyb2FkIGFwcGxpY2F0
-aW9uIGluIGFuYWVzdGhlc2lhIGFuZCBzZWRhdGlvbjwvdGl0bGU+PHNlY29uZGFyeS10aXRsZT5C
-ciBKIEFuYWVzdGg8L3NlY29uZGFyeS10aXRsZT48L3RpdGxlcz48cGVyaW9kaWNhbD48ZnVsbC10
-aXRsZT5CciBKIEFuYWVzdGg8L2Z1bGwtdGl0bGU+PC9wZXJpb2RpY2FsPjxwYWdlcz45NDItOTU5
-PC9wYWdlcz48dm9sdW1lPjEyMDwvdm9sdW1lPjxudW1iZXI+NTwvbnVtYmVyPjxlZGl0aW9uPjIw
-MTgwMzEyPC9lZGl0aW9uPjxrZXl3b3Jkcz48a2V5d29yZD5BZG9sZXNjZW50PC9rZXl3b3JkPjxr
-ZXl3b3JkPkFkdWx0PC9rZXl3b3JkPjxrZXl3b3JkPkFnZWQ8L2tleXdvcmQ+PGtleXdvcmQ+QWdl
-ZCwgODAgYW5kIG92ZXI8L2tleXdvcmQ+PGtleXdvcmQ+QW5lc3RoZXNpYS8qbWV0aG9kczwva2V5
-d29yZD48a2V5d29yZD5BbmVzdGhldGljcywgSW50cmF2ZW5vdXMvYWRtaW5pc3RyYXRpb24gJmFt
-cDsgZG9zYWdlL3BoYXJtYWNva2luZXRpY3MvKnBoYXJtYWNvbG9neTwva2V5d29yZD48a2V5d29y
-ZD5DaGlsZDwva2V5d29yZD48a2V5d29yZD5DaGlsZCwgUHJlc2Nob29sPC9rZXl3b3JkPjxrZXl3
-b3JkPkZlbWFsZTwva2V5d29yZD48a2V5d29yZD5IdW1hbnM8L2tleXdvcmQ+PGtleXdvcmQ+SW5m
-YW50PC9rZXl3b3JkPjxrZXl3b3JkPkluZnVzaW9ucywgSW50cmF2ZW5vdXM8L2tleXdvcmQ+PGtl
-eXdvcmQ+TWFsZTwva2V5d29yZD48a2V5d29yZD5NaWRkbGUgQWdlZDwva2V5d29yZD48a2V5d29y
-ZD4qTW9kZWxzLCBCaW9sb2dpY2FsPC9rZXl3b3JkPjxrZXl3b3JkPlByb3BvZm9sL2FkbWluaXN0
-cmF0aW9uICZhbXA7IGRvc2FnZS9waGFybWFjb2tpbmV0aWNzLypwaGFybWFjb2xvZ3k8L2tleXdv
-cmQ+PGtleXdvcmQ+WW91bmcgQWR1bHQ8L2tleXdvcmQ+PGtleXdvcmQ+cGhhcm1hY29raW5ldGlj
-czwva2V5d29yZD48a2V5d29yZD5waGFybWFjb2xvZ3k8L2tleXdvcmQ+PGtleXdvcmQ+cHJvcG9m
-b2w8L2tleXdvcmQ+PC9rZXl3b3Jkcz48ZGF0ZXM+PHllYXI+MjAxODwveWVhcj48cHViLWRhdGVz
-PjxkYXRlPk1heTwvZGF0ZT48L3B1Yi1kYXRlcz48L2RhdGVzPjxpc2JuPjAwMDctMDkxMjwvaXNi
-bj48YWNjZXNzaW9uLW51bT4yOTY2MTQxMjwvYWNjZXNzaW9uLW51bT48dXJscz48L3VybHM+PGVs
-ZWN0cm9uaWMtcmVzb3VyY2UtbnVtPjEwLjEwMTYvai5iamEuMjAxOC4wMS4wMTg8L2VsZWN0cm9u
-aWMtcmVzb3VyY2UtbnVtPjxyZW1vdGUtZGF0YWJhc2UtcHJvdmlkZXI+TkxNPC9yZW1vdGUtZGF0
-YWJhc2UtcHJvdmlkZXI+PGxhbmd1YWdlPmVuZzwvbGFuZ3VhZ2U+PC9yZWNvcmQ+PC9DaXRlPjwv
-RW5kTm90ZT5=
-</w:fldData>
-        </w:fldChar>
-      </w:r>
-      <w:r>
-        <w:rPr>
-          <w:rFonts w:ascii="Times New Roman" w:hAnsi="Times New Roman"/>
-          <w:bCs/>
-          <w:sz w:val="24"/>
-          <w:szCs w:val="24"/>
-          <w:lang w:val="tr-TR"/>
-        </w:rPr>
-        <w:instrText xml:space="preserve"> ADDIN EN.CITE.DATA </w:instrText>
-      </w:r>
-      <w:r>
-        <w:rPr>
-          <w:rFonts w:ascii="Times New Roman" w:hAnsi="Times New Roman"/>
-          <w:bCs/>
-          <w:sz w:val="24"/>
-          <w:szCs w:val="24"/>
-          <w:lang w:val="tr-TR"/>
-        </w:rPr>
-      </w:r>
-      <w:r>
-        <w:rPr>
-          <w:rFonts w:ascii="Times New Roman" w:hAnsi="Times New Roman"/>
-          <w:bCs/>
-          <w:sz w:val="24"/>
-          <w:szCs w:val="24"/>
-          <w:lang w:val="tr-TR"/>
-        </w:rPr>
-        <w:fldChar w:fldCharType="end"/>
-      </w:r>
-      <w:r>
-        <w:rPr>
-          <w:rFonts w:ascii="Times New Roman" w:hAnsi="Times New Roman"/>
-          <w:bCs/>
-          <w:sz w:val="24"/>
-          <w:szCs w:val="24"/>
-          <w:lang w:val="tr-TR"/>
-        </w:rPr>
-      </w:r>
-      <w:r>
-        <w:rPr>
-          <w:rFonts w:ascii="Times New Roman" w:hAnsi="Times New Roman"/>
-          <w:bCs/>
-          <w:sz w:val="24"/>
-          <w:szCs w:val="24"/>
-          <w:lang w:val="tr-TR"/>
-        </w:rPr>
-        <w:fldChar w:fldCharType="separate"/>
+          <w:lang w:val="tr-TR"/>
+        </w:rPr>
+        <w:t>A major paradigm shift in contemporary TIVA is the introduction of the Eleveld pharmacokinetic/pharmacodynamic (PK/PD) model for both propofol and remifentanil </w:t>
+      </w:r>
+      <w:r>
+        <w:rPr>
+          <w:rFonts w:ascii="Times New Roman" w:hAnsi="Times New Roman"/>
+          <w:bCs/>
+          <w:sz w:val="24"/>
+          <w:szCs w:val="24"/>
+          <w:lang w:val="tr-TR"/>
+        </w:rPr>
+      </w:r>
+      <w:r>
+        <w:rPr>
+          <w:rFonts w:ascii="Times New Roman" w:hAnsi="Times New Roman"/>
+          <w:bCs/>
+          <w:sz w:val="24"/>
+          <w:szCs w:val="24"/>
+          <w:lang w:val="tr-TR"/>
+        </w:rPr>
       </w:r>
       <w:r>
         <w:rPr>
@@ -1701,295 +1215,17 @@
           <w:szCs w:val="24"/>
           <w:lang w:val="tr-TR"/>
         </w:rPr>
-        <w:t>[5]</w:t>
-      </w:r>
-      <w:r>
-        <w:rPr>
-          <w:rFonts w:ascii="Times New Roman" w:hAnsi="Times New Roman"/>
-          <w:bCs/>
-          <w:sz w:val="24"/>
-          <w:szCs w:val="24"/>
-          <w:lang w:val="tr-TR"/>
-        </w:rPr>
-        <w:fldChar w:fldCharType="end"/>
-      </w:r>
-      <w:r>
-        <w:rPr>
-          <w:rFonts w:ascii="Times New Roman" w:hAnsi="Times New Roman"/>
-          <w:bCs/>
-          <w:sz w:val="24"/>
-          <w:szCs w:val="24"/>
-          <w:lang w:val="tr-TR"/>
-        </w:rPr>
-        <w:t>.</w:t>
-      </w:r>
-      <w:r>
-        <w:rPr>
-          <w:rFonts w:ascii="Times New Roman" w:hAnsi="Times New Roman"/>
-          <w:bCs/>
-          <w:sz w:val="24"/>
-          <w:szCs w:val="24"/>
-          <w:lang w:val="tr-TR"/>
-        </w:rPr>
-        <w:t xml:space="preserve"> </w:t>
-      </w:r>
-      <w:r>
-        <w:rPr>
-          <w:rFonts w:ascii="Times New Roman" w:hAnsi="Times New Roman"/>
-          <w:bCs/>
-          <w:sz w:val="24"/>
-          <w:szCs w:val="24"/>
-          <w:lang w:val="tr-TR"/>
-        </w:rPr>
-        <w:t>A major paradigm shift in contemporary TIVA is the introduction of the Eleveld pharmacokinetic/pharmacodynamic (PK/PD) model for both propofol and remifentanil </w:t>
-      </w:r>
-      <w:r>
-        <w:rPr>
-          <w:rFonts w:ascii="Times New Roman" w:hAnsi="Times New Roman"/>
-          <w:bCs/>
-          <w:sz w:val="24"/>
-          <w:szCs w:val="24"/>
-          <w:lang w:val="tr-TR"/>
-        </w:rPr>
-        <w:fldChar w:fldCharType="begin">
-          <w:fldData xml:space="preserve">PEVuZE5vdGU+PENpdGU+PEF1dGhvcj5FbGV2ZWxkPC9BdXRob3I+PFllYXI+MjAxNDwvWWVhcj48
-UmVjTnVtPjI8L1JlY051bT48RGlzcGxheVRleHQ+WzUsIDZdPC9EaXNwbGF5VGV4dD48cmVjb3Jk
-PjxyZWMtbnVtYmVyPjI8L3JlYy1udW1iZXI+PGZvcmVpZ24ta2V5cz48a2V5IGFwcD0iRU4iIGRi
-LWlkPSJ3d3Jmenp0YWwwOXdkc2VldnA5NWY5eHF3ZWR6MjVydHR0czkiIHRpbWVzdGFtcD0iMTc3
-OTgyNzU1NCI+Mjwva2V5PjwvZm9yZWlnbi1rZXlzPjxyZWYtdHlwZSBuYW1lPSJKb3VybmFsIEFy
-dGljbGUiPjE3PC9yZWYtdHlwZT48Y29udHJpYnV0b3JzPjxhdXRob3JzPjxhdXRob3I+RWxldmVs
-ZCwgRC4gSi48L2F1dGhvcj48YXV0aG9yPlByb29zdCwgSi4gSC48L2F1dGhvcj48YXV0aG9yPkNv
-cnTDrW5leiwgTC4gSS48L2F1dGhvcj48YXV0aG9yPkFic2Fsb20sIEEuIFIuPC9hdXRob3I+PGF1
-dGhvcj5TdHJ1eXMsIE0uIE0uPC9hdXRob3I+PC9hdXRob3JzPjwvY29udHJpYnV0b3JzPjxhdXRo
-LWFkZHJlc3M+RnJvbSB0aGUgKkRlcGFydG1lbnQgb2YgQW5lc3RoZXNpb2xvZ3ksIFVuaXZlcnNp
-dHkgTWVkaWNhbCBDZW50ZXIgR3JvbmluZ2VuLCBVbml2ZXJzaXR5IG9mIEdyb25pbmdlbiwgVGhl
-IE5ldGhlcmxhbmRzOyDigKBEZXBhcnRtZW50byBkZSBBbmVzdGVzaW9sb2fDrWEsIEVzY3VlbGEg
-ZGUgTWVkaWNpbmEsIFBvbnRpZmljaWEgVW5pdmVyc2lkYWQgQ2F0w7NsaWNhIGRlIENoaWxlLCBT
-YW50aWFnbywgQ2hpbGU7IGFuZCDigKFEZXBhcnRtZW50IG9mIEFuZXN0aGVzaWEsIEdoZW50IFVu
-aXZlcnNpdHksIEdlbnQsIEJlbGdpdW0uPC9hdXRoLWFkZHJlc3M+PHRpdGxlcz48dGl0bGU+QSBn
-ZW5lcmFsIHB1cnBvc2UgcGhhcm1hY29raW5ldGljIG1vZGVsIGZvciBwcm9wb2ZvbDwvdGl0bGU+
-PHNlY29uZGFyeS10aXRsZT5BbmVzdGggQW5hbGc8L3NlY29uZGFyeS10aXRsZT48L3RpdGxlcz48
-cGVyaW9kaWNhbD48ZnVsbC10aXRsZT5BbmVzdGggQW5hbGc8L2Z1bGwtdGl0bGU+PC9wZXJpb2Rp
-Y2FsPjxwYWdlcz4xMjIxLTM3PC9wYWdlcz48dm9sdW1lPjExODwvdm9sdW1lPjxudW1iZXI+Njwv
-bnVtYmVyPjxrZXl3b3Jkcz48a2V5d29yZD5BZG9sZXNjZW50PC9rZXl3b3JkPjxrZXl3b3JkPkFk
-dWx0PC9rZXl3b3JkPjxrZXl3b3JkPkFnZSBGYWN0b3JzPC9rZXl3b3JkPjxrZXl3b3JkPkFnZWQ8
-L2tleXdvcmQ+PGtleXdvcmQ+QWdlZCwgODAgYW5kIG92ZXI8L2tleXdvcmQ+PGtleXdvcmQ+QWdp
-bmcvbWV0YWJvbGlzbTwva2V5d29yZD48a2V5d29yZD5BbGdvcml0aG1zPC9rZXl3b3JkPjxrZXl3
-b3JkPkFuZXN0aGVzaWEsIEludHJhdmVub3VzPC9rZXl3b3JkPjxrZXl3b3JkPkFuZXN0aGV0aWNz
-LCBJbnRyYXZlbm91cy8qcGhhcm1hY29raW5ldGljczwva2V5d29yZD48a2V5d29yZD5DaGlsZDwv
-a2V5d29yZD48a2V5d29yZD5DaGlsZCwgUHJlc2Nob29sPC9rZXl3b3JkPjxrZXl3b3JkPkRhdGFi
-YXNlcywgRmFjdHVhbDwva2V5d29yZD48a2V5d29yZD5GZW1hbGU8L2tleXdvcmQ+PGtleXdvcmQ+
-SHVtYW5zPC9rZXl3b3JkPjxrZXl3b3JkPkluZmFudDwva2V5d29yZD48a2V5d29yZD5JbnRyYW9w
-ZXJhdGl2ZSBQZXJpb2Q8L2tleXdvcmQ+PGtleXdvcmQ+TWFsZTwva2V5d29yZD48a2V5d29yZD5N
-aWRkbGUgQWdlZDwva2V5d29yZD48a2V5d29yZD5Nb2RlbHMsIFN0YXRpc3RpY2FsPC9rZXl3b3Jk
-PjxrZXl3b3JkPk9iZXNpdHkvbWV0YWJvbGlzbTwva2V5d29yZD48a2V5d29yZD5QcmVkaWN0aXZl
-IFZhbHVlIG9mIFRlc3RzPC9rZXl3b3JkPjxrZXl3b3JkPlByb3BvZm9sLypwaGFybWFjb2tpbmV0
-aWNzPC9rZXl3b3JkPjxrZXl3b3JkPlNleCBDaGFyYWN0ZXJpc3RpY3M8L2tleXdvcmQ+PGtleXdv
-cmQ+WW91bmcgQWR1bHQ8L2tleXdvcmQ+PC9rZXl3b3Jkcz48ZGF0ZXM+PHllYXI+MjAxNDwveWVh
-cj48cHViLWRhdGVzPjxkYXRlPkp1bjwvZGF0ZT48L3B1Yi1kYXRlcz48L2RhdGVzPjxpc2JuPjAw
-MDMtMjk5OTwvaXNibj48YWNjZXNzaW9uLW51bT4yNDcyMjI1ODwvYWNjZXNzaW9uLW51bT48dXJs
-cz48L3VybHM+PGVsZWN0cm9uaWMtcmVzb3VyY2UtbnVtPjEwLjEyMTMvYW5lLjAwMDAwMDAwMDAw
-MDAxNjU8L2VsZWN0cm9uaWMtcmVzb3VyY2UtbnVtPjxyZW1vdGUtZGF0YWJhc2UtcHJvdmlkZXI+
-TkxNPC9yZW1vdGUtZGF0YWJhc2UtcHJvdmlkZXI+PGxhbmd1YWdlPmVuZzwvbGFuZ3VhZ2U+PC9y
-ZWNvcmQ+PC9DaXRlPjxDaXRlPjxBdXRob3I+RWxldmVsZDwvQXV0aG9yPjxZZWFyPjIwMTg8L1ll
-YXI+PFJlY051bT4xPC9SZWNOdW0+PHJlY29yZD48cmVjLW51bWJlcj4xPC9yZWMtbnVtYmVyPjxm
-b3JlaWduLWtleXM+PGtleSBhcHA9IkVOIiBkYi1pZD0id3dyZnp6dGFsMDl3ZHNlZXZwOTVmOXhx
-d2VkejI1cnR0dHM5IiB0aW1lc3RhbXA9IjE3Nzk4Mjc0MTQiPjE8L2tleT48L2ZvcmVpZ24ta2V5
-cz48cmVmLXR5cGUgbmFtZT0iSm91cm5hbCBBcnRpY2xlIj4xNzwvcmVmLXR5cGU+PGNvbnRyaWJ1
-dG9ycz48YXV0aG9ycz48YXV0aG9yPkVsZXZlbGQsIEQuIEouPC9hdXRob3I+PGF1dGhvcj5Db2xp
-biwgUC48L2F1dGhvcj48YXV0aG9yPkFic2Fsb20sIEEuIFIuPC9hdXRob3I+PGF1dGhvcj5TdHJ1
-eXMsIE1tcmY8L2F1dGhvcj48L2F1dGhvcnM+PC9jb250cmlidXRvcnM+PGF1dGgtYWRkcmVzcz5E
-ZXBhcnRtZW50IG9mIEFuZXN0aGVzaW9sb2d5LCBVbml2ZXJzaXR5IE1lZGljYWwgQ2VudGVyIEdy
-b25pbmdlbiwgR3JvbmluZ2VuLCBUaGUgTmV0aGVybGFuZHMuIEVsZWN0cm9uaWMgYWRkcmVzczog
-ZC5qLmVsZXZlbGRAdW1jZy5ubC4mI3hEO0RlcGFydG1lbnQgb2YgQW5lc3RoZXNpb2xvZ3ksIFVu
-aXZlcnNpdHkgTWVkaWNhbCBDZW50ZXIgR3JvbmluZ2VuLCBHcm9uaW5nZW4sIFRoZSBOZXRoZXJs
-YW5kczsgRGVwYXJ0bWVudCBvZiBCaW9hbmFseXNpcywgRmFjdWx0eSBvZiBQaGFybWFjZXV0aWNh
-bCBTY2llbmNlcywgR2hlbnQgVW5pdmVyc2l0eSwgR2hlbnQsIEJlbGdpdW0uJiN4RDtEZXBhcnRt
-ZW50IG9mIEFuZXN0aGVzaW9sb2d5LCBVbml2ZXJzaXR5IE1lZGljYWwgQ2VudGVyIEdyb25pbmdl
-biwgR3JvbmluZ2VuLCBUaGUgTmV0aGVybGFuZHMuJiN4RDtEZXBhcnRtZW50IG9mIEFuZXN0aGVz
-aW9sb2d5LCBVbml2ZXJzaXR5IE1lZGljYWwgQ2VudGVyIEdyb25pbmdlbiwgR3JvbmluZ2VuLCBU
-aGUgTmV0aGVybGFuZHM7IERlcGFydG1lbnQgb2YgQW5lc3RoZXNpYSBhbmQgUGVyaS1vcGVyYXRp
-dmUgTWVkaWNpbmUsIEdoZW50IFVuaXZlcnNpdHksIEdoZW50LCBCZWxnaXVtLjwvYXV0aC1hZGRy
-ZXNzPjx0aXRsZXM+PHRpdGxlPlBoYXJtYWNva2luZXRpYy1waGFybWFjb2R5bmFtaWMgbW9kZWwg
-Zm9yIHByb3BvZm9sIGZvciBicm9hZCBhcHBsaWNhdGlvbiBpbiBhbmFlc3RoZXNpYSBhbmQgc2Vk
-YXRpb248L3RpdGxlPjxzZWNvbmRhcnktdGl0bGU+QnIgSiBBbmFlc3RoPC9zZWNvbmRhcnktdGl0
-bGU+PC90aXRsZXM+PHBlcmlvZGljYWw+PGZ1bGwtdGl0bGU+QnIgSiBBbmFlc3RoPC9mdWxsLXRp
-dGxlPjwvcGVyaW9kaWNhbD48cGFnZXM+OTQyLTk1OTwvcGFnZXM+PHZvbHVtZT4xMjA8L3ZvbHVt
-ZT48bnVtYmVyPjU8L251bWJlcj48ZWRpdGlvbj4yMDE4MDMxMjwvZWRpdGlvbj48a2V5d29yZHM+
-PGtleXdvcmQ+QWRvbGVzY2VudDwva2V5d29yZD48a2V5d29yZD5BZHVsdDwva2V5d29yZD48a2V5
-d29yZD5BZ2VkPC9rZXl3b3JkPjxrZXl3b3JkPkFnZWQsIDgwIGFuZCBvdmVyPC9rZXl3b3JkPjxr
-ZXl3b3JkPkFuZXN0aGVzaWEvKm1ldGhvZHM8L2tleXdvcmQ+PGtleXdvcmQ+QW5lc3RoZXRpY3Ms
-IEludHJhdmVub3VzL2FkbWluaXN0cmF0aW9uICZhbXA7IGRvc2FnZS9waGFybWFjb2tpbmV0aWNz
-LypwaGFybWFjb2xvZ3k8L2tleXdvcmQ+PGtleXdvcmQ+Q2hpbGQ8L2tleXdvcmQ+PGtleXdvcmQ+
-Q2hpbGQsIFByZXNjaG9vbDwva2V5d29yZD48a2V5d29yZD5GZW1hbGU8L2tleXdvcmQ+PGtleXdv
-cmQ+SHVtYW5zPC9rZXl3b3JkPjxrZXl3b3JkPkluZmFudDwva2V5d29yZD48a2V5d29yZD5JbmZ1
-c2lvbnMsIEludHJhdmVub3VzPC9rZXl3b3JkPjxrZXl3b3JkPk1hbGU8L2tleXdvcmQ+PGtleXdv
-cmQ+TWlkZGxlIEFnZWQ8L2tleXdvcmQ+PGtleXdvcmQ+Kk1vZGVscywgQmlvbG9naWNhbDwva2V5
-d29yZD48a2V5d29yZD5Qcm9wb2ZvbC9hZG1pbmlzdHJhdGlvbiAmYW1wOyBkb3NhZ2UvcGhhcm1h
-Y29raW5ldGljcy8qcGhhcm1hY29sb2d5PC9rZXl3b3JkPjxrZXl3b3JkPllvdW5nIEFkdWx0PC9r
-ZXl3b3JkPjxrZXl3b3JkPnBoYXJtYWNva2luZXRpY3M8L2tleXdvcmQ+PGtleXdvcmQ+cGhhcm1h
-Y29sb2d5PC9rZXl3b3JkPjxrZXl3b3JkPnByb3BvZm9sPC9rZXl3b3JkPjwva2V5d29yZHM+PGRh
-dGVzPjx5ZWFyPjIwMTg8L3llYXI+PHB1Yi1kYXRlcz48ZGF0ZT5NYXk8L2RhdGU+PC9wdWItZGF0
-ZXM+PC9kYXRlcz48aXNibj4wMDA3LTA5MTI8L2lzYm4+PGFjY2Vzc2lvbi1udW0+Mjk2NjE0MTI8
-L2FjY2Vzc2lvbi1udW0+PHVybHM+PC91cmxzPjxlbGVjdHJvbmljLXJlc291cmNlLW51bT4xMC4x
-MDE2L2ouYmphLjIwMTguMDEuMDE4PC9lbGVjdHJvbmljLXJlc291cmNlLW51bT48cmVtb3RlLWRh
-dGFiYXNlLXByb3ZpZGVyPk5MTTwvcmVtb3RlLWRhdGFiYXNlLXByb3ZpZGVyPjxsYW5ndWFnZT5l
-bmc8L2xhbmd1YWdlPjwvcmVjb3JkPjwvQ2l0ZT48L0VuZE5vdGU+AG==
-</w:fldData>
-        </w:fldChar>
-      </w:r>
-      <w:r>
-        <w:rPr>
-          <w:rFonts w:ascii="Times New Roman" w:hAnsi="Times New Roman"/>
-          <w:bCs/>
-          <w:sz w:val="24"/>
-          <w:szCs w:val="24"/>
-          <w:lang w:val="tr-TR"/>
-        </w:rPr>
-        <w:instrText xml:space="preserve"> ADDIN EN.CITE </w:instrText>
-      </w:r>
-      <w:r>
-        <w:rPr>
-          <w:rFonts w:ascii="Times New Roman" w:hAnsi="Times New Roman"/>
-          <w:bCs/>
-          <w:sz w:val="24"/>
-          <w:szCs w:val="24"/>
-          <w:lang w:val="tr-TR"/>
-        </w:rPr>
-        <w:fldChar w:fldCharType="begin">
-          <w:fldData xml:space="preserve">PEVuZE5vdGU+PENpdGU+PEF1dGhvcj5FbGV2ZWxkPC9BdXRob3I+PFllYXI+MjAxNDwvWWVhcj48
-UmVjTnVtPjI8L1JlY051bT48RGlzcGxheVRleHQ+WzUsIDZdPC9EaXNwbGF5VGV4dD48cmVjb3Jk
-PjxyZWMtbnVtYmVyPjI8L3JlYy1udW1iZXI+PGZvcmVpZ24ta2V5cz48a2V5IGFwcD0iRU4iIGRi
-LWlkPSJ3d3Jmenp0YWwwOXdkc2VldnA5NWY5eHF3ZWR6MjVydHR0czkiIHRpbWVzdGFtcD0iMTc3
-OTgyNzU1NCI+Mjwva2V5PjwvZm9yZWlnbi1rZXlzPjxyZWYtdHlwZSBuYW1lPSJKb3VybmFsIEFy
-dGljbGUiPjE3PC9yZWYtdHlwZT48Y29udHJpYnV0b3JzPjxhdXRob3JzPjxhdXRob3I+RWxldmVs
-ZCwgRC4gSi48L2F1dGhvcj48YXV0aG9yPlByb29zdCwgSi4gSC48L2F1dGhvcj48YXV0aG9yPkNv
-cnTDrW5leiwgTC4gSS48L2F1dGhvcj48YXV0aG9yPkFic2Fsb20sIEEuIFIuPC9hdXRob3I+PGF1
-dGhvcj5TdHJ1eXMsIE0uIE0uPC9hdXRob3I+PC9hdXRob3JzPjwvY29udHJpYnV0b3JzPjxhdXRo
-LWFkZHJlc3M+RnJvbSB0aGUgKkRlcGFydG1lbnQgb2YgQW5lc3RoZXNpb2xvZ3ksIFVuaXZlcnNp
-dHkgTWVkaWNhbCBDZW50ZXIgR3JvbmluZ2VuLCBVbml2ZXJzaXR5IG9mIEdyb25pbmdlbiwgVGhl
-IE5ldGhlcmxhbmRzOyDigKBEZXBhcnRtZW50byBkZSBBbmVzdGVzaW9sb2fDrWEsIEVzY3VlbGEg
-ZGUgTWVkaWNpbmEsIFBvbnRpZmljaWEgVW5pdmVyc2lkYWQgQ2F0w7NsaWNhIGRlIENoaWxlLCBT
-YW50aWFnbywgQ2hpbGU7IGFuZCDigKFEZXBhcnRtZW50IG9mIEFuZXN0aGVzaWEsIEdoZW50IFVu
-aXZlcnNpdHksIEdlbnQsIEJlbGdpdW0uPC9hdXRoLWFkZHJlc3M+PHRpdGxlcz48dGl0bGU+QSBn
-ZW5lcmFsIHB1cnBvc2UgcGhhcm1hY29raW5ldGljIG1vZGVsIGZvciBwcm9wb2ZvbDwvdGl0bGU+
-PHNlY29uZGFyeS10aXRsZT5BbmVzdGggQW5hbGc8L3NlY29uZGFyeS10aXRsZT48L3RpdGxlcz48
-cGVyaW9kaWNhbD48ZnVsbC10aXRsZT5BbmVzdGggQW5hbGc8L2Z1bGwtdGl0bGU+PC9wZXJpb2Rp
-Y2FsPjxwYWdlcz4xMjIxLTM3PC9wYWdlcz48dm9sdW1lPjExODwvdm9sdW1lPjxudW1iZXI+Njwv
-bnVtYmVyPjxrZXl3b3Jkcz48a2V5d29yZD5BZG9sZXNjZW50PC9rZXl3b3JkPjxrZXl3b3JkPkFk
-dWx0PC9rZXl3b3JkPjxrZXl3b3JkPkFnZSBGYWN0b3JzPC9rZXl3b3JkPjxrZXl3b3JkPkFnZWQ8
-L2tleXdvcmQ+PGtleXdvcmQ+QWdlZCwgODAgYW5kIG92ZXI8L2tleXdvcmQ+PGtleXdvcmQ+QWdp
-bmcvbWV0YWJvbGlzbTwva2V5d29yZD48a2V5d29yZD5BbGdvcml0aG1zPC9rZXl3b3JkPjxrZXl3
-b3JkPkFuZXN0aGVzaWEsIEludHJhdmVub3VzPC9rZXl3b3JkPjxrZXl3b3JkPkFuZXN0aGV0aWNz
-LCBJbnRyYXZlbm91cy8qcGhhcm1hY29raW5ldGljczwva2V5d29yZD48a2V5d29yZD5DaGlsZDwv
-a2V5d29yZD48a2V5d29yZD5DaGlsZCwgUHJlc2Nob29sPC9rZXl3b3JkPjxrZXl3b3JkPkRhdGFi
-YXNlcywgRmFjdHVhbDwva2V5d29yZD48a2V5d29yZD5GZW1hbGU8L2tleXdvcmQ+PGtleXdvcmQ+
-SHVtYW5zPC9rZXl3b3JkPjxrZXl3b3JkPkluZmFudDwva2V5d29yZD48a2V5d29yZD5JbnRyYW9w
-ZXJhdGl2ZSBQZXJpb2Q8L2tleXdvcmQ+PGtleXdvcmQ+TWFsZTwva2V5d29yZD48a2V5d29yZD5N
-aWRkbGUgQWdlZDwva2V5d29yZD48a2V5d29yZD5Nb2RlbHMsIFN0YXRpc3RpY2FsPC9rZXl3b3Jk
-PjxrZXl3b3JkPk9iZXNpdHkvbWV0YWJvbGlzbTwva2V5d29yZD48a2V5d29yZD5QcmVkaWN0aXZl
-IFZhbHVlIG9mIFRlc3RzPC9rZXl3b3JkPjxrZXl3b3JkPlByb3BvZm9sLypwaGFybWFjb2tpbmV0
-aWNzPC9rZXl3b3JkPjxrZXl3b3JkPlNleCBDaGFyYWN0ZXJpc3RpY3M8L2tleXdvcmQ+PGtleXdv
-cmQ+WW91bmcgQWR1bHQ8L2tleXdvcmQ+PC9rZXl3b3Jkcz48ZGF0ZXM+PHllYXI+MjAxNDwveWVh
-cj48cHViLWRhdGVzPjxkYXRlPkp1bjwvZGF0ZT48L3B1Yi1kYXRlcz48L2RhdGVzPjxpc2JuPjAw
-MDMtMjk5OTwvaXNibj48YWNjZXNzaW9uLW51bT4yNDcyMjI1ODwvYWNjZXNzaW9uLW51bT48dXJs
-cz48L3VybHM+PGVsZWN0cm9uaWMtcmVzb3VyY2UtbnVtPjEwLjEyMTMvYW5lLjAwMDAwMDAwMDAw
-MDAxNjU8L2VsZWN0cm9uaWMtcmVzb3VyY2UtbnVtPjxyZW1vdGUtZGF0YWJhc2UtcHJvdmlkZXI+
-TkxNPC9yZW1vdGUtZGF0YWJhc2UtcHJvdmlkZXI+PGxhbmd1YWdlPmVuZzwvbGFuZ3VhZ2U+PC9y
-ZWNvcmQ+PC9DaXRlPjxDaXRlPjxBdXRob3I+RWxldmVsZDwvQXV0aG9yPjxZZWFyPjIwMTg8L1ll
-YXI+PFJlY051bT4xPC9SZWNOdW0+PHJlY29yZD48cmVjLW51bWJlcj4xPC9yZWMtbnVtYmVyPjxm
-b3JlaWduLWtleXM+PGtleSBhcHA9IkVOIiBkYi1pZD0id3dyZnp6dGFsMDl3ZHNlZXZwOTVmOXhx
-d2VkejI1cnR0dHM5IiB0aW1lc3RhbXA9IjE3Nzk4Mjc0MTQiPjE8L2tleT48L2ZvcmVpZ24ta2V5
-cz48cmVmLXR5cGUgbmFtZT0iSm91cm5hbCBBcnRpY2xlIj4xNzwvcmVmLXR5cGU+PGNvbnRyaWJ1
-dG9ycz48YXV0aG9ycz48YXV0aG9yPkVsZXZlbGQsIEQuIEouPC9hdXRob3I+PGF1dGhvcj5Db2xp
-biwgUC48L2F1dGhvcj48YXV0aG9yPkFic2Fsb20sIEEuIFIuPC9hdXRob3I+PGF1dGhvcj5TdHJ1
-eXMsIE1tcmY8L2F1dGhvcj48L2F1dGhvcnM+PC9jb250cmlidXRvcnM+PGF1dGgtYWRkcmVzcz5E
-ZXBhcnRtZW50IG9mIEFuZXN0aGVzaW9sb2d5LCBVbml2ZXJzaXR5IE1lZGljYWwgQ2VudGVyIEdy
-b25pbmdlbiwgR3JvbmluZ2VuLCBUaGUgTmV0aGVybGFuZHMuIEVsZWN0cm9uaWMgYWRkcmVzczog
-ZC5qLmVsZXZlbGRAdW1jZy5ubC4mI3hEO0RlcGFydG1lbnQgb2YgQW5lc3RoZXNpb2xvZ3ksIFVu
-aXZlcnNpdHkgTWVkaWNhbCBDZW50ZXIgR3JvbmluZ2VuLCBHcm9uaW5nZW4sIFRoZSBOZXRoZXJs
-YW5kczsgRGVwYXJ0bWVudCBvZiBCaW9hbmFseXNpcywgRmFjdWx0eSBvZiBQaGFybWFjZXV0aWNh
-bCBTY2llbmNlcywgR2hlbnQgVW5pdmVyc2l0eSwgR2hlbnQsIEJlbGdpdW0uJiN4RDtEZXBhcnRt
-ZW50IG9mIEFuZXN0aGVzaW9sb2d5LCBVbml2ZXJzaXR5IE1lZGljYWwgQ2VudGVyIEdyb25pbmdl
-biwgR3JvbmluZ2VuLCBUaGUgTmV0aGVybGFuZHMuJiN4RDtEZXBhcnRtZW50IG9mIEFuZXN0aGVz
-aW9sb2d5LCBVbml2ZXJzaXR5IE1lZGljYWwgQ2VudGVyIEdyb25pbmdlbiwgR3JvbmluZ2VuLCBU
-aGUgTmV0aGVybGFuZHM7IERlcGFydG1lbnQgb2YgQW5lc3RoZXNpYSBhbmQgUGVyaS1vcGVyYXRp
-dmUgTWVkaWNpbmUsIEdoZW50IFVuaXZlcnNpdHksIEdoZW50LCBCZWxnaXVtLjwvYXV0aC1hZGRy
-ZXNzPjx0aXRsZXM+PHRpdGxlPlBoYXJtYWNva2luZXRpYy1waGFybWFjb2R5bmFtaWMgbW9kZWwg
-Zm9yIHByb3BvZm9sIGZvciBicm9hZCBhcHBsaWNhdGlvbiBpbiBhbmFlc3RoZXNpYSBhbmQgc2Vk
-YXRpb248L3RpdGxlPjxzZWNvbmRhcnktdGl0bGU+QnIgSiBBbmFlc3RoPC9zZWNvbmRhcnktdGl0
-bGU+PC90aXRsZXM+PHBlcmlvZGljYWw+PGZ1bGwtdGl0bGU+QnIgSiBBbmFlc3RoPC9mdWxsLXRp
-dGxlPjwvcGVyaW9kaWNhbD48cGFnZXM+OTQyLTk1OTwvcGFnZXM+PHZvbHVtZT4xMjA8L3ZvbHVt
-ZT48bnVtYmVyPjU8L251bWJlcj48ZWRpdGlvbj4yMDE4MDMxMjwvZWRpdGlvbj48a2V5d29yZHM+
-PGtleXdvcmQ+QWRvbGVzY2VudDwva2V5d29yZD48a2V5d29yZD5BZHVsdDwva2V5d29yZD48a2V5
-d29yZD5BZ2VkPC9rZXl3b3JkPjxrZXl3b3JkPkFnZWQsIDgwIGFuZCBvdmVyPC9rZXl3b3JkPjxr
-ZXl3b3JkPkFuZXN0aGVzaWEvKm1ldGhvZHM8L2tleXdvcmQ+PGtleXdvcmQ+QW5lc3RoZXRpY3Ms
-IEludHJhdmVub3VzL2FkbWluaXN0cmF0aW9uICZhbXA7IGRvc2FnZS9waGFybWFjb2tpbmV0aWNz
-LypwaGFybWFjb2xvZ3k8L2tleXdvcmQ+PGtleXdvcmQ+Q2hpbGQ8L2tleXdvcmQ+PGtleXdvcmQ+
-Q2hpbGQsIFByZXNjaG9vbDwva2V5d29yZD48a2V5d29yZD5GZW1hbGU8L2tleXdvcmQ+PGtleXdv
-cmQ+SHVtYW5zPC9rZXl3b3JkPjxrZXl3b3JkPkluZmFudDwva2V5d29yZD48a2V5d29yZD5JbmZ1
-c2lvbnMsIEludHJhdmVub3VzPC9rZXl3b3JkPjxrZXl3b3JkPk1hbGU8L2tleXdvcmQ+PGtleXdv
-cmQ+TWlkZGxlIEFnZWQ8L2tleXdvcmQ+PGtleXdvcmQ+Kk1vZGVscywgQmlvbG9naWNhbDwva2V5
-d29yZD48a2V5d29yZD5Qcm9wb2ZvbC9hZG1pbmlzdHJhdGlvbiAmYW1wOyBkb3NhZ2UvcGhhcm1h
-Y29raW5ldGljcy8qcGhhcm1hY29sb2d5PC9rZXl3b3JkPjxrZXl3b3JkPllvdW5nIEFkdWx0PC9r
-ZXl3b3JkPjxrZXl3b3JkPnBoYXJtYWNva2luZXRpY3M8L2tleXdvcmQ+PGtleXdvcmQ+cGhhcm1h
-Y29sb2d5PC9rZXl3b3JkPjxrZXl3b3JkPnByb3BvZm9sPC9rZXl3b3JkPjwva2V5d29yZHM+PGRh
-dGVzPjx5ZWFyPjIwMTg8L3llYXI+PHB1Yi1kYXRlcz48ZGF0ZT5NYXk8L2RhdGU+PC9wdWItZGF0
-ZXM+PC9kYXRlcz48aXNibj4wMDA3LTA5MTI8L2lzYm4+PGFjY2Vzc2lvbi1udW0+Mjk2NjE0MTI8
-L2FjY2Vzc2lvbi1udW0+PHVybHM+PC91cmxzPjxlbGVjdHJvbmljLXJlc291cmNlLW51bT4xMC4x
-MDE2L2ouYmphLjIwMTguMDEuMDE4PC9lbGVjdHJvbmljLXJlc291cmNlLW51bT48cmVtb3RlLWRh
-dGFiYXNlLXByb3ZpZGVyPk5MTTwvcmVtb3RlLWRhdGFiYXNlLXByb3ZpZGVyPjxsYW5ndWFnZT5l
-bmc8L2xhbmd1YWdlPjwvcmVjb3JkPjwvQ2l0ZT48L0VuZE5vdGU+AG==
-</w:fldData>
-        </w:fldChar>
-      </w:r>
-      <w:r>
-        <w:rPr>
-          <w:rFonts w:ascii="Times New Roman" w:hAnsi="Times New Roman"/>
-          <w:bCs/>
-          <w:sz w:val="24"/>
-          <w:szCs w:val="24"/>
-          <w:lang w:val="tr-TR"/>
-        </w:rPr>
-        <w:instrText xml:space="preserve"> ADDIN EN.CITE.DATA </w:instrText>
-      </w:r>
-      <w:r>
-        <w:rPr>
-          <w:rFonts w:ascii="Times New Roman" w:hAnsi="Times New Roman"/>
-          <w:bCs/>
-          <w:sz w:val="24"/>
-          <w:szCs w:val="24"/>
-          <w:lang w:val="tr-TR"/>
-        </w:rPr>
-      </w:r>
-      <w:r>
-        <w:rPr>
-          <w:rFonts w:ascii="Times New Roman" w:hAnsi="Times New Roman"/>
-          <w:bCs/>
-          <w:sz w:val="24"/>
-          <w:szCs w:val="24"/>
-          <w:lang w:val="tr-TR"/>
-        </w:rPr>
-        <w:fldChar w:fldCharType="end"/>
-      </w:r>
-      <w:r>
-        <w:rPr>
-          <w:rFonts w:ascii="Times New Roman" w:hAnsi="Times New Roman"/>
-          <w:bCs/>
-          <w:sz w:val="24"/>
-          <w:szCs w:val="24"/>
-          <w:lang w:val="tr-TR"/>
-        </w:rPr>
-      </w:r>
-      <w:r>
-        <w:rPr>
-          <w:rFonts w:ascii="Times New Roman" w:hAnsi="Times New Roman"/>
-          <w:bCs/>
-          <w:sz w:val="24"/>
-          <w:szCs w:val="24"/>
-          <w:lang w:val="tr-TR"/>
-        </w:rPr>
-        <w:fldChar w:fldCharType="separate"/>
+        <w:t>[5, 6]</w:t>
+      </w:r>
+      <w:r>
+        <w:rPr>
+          <w:rFonts w:ascii="Times New Roman" w:hAnsi="Times New Roman"/>
+          <w:bCs/>
+          <w:sz w:val="24"/>
+          <w:szCs w:val="24"/>
+          <w:lang w:val="tr-TR"/>
+        </w:rPr>
+        <w:t xml:space="preserve">. Developed using vast, heterogeneous datasets, the Eleveld model provides a unified, all-age, and all-weight dosing matrix that accounts for complex body composition metrics, thereby delivering unprecedented accuracy in maintaining predicted effect-site concentrations. When coupled with quantitative depth-of-anesthesia tracking (e.g., Bispectral Index or Narcotrend monitoring) </w:t>
       </w:r>
       <w:r>
         <w:rPr>
@@ -2000,57 +1236,56 @@
           <w:szCs w:val="24"/>
           <w:lang w:val="tr-TR"/>
         </w:rPr>
-        <w:t>[5, 6]</w:t>
-      </w:r>
-      <w:r>
-        <w:rPr>
-          <w:rFonts w:ascii="Times New Roman" w:hAnsi="Times New Roman"/>
-          <w:bCs/>
-          <w:sz w:val="24"/>
-          <w:szCs w:val="24"/>
-          <w:lang w:val="tr-TR"/>
-        </w:rPr>
-        <w:fldChar w:fldCharType="end"/>
-      </w:r>
-      <w:r>
-        <w:rPr>
-          <w:rFonts w:ascii="Times New Roman" w:hAnsi="Times New Roman"/>
-          <w:bCs/>
-          <w:sz w:val="24"/>
-          <w:szCs w:val="24"/>
-          <w:lang w:val="tr-TR"/>
-        </w:rPr>
-        <w:t xml:space="preserve">. Developed using vast, heterogeneous datasets, the Eleveld model provides a unified, all-age, and all-weight dosing matrix that accounts for complex body composition metrics, thereby delivering unprecedented accuracy in maintaining predicted effect-site concentrations. When coupled with quantitative depth-of-anesthesia tracking (e.g., Bispectral Index or Narcotrend monitoring) </w:t>
-      </w:r>
-      <w:r>
-        <w:rPr>
-          <w:rFonts w:ascii="Times New Roman" w:hAnsi="Times New Roman"/>
-          <w:bCs/>
-          <w:sz w:val="24"/>
-          <w:szCs w:val="24"/>
-          <w:lang w:val="tr-TR"/>
-        </w:rPr>
-        <w:fldChar w:fldCharType="begin"/>
-      </w:r>
-      <w:r>
-        <w:rPr>
-          <w:rFonts w:ascii="Times New Roman" w:hAnsi="Times New Roman"/>
-          <w:bCs/>
-          <w:sz w:val="24"/>
-          <w:szCs w:val="24"/>
-          <w:lang w:val="tr-TR"/>
-        </w:rPr>
-        <w:instrText xml:space="preserve"> ADDIN EN.CITE &lt;EndNote&gt;&lt;Cite&gt;&lt;Author&gt;Kwon&lt;/Author&gt;&lt;Year&gt;2009&lt;/Year&gt;&lt;RecNum&gt;5&lt;/RecNum&gt;&lt;DisplayText&gt;[7]&lt;/DisplayText&gt;&lt;record&gt;&lt;rec-number&gt;5&lt;/rec-number&gt;&lt;foreign-keys&gt;&lt;key app="EN" db-id="wwrfzztal09wdseevp95f9xqwedz25rttts9" timestamp="1779827691"&gt;5&lt;/key&gt;&lt;/foreign-keys&gt;&lt;ref-type name="Journal Article"&gt;17&lt;/ref-type&gt;&lt;contributors&gt;&lt;authors&gt;&lt;author&gt;Kwon, S. A.&lt;/author&gt;&lt;author&gt;Kim, E. S.&lt;/author&gt;&lt;author&gt;Park, S. C.&lt;/author&gt;&lt;author&gt;Kim, H. J.&lt;/author&gt;&lt;author&gt;Kwon, J. Y.&lt;/author&gt;&lt;author&gt;Baek, S. H.&lt;/author&gt;&lt;/authors&gt;&lt;/contributors&gt;&lt;auth-address&gt;Department of Anesthesia and Pain Medicine, School of Medicine, Pusan National University, Busan, Korea. anebsh@pusan.ac.kr.&lt;/auth-address&gt;&lt;titles&gt;&lt;title&gt;Intraoperative awareness during sevoflurane-remifentanil anesthesia for minimal invasive mitral valvuloplasty: A case report&lt;/title&gt;&lt;secondary-title&gt;Korean J Anesthesiol&lt;/secondary-title&gt;&lt;/titles&gt;&lt;periodical&gt;&lt;full-title&gt;Korean J Anesthesiol&lt;/full-title&gt;&lt;/periodical&gt;&lt;pages&gt;100-103&lt;/pages&gt;&lt;volume&gt;57&lt;/volume&gt;&lt;number&gt;1&lt;/number&gt;&lt;keywords&gt;&lt;keyword&gt;Anesthesia&lt;/keyword&gt;&lt;keyword&gt;Awareness&lt;/keyword&gt;&lt;keyword&gt;Remifentanil&lt;/keyword&gt;&lt;keyword&gt;Sevoflurane&lt;/keyword&gt;&lt;/keywords&gt;&lt;dates&gt;&lt;year&gt;2009&lt;/year&gt;&lt;pub-dates&gt;&lt;date&gt;Jul&lt;/date&gt;&lt;/pub-dates&gt;&lt;/dates&gt;&lt;isbn&gt;2005-6419&lt;/isbn&gt;&lt;accession-num&gt;30625838&lt;/accession-num&gt;&lt;urls&gt;&lt;/urls&gt;&lt;electronic-resource-num&gt;10.4097/kjae.2009.57.1.100&lt;/electronic-resource-num&gt;&lt;remote-database-provider&gt;NLM&lt;/remote-database-provider&gt;&lt;language&gt;eng&lt;/language&gt;&lt;/record&gt;&lt;/Cite&gt;&lt;/EndNote&gt;</w:instrText>
-      </w:r>
-      <w:r>
-        <w:rPr>
-          <w:rFonts w:ascii="Times New Roman" w:hAnsi="Times New Roman"/>
-          <w:bCs/>
-          <w:sz w:val="24"/>
-          <w:szCs w:val="24"/>
-          <w:lang w:val="tr-TR"/>
-        </w:rPr>
-        <w:fldChar w:fldCharType="separate"/>
+        <w:t>[7]</w:t>
+      </w:r>
+      <w:r>
+        <w:rPr>
+          <w:rFonts w:ascii="Times New Roman" w:hAnsi="Times New Roman"/>
+          <w:bCs/>
+          <w:sz w:val="24"/>
+          <w:szCs w:val="24"/>
+          <w:lang w:val="tr-TR"/>
+        </w:rPr>
+        <w:t>, Eleveld model-driven TCI is theorized to provide superior stabilization of pharmacodynamic expressions, reducing advanced hemodynamic variability metrics—such as variability independent of the mean (VIM), average real variability (ARV), and the cumulative hypotension burden defined by the area under the curve (AUC) for MAP below 65 mmHg.</w:t>
+      </w:r>
+    </w:p>
+    <w:p>
+      <w:pPr>
+        <w:spacing w:line="360" w:lineRule="auto"/>
+        <w:jc w:val="both"/>
+        <w:rPr>
+          <w:rFonts w:ascii="Times New Roman" w:hAnsi="Times New Roman"/>
+          <w:b/>
+          <w:bCs/>
+          <w:sz w:val="24"/>
+          <w:szCs w:val="24"/>
+          <w:lang w:val="tr-TR"/>
+        </w:rPr>
+      </w:pPr>
+      <w:r>
+        <w:rPr>
+          <w:rFonts w:ascii="Times New Roman" w:hAnsi="Times New Roman"/>
+          <w:bCs/>
+          <w:sz w:val="24"/>
+          <w:szCs w:val="24"/>
+        </w:rPr>
+        <w:t xml:space="preserve">Minimizing this hypoperfusion burden is vital, as intraoperative hypotension and high blood pressure variability are established risk factors for postoperative organ dysfunction and prolonged intensive care exposure. Alongside hemodynamic optimization, achieving early respiratory independence is a core component of MICS fast-track pathways. Recent data indicates that achieving successful operating room or early intensive care extubation is highly feasible when intraoperative opioid exposure and anesthetic recovery are meticulously managed </w:t>
+      </w:r>
+      <w:r>
+        <w:rPr>
+          <w:rFonts w:ascii="Times New Roman" w:hAnsi="Times New Roman"/>
+          <w:bCs/>
+          <w:sz w:val="24"/>
+          <w:szCs w:val="24"/>
+        </w:rPr>
+      </w:r>
+      <w:r>
+        <w:rPr>
+          <w:rFonts w:ascii="Times New Roman" w:hAnsi="Times New Roman"/>
+          <w:bCs/>
+          <w:sz w:val="24"/>
+          <w:szCs w:val="24"/>
+        </w:rPr>
       </w:r>
       <w:r>
         <w:rPr>
@@ -2059,245 +1294,8 @@
           <w:noProof/>
           <w:sz w:val="24"/>
           <w:szCs w:val="24"/>
-          <w:lang w:val="tr-TR"/>
-        </w:rPr>
-        <w:t>[7]</w:t>
-      </w:r>
-      <w:r>
-        <w:rPr>
-          <w:rFonts w:ascii="Times New Roman" w:hAnsi="Times New Roman"/>
-          <w:bCs/>
-          <w:sz w:val="24"/>
-          <w:szCs w:val="24"/>
-          <w:lang w:val="tr-TR"/>
-        </w:rPr>
-        <w:fldChar w:fldCharType="end"/>
-      </w:r>
-      <w:r>
-        <w:rPr>
-          <w:rFonts w:ascii="Times New Roman" w:hAnsi="Times New Roman"/>
-          <w:bCs/>
-          <w:sz w:val="24"/>
-          <w:szCs w:val="24"/>
-          <w:lang w:val="tr-TR"/>
-        </w:rPr>
-        <w:t>, Eleveld model-driven TCI is theorized to provide superior stabilization of pharmacodynamic expressions, reducing advanced hemodynamic variability metrics—such as variability independent of the mean (VIM), average real variability (ARV), and the cumulative hypotension burden defined by the area under the curve (AUC) for MAP below 65 mmHg.</w:t>
-      </w:r>
-    </w:p>
-    <w:p>
-      <w:pPr>
-        <w:spacing w:line="360" w:lineRule="auto"/>
-        <w:jc w:val="both"/>
-        <w:rPr>
-          <w:rFonts w:ascii="Times New Roman" w:hAnsi="Times New Roman"/>
-          <w:b/>
-          <w:bCs/>
-          <w:sz w:val="24"/>
-          <w:szCs w:val="24"/>
-          <w:lang w:val="tr-TR"/>
-        </w:rPr>
-      </w:pPr>
-      <w:r>
-        <w:rPr>
-          <w:rFonts w:ascii="Times New Roman" w:hAnsi="Times New Roman"/>
-          <w:bCs/>
-          <w:sz w:val="24"/>
-          <w:szCs w:val="24"/>
-        </w:rPr>
-        <w:t xml:space="preserve">Minimizing this hypoperfusion burden is vital, as intraoperative hypotension and high blood pressure variability are established risk factors for postoperative organ dysfunction and prolonged intensive care exposure. Alongside hemodynamic optimization, achieving early respiratory independence is a core component of MICS fast-track pathways. Recent data indicates that achieving successful operating room or early intensive care extubation is highly feasible when intraoperative opioid exposure and anesthetic recovery are meticulously managed </w:t>
-      </w:r>
-      <w:r>
-        <w:rPr>
-          <w:rFonts w:ascii="Times New Roman" w:hAnsi="Times New Roman"/>
-          <w:bCs/>
-          <w:sz w:val="24"/>
-          <w:szCs w:val="24"/>
-        </w:rPr>
-        <w:fldChar w:fldCharType="begin">
-          <w:fldData xml:space="preserve">PEVuZE5vdGU+PENpdGU+PEF1dGhvcj5XYW5nPC9BdXRob3I+PFllYXI+MjAyNDwvWWVhcj48UmVj
-TnVtPjk8L1JlY051bT48RGlzcGxheVRleHQ+WzhdPC9EaXNwbGF5VGV4dD48cmVjb3JkPjxyZWMt
-bnVtYmVyPjk8L3JlYy1udW1iZXI+PGZvcmVpZ24ta2V5cz48a2V5IGFwcD0iRU4iIGRiLWlkPSJ3
-d3Jmenp0YWwwOXdkc2VldnA5NWY5eHF3ZWR6MjVydHR0czkiIHRpbWVzdGFtcD0iMTc3OTgyODU5
-MCI+OTwva2V5PjwvZm9yZWlnbi1rZXlzPjxyZWYtdHlwZSBuYW1lPSJKb3VybmFsIEFydGljbGUi
-PjE3PC9yZWYtdHlwZT48Y29udHJpYnV0b3JzPjxhdXRob3JzPjxhdXRob3I+V2FuZywgQy4gQy48
-L2F1dGhvcj48YXV0aG9yPkRlQm9zZS1TY2FybGV0dCwgQS48L2F1dGhvcj48YXV0aG9yPklybG1l
-aWVyLCBSLjwvYXV0aG9yPjxhdXRob3I+WWUsIEYuPC9hdXRob3I+PGF1dGhvcj5TaWVncmlzdCwg
-Sy48L2F1dGhvcj48YXV0aG9yPlNoYWgsIEEuIFMuPC9hdXRob3I+PGF1dGhvcj5LaW5nZXRlciwg
-TS48L2F1dGhvcj48L2F1dGhvcnM+PC9jb250cmlidXRvcnM+PGF1dGgtYWRkcmVzcz5WYW5kZXJi
-aWx0IFVuaXZlcnNpdHkgU2Nob29sIG9mIE1lZGljaW5lLCBOYXNodmlsbGUsIFROLiBFbGVjdHJv
-bmljIGFkZHJlc3M6IGNoZW4uY2hpYS53YW5nQHZhbmRlcmJpbHQuZWR1LiYjeEQ7VmFuZGVyYmls
-dCBVbml2ZXJzaXR5IE1lZGljYWwgQ2VudGVyLCBEZXBhcnRtZW50IG9mIENhcmRpYWMgU3VyZ2Vy
-eSwgTmFzaHZpbGxlLCBUTi4mI3hEO1ZhbmRlcmJpbHQgVW5pdmVyc2l0eSBNZWRpY2FsIENlbnRl
-ciwgRGVwYXJ0bWVudCBvZiBCaW9zdGF0aXN0aWNzLCBOYXNodmlsbGUsIFROLiYjeEQ7VmFuZGVy
-YmlsdCBVbml2ZXJzaXR5IE1lZGljYWwgQ2VudGVyLCBEZXBhcnRtZW50IG9mIEFuZXN0aGVzaW9s
-b2d5LCBEaXZpc2lvbiBvZiBDYXJkaW90aG9yYWNpYyBBbmVzdGhlc2lvbG9neSwgTmFzaHZpbGxl
-LCBUTi48L2F1dGgtYWRkcmVzcz48dGl0bGVzPjx0aXRsZT5TYWZlIExhbmRpbmc6IEZlYXNpYmls
-aXR5IGFuZCBTYWZldHkgb2YgT3BlcmF0aW5nIFJvb20gRXh0dWJhdGlvbiBpbiBNaW5pbWFsbHkg
-SW52YXNpdmUgQ2FyZGlhYyBWYWx2ZSBTdXJnZXJ5PC90aXRsZT48c2Vjb25kYXJ5LXRpdGxlPkog
-Q2FyZGlvdGhvcmFjIFZhc2MgQW5lc3RoPC9zZWNvbmRhcnktdGl0bGU+PC90aXRsZXM+PHBlcmlv
-ZGljYWw+PGZ1bGwtdGl0bGU+SiBDYXJkaW90aG9yYWMgVmFzYyBBbmVzdGg8L2Z1bGwtdGl0bGU+
-PC9wZXJpb2RpY2FsPjxwYWdlcz4yOTY1LTI5NzI8L3BhZ2VzPjx2b2x1bWU+Mzg8L3ZvbHVtZT48
-bnVtYmVyPjEyPC9udW1iZXI+PGVkaXRpb24+MjAyNDA5MTk8L2VkaXRpb24+PGtleXdvcmRzPjxr
-ZXl3b3JkPkh1bWFuczwva2V5d29yZD48a2V5d29yZD4qQWlyd2F5IEV4dHViYXRpb24vbWV0aG9k
-czwva2V5d29yZD48a2V5d29yZD5NYWxlPC9rZXl3b3JkPjxrZXl3b3JkPkZlbWFsZTwva2V5d29y
-ZD48a2V5d29yZD5SZXRyb3NwZWN0aXZlIFN0dWRpZXM8L2tleXdvcmQ+PGtleXdvcmQ+Kk9wZXJh
-dGluZyBSb29tczwva2V5d29yZD48a2V5d29yZD5NaWRkbGUgQWdlZDwva2V5d29yZD48a2V5d29y
-ZD4qTWluaW1hbGx5IEludmFzaXZlIFN1cmdpY2FsIFByb2NlZHVyZXMvbWV0aG9kcy9hZHZlcnNl
-IGVmZmVjdHM8L2tleXdvcmQ+PGtleXdvcmQ+KkZlYXNpYmlsaXR5IFN0dWRpZXM8L2tleXdvcmQ+
-PGtleXdvcmQ+QWdlZDwva2V5d29yZD48a2V5d29yZD5DYXJkaWFjIFN1cmdpY2FsIFByb2NlZHVy
-ZXMvbWV0aG9kcy9hZHZlcnNlIGVmZmVjdHM8L2tleXdvcmQ+PGtleXdvcmQ+UG9zdG9wZXJhdGl2
-ZSBDb21wbGljYXRpb25zL2VwaWRlbWlvbG9neS9wcmV2ZW50aW9uICZhbXA7IGNvbnRyb2wvZXRp
-b2xvZ3k8L2tleXdvcmQ+PGtleXdvcmQ+UGF0aWVudCBTYWZldHk8L2tleXdvcmQ+PGtleXdvcmQ+
-SGVhcnQgVmFsdmVzL3N1cmdlcnk8L2tleXdvcmQ+PGtleXdvcmQ+aW50dWJhdGlvbiBkdXJhdGlv
-bjwva2V5d29yZD48a2V5d29yZD5taW5pbWFsbHkgaW52YXNpdmUgY2FyZGlhYyBzdXJnZXJ5PC9r
-ZXl3b3JkPjxrZXl3b3JkPm9wZXJhdGluZyByb29tIGV4dHViYXRpb248L2tleXdvcmQ+PGtleXdv
-cmQ+cG9zdG9wZXJhdGl2ZSBkZWxpcml1bTwva2V5d29yZD48a2V5d29yZD5yZWludHViYXRpb24g
-cmF0ZXM8L2tleXdvcmQ+PGtleXdvcmQ+c3VjY2Vzc2Z1bCBvcGVyYXRpbmcgcm9vbSBleHR1YmF0
-aW9uPC9rZXl3b3JkPjwva2V5d29yZHM+PGRhdGVzPjx5ZWFyPjIwMjQ8L3llYXI+PHB1Yi1kYXRl
-cz48ZGF0ZT5EZWM8L2RhdGU+PC9wdWItZGF0ZXM+PC9kYXRlcz48aXNibj4xMDUzLTA3NzA8L2lz
-Ym4+PGFjY2Vzc2lvbi1udW0+MzkzNzAzMTA8L2FjY2Vzc2lvbi1udW0+PHVybHM+PC91cmxzPjxj
-dXN0b20xPkRlY2xhcmF0aW9uIG9mIGNvbXBldGluZyBpbnRlcmVzdCBUaGUgYXV0aG9ycyBkZWNs
-YXJlIHRoYXQgdGhleSBoYXZlIG5vIGtub3duIGNvbXBldGluZyBmaW5hbmNpYWwgaW50ZXJlc3Rz
-IG9yIHBlcnNvbmFsIHJlbGF0aW9uc2hpcHMgdGhhdCBjb3VsZCBoYXZlIGFwcGVhcmVkIHRvIGlu
-Zmx1ZW5jZSB0aGUgd29yayByZXBvcnRlZCBpbiB0aGlzIHBhcGVyLjwvY3VzdG9tMT48ZWxlY3Ry
-b25pYy1yZXNvdXJjZS1udW0+MTAuMTA1My9qLmp2Y2EuMjAyNC4wOS4wMTQ8L2VsZWN0cm9uaWMt
-cmVzb3VyY2UtbnVtPjxyZW1vdGUtZGF0YWJhc2UtcHJvdmlkZXI+TkxNPC9yZW1vdGUtZGF0YWJh
-c2UtcHJvdmlkZXI+PGxhbmd1YWdlPmVuZzwvbGFuZ3VhZ2U+PC9yZWNvcmQ+PC9DaXRlPjwvRW5k
-Tm90ZT5=
-</w:fldData>
-        </w:fldChar>
-      </w:r>
-      <w:r>
-        <w:rPr>
-          <w:rFonts w:ascii="Times New Roman" w:hAnsi="Times New Roman"/>
-          <w:bCs/>
-          <w:sz w:val="24"/>
-          <w:szCs w:val="24"/>
-        </w:rPr>
-        <w:instrText xml:space="preserve"> ADDIN EN.CITE </w:instrText>
-      </w:r>
-      <w:r>
-        <w:rPr>
-          <w:rFonts w:ascii="Times New Roman" w:hAnsi="Times New Roman"/>
-          <w:bCs/>
-          <w:sz w:val="24"/>
-          <w:szCs w:val="24"/>
-        </w:rPr>
-        <w:fldChar w:fldCharType="begin">
-          <w:fldData xml:space="preserve">PEVuZE5vdGU+PENpdGU+PEF1dGhvcj5XYW5nPC9BdXRob3I+PFllYXI+MjAyNDwvWWVhcj48UmVj
-TnVtPjk8L1JlY051bT48RGlzcGxheVRleHQ+WzhdPC9EaXNwbGF5VGV4dD48cmVjb3JkPjxyZWMt
-bnVtYmVyPjk8L3JlYy1udW1iZXI+PGZvcmVpZ24ta2V5cz48a2V5IGFwcD0iRU4iIGRiLWlkPSJ3
-d3Jmenp0YWwwOXdkc2VldnA5NWY5eHF3ZWR6MjVydHR0czkiIHRpbWVzdGFtcD0iMTc3OTgyODU5
-MCI+OTwva2V5PjwvZm9yZWlnbi1rZXlzPjxyZWYtdHlwZSBuYW1lPSJKb3VybmFsIEFydGljbGUi
-PjE3PC9yZWYtdHlwZT48Y29udHJpYnV0b3JzPjxhdXRob3JzPjxhdXRob3I+V2FuZywgQy4gQy48
-L2F1dGhvcj48YXV0aG9yPkRlQm9zZS1TY2FybGV0dCwgQS48L2F1dGhvcj48YXV0aG9yPklybG1l
-aWVyLCBSLjwvYXV0aG9yPjxhdXRob3I+WWUsIEYuPC9hdXRob3I+PGF1dGhvcj5TaWVncmlzdCwg
-Sy48L2F1dGhvcj48YXV0aG9yPlNoYWgsIEEuIFMuPC9hdXRob3I+PGF1dGhvcj5LaW5nZXRlciwg
-TS48L2F1dGhvcj48L2F1dGhvcnM+PC9jb250cmlidXRvcnM+PGF1dGgtYWRkcmVzcz5WYW5kZXJi
-aWx0IFVuaXZlcnNpdHkgU2Nob29sIG9mIE1lZGljaW5lLCBOYXNodmlsbGUsIFROLiBFbGVjdHJv
-bmljIGFkZHJlc3M6IGNoZW4uY2hpYS53YW5nQHZhbmRlcmJpbHQuZWR1LiYjeEQ7VmFuZGVyYmls
-dCBVbml2ZXJzaXR5IE1lZGljYWwgQ2VudGVyLCBEZXBhcnRtZW50IG9mIENhcmRpYWMgU3VyZ2Vy
-eSwgTmFzaHZpbGxlLCBUTi4mI3hEO1ZhbmRlcmJpbHQgVW5pdmVyc2l0eSBNZWRpY2FsIENlbnRl
-ciwgRGVwYXJ0bWVudCBvZiBCaW9zdGF0aXN0aWNzLCBOYXNodmlsbGUsIFROLiYjeEQ7VmFuZGVy
-YmlsdCBVbml2ZXJzaXR5IE1lZGljYWwgQ2VudGVyLCBEZXBhcnRtZW50IG9mIEFuZXN0aGVzaW9s
-b2d5LCBEaXZpc2lvbiBvZiBDYXJkaW90aG9yYWNpYyBBbmVzdGhlc2lvbG9neSwgTmFzaHZpbGxl
-LCBUTi48L2F1dGgtYWRkcmVzcz48dGl0bGVzPjx0aXRsZT5TYWZlIExhbmRpbmc6IEZlYXNpYmls
-aXR5IGFuZCBTYWZldHkgb2YgT3BlcmF0aW5nIFJvb20gRXh0dWJhdGlvbiBpbiBNaW5pbWFsbHkg
-SW52YXNpdmUgQ2FyZGlhYyBWYWx2ZSBTdXJnZXJ5PC90aXRsZT48c2Vjb25kYXJ5LXRpdGxlPkog
-Q2FyZGlvdGhvcmFjIFZhc2MgQW5lc3RoPC9zZWNvbmRhcnktdGl0bGU+PC90aXRsZXM+PHBlcmlv
-ZGljYWw+PGZ1bGwtdGl0bGU+SiBDYXJkaW90aG9yYWMgVmFzYyBBbmVzdGg8L2Z1bGwtdGl0bGU+
-PC9wZXJpb2RpY2FsPjxwYWdlcz4yOTY1LTI5NzI8L3BhZ2VzPjx2b2x1bWU+Mzg8L3ZvbHVtZT48
-bnVtYmVyPjEyPC9udW1iZXI+PGVkaXRpb24+MjAyNDA5MTk8L2VkaXRpb24+PGtleXdvcmRzPjxr
-ZXl3b3JkPkh1bWFuczwva2V5d29yZD48a2V5d29yZD4qQWlyd2F5IEV4dHViYXRpb24vbWV0aG9k
-czwva2V5d29yZD48a2V5d29yZD5NYWxlPC9rZXl3b3JkPjxrZXl3b3JkPkZlbWFsZTwva2V5d29y
-ZD48a2V5d29yZD5SZXRyb3NwZWN0aXZlIFN0dWRpZXM8L2tleXdvcmQ+PGtleXdvcmQ+Kk9wZXJh
-dGluZyBSb29tczwva2V5d29yZD48a2V5d29yZD5NaWRkbGUgQWdlZDwva2V5d29yZD48a2V5d29y
-ZD4qTWluaW1hbGx5IEludmFzaXZlIFN1cmdpY2FsIFByb2NlZHVyZXMvbWV0aG9kcy9hZHZlcnNl
-IGVmZmVjdHM8L2tleXdvcmQ+PGtleXdvcmQ+KkZlYXNpYmlsaXR5IFN0dWRpZXM8L2tleXdvcmQ+
-PGtleXdvcmQ+QWdlZDwva2V5d29yZD48a2V5d29yZD5DYXJkaWFjIFN1cmdpY2FsIFByb2NlZHVy
-ZXMvbWV0aG9kcy9hZHZlcnNlIGVmZmVjdHM8L2tleXdvcmQ+PGtleXdvcmQ+UG9zdG9wZXJhdGl2
-ZSBDb21wbGljYXRpb25zL2VwaWRlbWlvbG9neS9wcmV2ZW50aW9uICZhbXA7IGNvbnRyb2wvZXRp
-b2xvZ3k8L2tleXdvcmQ+PGtleXdvcmQ+UGF0aWVudCBTYWZldHk8L2tleXdvcmQ+PGtleXdvcmQ+
-SGVhcnQgVmFsdmVzL3N1cmdlcnk8L2tleXdvcmQ+PGtleXdvcmQ+aW50dWJhdGlvbiBkdXJhdGlv
-bjwva2V5d29yZD48a2V5d29yZD5taW5pbWFsbHkgaW52YXNpdmUgY2FyZGlhYyBzdXJnZXJ5PC9r
-ZXl3b3JkPjxrZXl3b3JkPm9wZXJhdGluZyByb29tIGV4dHViYXRpb248L2tleXdvcmQ+PGtleXdv
-cmQ+cG9zdG9wZXJhdGl2ZSBkZWxpcml1bTwva2V5d29yZD48a2V5d29yZD5yZWludHViYXRpb24g
-cmF0ZXM8L2tleXdvcmQ+PGtleXdvcmQ+c3VjY2Vzc2Z1bCBvcGVyYXRpbmcgcm9vbSBleHR1YmF0
-aW9uPC9rZXl3b3JkPjwva2V5d29yZHM+PGRhdGVzPjx5ZWFyPjIwMjQ8L3llYXI+PHB1Yi1kYXRl
-cz48ZGF0ZT5EZWM8L2RhdGU+PC9wdWItZGF0ZXM+PC9kYXRlcz48aXNibj4xMDUzLTA3NzA8L2lz
-Ym4+PGFjY2Vzc2lvbi1udW0+MzkzNzAzMTA8L2FjY2Vzc2lvbi1udW0+PHVybHM+PC91cmxzPjxj
-dXN0b20xPkRlY2xhcmF0aW9uIG9mIGNvbXBldGluZyBpbnRlcmVzdCBUaGUgYXV0aG9ycyBkZWNs
-YXJlIHRoYXQgdGhleSBoYXZlIG5vIGtub3duIGNvbXBldGluZyBmaW5hbmNpYWwgaW50ZXJlc3Rz
-IG9yIHBlcnNvbmFsIHJlbGF0aW9uc2hpcHMgdGhhdCBjb3VsZCBoYXZlIGFwcGVhcmVkIHRvIGlu
-Zmx1ZW5jZSB0aGUgd29yayByZXBvcnRlZCBpbiB0aGlzIHBhcGVyLjwvY3VzdG9tMT48ZWxlY3Ry
-b25pYy1yZXNvdXJjZS1udW0+MTAuMTA1My9qLmp2Y2EuMjAyNC4wOS4wMTQ8L2VsZWN0cm9uaWMt
-cmVzb3VyY2UtbnVtPjxyZW1vdGUtZGF0YWJhc2UtcHJvdmlkZXI+TkxNPC9yZW1vdGUtZGF0YWJh
-c2UtcHJvdmlkZXI+PGxhbmd1YWdlPmVuZzwvbGFuZ3VhZ2U+PC9yZWNvcmQ+PC9DaXRlPjwvRW5k
-Tm90ZT5=
-</w:fldData>
-        </w:fldChar>
-      </w:r>
-      <w:r>
-        <w:rPr>
-          <w:rFonts w:ascii="Times New Roman" w:hAnsi="Times New Roman"/>
-          <w:bCs/>
-          <w:sz w:val="24"/>
-          <w:szCs w:val="24"/>
-        </w:rPr>
-        <w:instrText xml:space="preserve"> ADDIN EN.CITE.DATA </w:instrText>
-      </w:r>
-      <w:r>
-        <w:rPr>
-          <w:rFonts w:ascii="Times New Roman" w:hAnsi="Times New Roman"/>
-          <w:bCs/>
-          <w:sz w:val="24"/>
-          <w:szCs w:val="24"/>
-        </w:rPr>
-      </w:r>
-      <w:r>
-        <w:rPr>
-          <w:rFonts w:ascii="Times New Roman" w:hAnsi="Times New Roman"/>
-          <w:bCs/>
-          <w:sz w:val="24"/>
-          <w:szCs w:val="24"/>
-        </w:rPr>
-        <w:fldChar w:fldCharType="end"/>
-      </w:r>
-      <w:r>
-        <w:rPr>
-          <w:rFonts w:ascii="Times New Roman" w:hAnsi="Times New Roman"/>
-          <w:bCs/>
-          <w:sz w:val="24"/>
-          <w:szCs w:val="24"/>
-        </w:rPr>
-      </w:r>
-      <w:r>
-        <w:rPr>
-          <w:rFonts w:ascii="Times New Roman" w:hAnsi="Times New Roman"/>
-          <w:bCs/>
-          <w:sz w:val="24"/>
-          <w:szCs w:val="24"/>
-        </w:rPr>
-        <w:fldChar w:fldCharType="separate"/>
-      </w:r>
-      <w:r>
-        <w:rPr>
-          <w:rFonts w:ascii="Times New Roman" w:hAnsi="Times New Roman"/>
-          <w:bCs/>
-          <w:noProof/>
-          <w:sz w:val="24"/>
-          <w:szCs w:val="24"/>
         </w:rPr>
         <w:t>[8]</w:t>
-      </w:r>
-      <w:r>
-        <w:rPr>
-          <w:rFonts w:ascii="Times New Roman" w:hAnsi="Times New Roman"/>
-          <w:bCs/>
-          <w:sz w:val="24"/>
-          <w:szCs w:val="24"/>
-        </w:rPr>
-        <w:fldChar w:fldCharType="end"/>
       </w:r>
       <w:r>
         <w:rPr>
@@ -5277,30 +4275,6 @@
           <w:noProof w:val="0"/>
           <w:sz w:val="24"/>
         </w:rPr>
-        <w:fldChar w:fldCharType="begin"/>
-      </w:r>
-      <w:r>
-        <w:rPr>
-          <w:rFonts w:ascii="Times New Roman" w:eastAsia="Calibri" w:hAnsi="Times New Roman" w:cs="Times New Roman"/>
-          <w:noProof w:val="0"/>
-          <w:sz w:val="24"/>
-        </w:rPr>
-        <w:instrText xml:space="preserve"> ADDIN EN.REFLIST </w:instrText>
-      </w:r>
-      <w:r>
-        <w:rPr>
-          <w:rFonts w:ascii="Times New Roman" w:eastAsia="Calibri" w:hAnsi="Times New Roman" w:cs="Times New Roman"/>
-          <w:noProof w:val="0"/>
-          <w:sz w:val="24"/>
-        </w:rPr>
-        <w:fldChar w:fldCharType="separate"/>
-      </w:r>
-      <w:r>
-        <w:rPr>
-          <w:rFonts w:ascii="Times New Roman" w:eastAsia="Calibri" w:hAnsi="Times New Roman" w:cs="Times New Roman"/>
-          <w:noProof w:val="0"/>
-          <w:sz w:val="24"/>
-        </w:rPr>
         <w:t>1.</w:t>
       </w:r>
       <w:r>
@@ -5900,14 +4874,6 @@
           <w:szCs w:val="24"/>
         </w:rPr>
       </w:pPr>
-      <w:r>
-        <w:rPr>
-          <w:rFonts w:ascii="Times New Roman" w:hAnsi="Times New Roman"/>
-          <w:sz w:val="24"/>
-          <w:szCs w:val="24"/>
-        </w:rPr>
-        <w:fldChar w:fldCharType="end"/>
-      </w:r>
     </w:p>
     <w:sectPr>
       <w:footerReference w:type="even" r:id="rId7"/>

</xml_diff>

<commit_message>
Mark added text in blue
The 15 new Discussion/Limitations paragraphs and references 9-25 are set
in blue so co-authors can see what was added. Original text, headings and
references 1-8 keep their existing formatting.

Co-Authored-By: Claude Opus 5 <noreply@anthropic.com>
Claude-Session: https://claude.ai/code/session_01YWiUnqNkFDjjosdDr84no1
</commit_message>
<xml_diff>
--- a/main document-revised.docx
+++ b/main document-revised.docx
@@ -3689,6 +3689,7 @@
         <w:rPr>
           <w:rFonts w:ascii="Times New Roman" w:hAnsi="Times New Roman"/>
           <w:b w:val="0"/>
+          <w:color w:val="0000FF"/>
           <w:sz w:val="24"/>
         </w:rPr>
         <w:t>In this single-center retrospective cohort of 65 adults undergoing elective minimally invasive cardiac surgery (MICS) through a right mini-thoracotomy, Eleveld model-driven target-controlled infusion (TCI) was associated with three findings of unequal evidentiary weight. Time to safe extubation was shorter by a median of 112.5 minutes and by 35.5% after adjustment for age, ASA physical status, and cardiopulmonary bypass (CPB) duration, and it was the only outcome for which the achieved post-hoc power reached the conventional 0.80 threshold. The post-CPB hemodynamic profile of the TCI cohort was distinct rather than simply smoother, combining higher heart rates and lower central venous pressures with half the intraoperative crystalloid volume. New-onset conduction block or temporary pacing clustered almost entirely in the manually controlled infusion (MCI) arm, an association of large magnitude that the present design cannot separate from surgical and temporal confounding. Each of these findings is discussed in turn, with attention to what the data can and cannot support.</w:t>
@@ -3708,6 +3709,7 @@
         <w:rPr>
           <w:rFonts w:ascii="Times New Roman" w:hAnsi="Times New Roman"/>
           <w:b w:val="0"/>
+          <w:color w:val="0000FF"/>
           <w:sz w:val="24"/>
         </w:rPr>
         <w:t>The extubation finding is the most defensible result of this analysis. A median of 188 minutes from the end of anesthesia to safe extubation places the TCI cohort within the ultra-fast-track range described for MICS, and the effect persisted after multivariable adjustment (35.5% reduction, p = 0.008) and was unmodified by CPB duration (interaction p = 0.983). The direction agrees with the international multi-cohort analysis of Bai et al., in which TCI in elderly cardiac surgery patients was associated with fewer reintubations and less prolonged mechanical ventilation than MCI [9]. It also agrees with the accumulating MICS-specific literature on accelerated respiratory recovery. Wang et al. reported that operating room extubation after minimally invasive valve surgery is feasible without an excess of adverse safety events [8], Jiang et al. documented a shortening of intensive care unit (ICU) stay from 44 to 22.8 hours when ultra-fast-track cardiac anesthesia was applied in 947 MICS patients [10], and an earlier cohort from the same group achieved extubation within 0.3 hours using serratus anterior plane block-assisted ultra-fast-track anesthesia [11]. A structured MICS protocol from a high-volume Turkish center likewise sets extubation within four to six hours as the target for hemodynamically stable patients [12]. Our TCI patients met that target comfortably, and our MCI patients did not.</w:t>
@@ -3727,6 +3729,7 @@
         <w:rPr>
           <w:rFonts w:ascii="Times New Roman" w:hAnsi="Times New Roman"/>
           <w:b w:val="0"/>
+          <w:color w:val="0000FF"/>
           <w:sz w:val="24"/>
         </w:rPr>
         <w:t>What distinguishes our cohort from most published ultra-fast-track series is that the acceleration was achieved without a standardized regional analgesia protocol. In the series of Jiang et al., fascial plane blockade was one of only two positive independent predictors of successful ultra-fast-track implementation (OR 0.120 for failure), and in the ultra-fast-track cohorts of that group the analgesic technique carried much of the effect [10,11]. Our institutional pathway did not apply chest wall blocks uniformly, which leaves the infusion strategy itself as the plausible driver. Mechanistically, this is consistent with what the Eleveld model was designed to do. Weight-proportional manual infusions carry no internal account of distribution and clearance, so a fixed rate maintained through a long bypass run tends toward relative overdose and a lengthening context-sensitive decrement time. A model that incorporates age, weight, sex, and the presence of concomitant opioid administration into a single all-age parameter set should, in principle, hold the effect-site concentration closer to the intended target during maintenance and allow a more predictable decay after the infusion stops [5,6]. We could not verify this mechanism directly, because total drug consumption, target effect-site concentrations, and time-in-range for the processed electroencephalography index were not retrievable from the archived records. The mechanism therefore remains inferred rather than demonstrated.</w:t>
@@ -3746,6 +3749,7 @@
         <w:rPr>
           <w:rFonts w:ascii="Times New Roman" w:hAnsi="Times New Roman"/>
           <w:b w:val="0"/>
+          <w:color w:val="0000FF"/>
           <w:sz w:val="24"/>
         </w:rPr>
         <w:t>The post-CPB hemodynamic pattern requires a more careful reading than the pre-CPB pattern. Higher mean heart rate (88.0 vs 80.0 bpm) and lower central venous pressure (12.7 vs 17.8 mmHg) were the two comparisons that survived Benjamini-Hochberg adjustment, both with large effect sizes, and both are internally consistent with the two-fold difference in crystalloid administration (1,000 vs 2,000 mL). Taken together, these describe a leaner, less volume-loaded circulation at separation from bypass rather than a more stable one. In the specific setting of MICS this distinction matters. Peripheral femoro-femoral cannulation with vacuum-assisted venous drainage makes venous return sensitive to filling and to cannula position, and total lung deflation with re-expansion at the end of bypass carries a recognized risk of re-expansion pulmonary edema for which long bypass duration and generous fluid and plasma administration are contributing factors [13]. A restrictive intraoperative fluid strategy is therefore desirable on independent grounds, and the association observed here between TCI and lower fluid requirement is clinically meaningful even though the direction of causality is not established: a more stable induction-to-bypass course may reduce the reflex to give volume, or an anesthesiologist choosing TCI may also be an anesthesiologist practicing restrictive filling.</w:t>
@@ -3765,6 +3769,7 @@
         <w:rPr>
           <w:rFonts w:ascii="Times New Roman" w:hAnsi="Times New Roman"/>
           <w:b w:val="0"/>
+          <w:color w:val="0000FF"/>
           <w:sz w:val="24"/>
         </w:rPr>
         <w:t>The same reading applies to the higher post-CPB variability indices in the TCI group (ARV p = 0.013). Average real variability and variability independent of the mean quantify fluctuation, not adequacy, and a circulation with less volume buffer will fluctuate more in response to identical surgical and vasoactive stimuli. We do not interpret this as evidence of superior control after bypass, and we note that it runs opposite to the pre-CPB direction. Reassuringly, near-infrared spectroscopy values were comparable between groups in both phases, indicating that the more dynamic post-bypass trajectory of the TCI cohort was not accompanied by a detectable penalty in cerebral oxygenation. Bai et al. encountered an analogous phenomenon between their two cohorts, where the Union and INSPIRE populations displayed opposite variability and hypotension phenotypes, and attributed it to institutional differences in permissive post-bypass afterload management [9]. Our data support treating post-CPB volume and vasoactive policy as a site-specific modifier of any TCI-versus-MCI comparison rather than as a fixed property of the infusion technique.</w:t>
@@ -3784,6 +3789,7 @@
         <w:rPr>
           <w:rFonts w:ascii="Times New Roman" w:hAnsi="Times New Roman"/>
           <w:b w:val="0"/>
+          <w:color w:val="0000FF"/>
           <w:sz w:val="24"/>
         </w:rPr>
         <w:t>In the pre-CPB phase, the pattern was the one predicted by the pharmacological rationale, but it did not survive multiplicity adjustment. Fewer TCI patients experienced at least one hypotensive episode (16.7% vs 44.7%, OR 0.25, 95% CI 0.06-0.97) and the cumulative area under the mean arterial pressure curve below 65 mmHg was smaller, yet both p-values rose to 0.121 after correction across the 16 comparisons of Table 4, and VIM did not reach significance in either analysis. This interval concentrates the procedure's stimulus density, comprising induction, lateral tilt, initiation of one-lung ventilation, and femoral cannulation, and it is where a model-based system with continuous recalculation should differ most from stepwise manual adjustment [14-18]. That the direction was concordant with Bai et al. while the significance was not preserved is best explained by the size of the TCI arm. Eighteen patients provide little resolution for an incidence comparison, and we present these results as suggestive rather than confirmatory, in line with the conservative interpretation already adopted in the Results.</w:t>
@@ -3803,6 +3809,7 @@
         <w:rPr>
           <w:rFonts w:ascii="Times New Roman" w:hAnsi="Times New Roman"/>
           <w:b w:val="0"/>
+          <w:color w:val="0000FF"/>
           <w:sz w:val="24"/>
         </w:rPr>
         <w:t>The conduction findings are the most provocative and the least secure. Nineteen of twenty perioperative block or temporary pacing events occurred among the 47 MCI patients and one among the 18 TCI patients (Fisher's exact p = 0.007). Biological plausibility for an anesthetic contribution exists but is indirect. The atrioventricular node and the penetrating bundle lie immediately adjacent to the mitral and tricuspid annuli, so direct surgical trauma, retraction, and annular edema remain the dominant determinants of postoperative block after valve surgery, and the right mini-thoracotomy approach itself has been associated with bradycardia and atrioventricular conduction disturbance independently of the anesthetic technique [19]. If anesthetic management contributes at all, it would most plausibly do so through the perfusion conditions of the conduction tissue during and after separation from bypass: maintained diastolic and coronary perfusion pressure, avoidance of the profound sympatholysis that accompanies remifentanil accumulation, and the lower venous back-pressure suggested by the 5 mmHg difference in central venous pressure, which bears on coronary sinus drainage and myocardial interstitial edema. These are hypotheses, not conclusions. Three features of the data argue for restraint. The TCI patients were younger by a median of 17 years, their baseline heart rate was higher (90 vs 76 bpm), and the six-year enrollment window coincided with maturation of the institutional MICS program, so that the two infusion strategies are partly confounded with surgical experience and calendar time. Event sparsity precluded multivariable modelling of this endpoint, leaving an unadjusted test and an unstable effect estimate. Comparative outcome claims across evolving minimally invasive valve techniques are known to be vulnerable to exactly this kind of case-mix and temporal drift [20]. The association merits prospective evaluation with adjudicated electrocardiographic endpoints and prespecified adjustment for annular pathology and cross-clamp time. It does not, on this evidence, warrant a causal claim.</w:t>
@@ -3822,6 +3829,7 @@
         <w:rPr>
           <w:rFonts w:ascii="Times New Roman" w:hAnsi="Times New Roman"/>
           <w:b w:val="0"/>
+          <w:color w:val="0000FF"/>
           <w:sz w:val="24"/>
         </w:rPr>
         <w:t>Intensive care unit length of stay behaved as a downstream rather than a proximate endpoint. The unadjusted difference of 3.2 hours favoring TCI (p = 0.042) attenuated to non-significance once CPB duration entered the model (p = 0.272, 17.1% shorter on the back-transformed scale), and CPB duration was the only independent predictor retained (p = 0.032). Achieved power for this comparison was 21.5%. This should not be read as evidence against a TCI effect on ICU utilization. Bai et al. detected a difference of approximately one day in more than 700 propensity-matched patients [9], a magnitude that a sample of 65 cannot resolve, and ICU discharge in our unit is additionally bounded by ward availability and protocol-driven morning rounds, which compress the observable variance. The absence of any difference in hospital length of stay (8 vs 7 days, p = 0.854) is consistent with the same reasoning and with the larger MICS literature, where a two-day separation in hospital stay required 947 patients to demonstrate [10].</w:t>
@@ -3841,6 +3849,7 @@
         <w:rPr>
           <w:rFonts w:ascii="Times New Roman" w:hAnsi="Times New Roman"/>
           <w:b w:val="0"/>
+          <w:color w:val="0000FF"/>
           <w:sz w:val="24"/>
         </w:rPr>
         <w:t>Two implications follow for practice. First, Eleveld model-driven TCI appears compatible with an ultra-fast-track MICS pathway and requires no monitoring investment beyond the processed electroencephalography and cerebral oximetry already standard in these procedures. Second, it should be positioned as complementary to, not a substitute for, the other established levers of early extubation. Multimodal chest wall analgesia has the strongest evidence base among these, with serratus anterior plane blockade reducing opioid consumption after minimally invasive mitral surgery and a widening set of fascial plane techniques now described for MICS [21,22]. Combining a pharmacokinetically governed infusion with a standardized block protocol and a restrictive fluid strategy is the logical next step, and it is a testable one.</w:t>
@@ -3885,6 +3894,7 @@
         <w:rPr>
           <w:rFonts w:ascii="Times New Roman" w:hAnsi="Times New Roman"/>
           <w:b w:val="0"/>
+          <w:color w:val="0000FF"/>
           <w:sz w:val="24"/>
         </w:rPr>
         <w:t>This study has substantial limitations that constrain the strength of every inference drawn above. The design is retrospective, single-center, and non-randomized, and allocation to TCI or MCI followed the preference of the attending anesthesiologist rather than a protocol. Confounding by indication is therefore unavoidable, and the direction of that confounding is not predictable: a clinician who selects a model-driven infusion may also apply a restrictive fluid strategy, a lower opioid load, and a more determined extubation policy, none of which can be disentangled from the infusion technique in these records.</w:t>
@@ -3906,6 +3916,7 @@
         <w:rPr>
           <w:rFonts w:ascii="Times New Roman" w:hAnsi="Times New Roman"/>
           <w:b w:val="0"/>
+          <w:color w:val="0000FF"/>
           <w:sz w:val="24"/>
         </w:rPr>
         <w:t>The groups were unbalanced in ways that bear directly on the principal outcomes. The TCI arm comprised 18 patients against 47 receiving MCI, and TCI patients were younger by a median of 17 years, more frequently hypertensive (61.1% vs 31.9%), and had a significantly higher baseline heart rate (90 vs 76 bpm). The last of these deserves particular emphasis, because the post-CPB heart rate difference that survived multiplicity adjustment may in part carry a baseline difference forward rather than reflect an effect of the anesthetic technique. Age, ASA physical status, and CPB duration were entered into the multivariable models, but baseline heart rate was not, and no adjustment can compensate for a treated group of 18.</w:t>
@@ -3927,6 +3938,7 @@
         <w:rPr>
           <w:rFonts w:ascii="Times New Roman" w:hAnsi="Times New Roman"/>
           <w:b w:val="0"/>
+          <w:color w:val="0000FF"/>
           <w:sz w:val="24"/>
         </w:rPr>
         <w:t>Enrollment spanned January 2020 to July 2025, and TCI was adopted later in that window. The comparison is therefore partly a comparison between calendar periods, during which the surgical program accumulated experience, perfusion and transfusion practice evolved, and enhanced recovery expectations tightened. This temporal confounding is an alternative explanation for both the extubation advantage and the conduction block distribution, and the available records did not permit adjustment for operative date or surgeon.</w:t>
@@ -3948,6 +3960,7 @@
         <w:rPr>
           <w:rFonts w:ascii="Times New Roman" w:hAnsi="Times New Roman"/>
           <w:b w:val="0"/>
+          <w:color w:val="0000FF"/>
           <w:sz w:val="24"/>
         </w:rPr>
         <w:t>Several measurement limitations apply. Intraoperative mean arterial pressure and heart rate were sampled at five-minute intervals, which attenuates average real variability and underestimates both the incidence and the cumulative area of brief hypotensive episodes; a higher sampling frequency would likely have increased the resolution of the pre-CPB comparison. The VIM transformation depends on a regression coefficient estimated within this cohort, so the resulting values are not directly comparable with those reported elsewhere. Depth of anesthesia was monitored with either the Narcotrend index or the bispectral index rather than a single device, and neither the achieved index values nor time-in-range were recoverable. Total propofol and remifentanil consumption and the target effect-site concentrations actually set were likewise unavailable, which prevents any direct pharmacokinetic verification of the proposed mechanism.</w:t>
@@ -3969,6 +3982,7 @@
         <w:rPr>
           <w:rFonts w:ascii="Times New Roman" w:hAnsi="Times New Roman"/>
           <w:b w:val="0"/>
+          <w:color w:val="0000FF"/>
           <w:sz w:val="24"/>
         </w:rPr>
         <w:t>Outcome ascertainment for the conduction endpoint relied on retrospective review of daily electrocardiograms and continuous telemetry without independent adjudication, and the composite of new block or temporary pacing does not distinguish transient conduction disturbance from persistent block, nor does it extend to permanent pacemaker implantation after discharge. Postoperative complications were otherwise infrequent, and the resulting event counts precluded inferential comparison and multivariable modelling for all of them, including the conduction endpoint itself. No a priori sample size calculation was performed; post-hoc power reached 0.80 only for time to extubation and was 21.5% for ICU length of stay, so negative secondary findings should not be read as evidence of absence. The Benjamini-Hochberg family was defined as the 16 hemodynamic comparisons of Table 4, which is a defensible but not a unique choice, and outcomes analyzed outside that family were not corrected for multiplicity.</w:t>
@@ -3990,6 +4004,7 @@
         <w:rPr>
           <w:rFonts w:ascii="Times New Roman" w:hAnsi="Times New Roman"/>
           <w:b w:val="0"/>
+          <w:color w:val="0000FF"/>
           <w:sz w:val="24"/>
         </w:rPr>
         <w:t>Finally, the cohort was drawn from a single tertiary center performing elective isolated mitral, tricuspid, and atrial septal defect procedures through a right mini-thoracotomy with peripheral cardiopulmonary bypass, in patients of ASA physical status III or IV without pre-existing advanced conduction disease. Findings should not be extended to sternotomy cases, to combined or emergency procedures, or to anatomically distorted presentations such as giant left atrium, where cannulation strategy and exposure differ materially [23]. The particular hazards of peripheral cannulation, including differential hypoxemia during femoro-femoral bypass, are additional site- and case-specific determinants of the intraoperative course that this analysis did not capture [24]. Regional analgesia was not standardized, chest tube drainage, pain scores, and opioid consumption were not systematically recorded, and no data on postoperative pulmonary function, patient-reported outcomes, cost, or follow-up beyond hospital discharge were collected, so the downstream consequences of earlier extubation reported in comparable MICS cohorts could not be assessed here [25].</w:t>
@@ -4505,6 +4520,7 @@
         <w:rPr>
           <w:rFonts w:ascii="Times New Roman" w:hAnsi="Times New Roman"/>
           <w:b w:val="0"/>
+          <w:color w:val="0000FF"/>
           <w:sz w:val="24"/>
         </w:rPr>
         <w:t>9.</w:t>
@@ -4527,6 +4543,7 @@
         <w:rPr>
           <w:rFonts w:ascii="Times New Roman" w:hAnsi="Times New Roman"/>
           <w:b w:val="0"/>
+          <w:color w:val="0000FF"/>
           <w:sz w:val="24"/>
         </w:rPr>
         <w:t>10.</w:t>
@@ -4549,6 +4566,7 @@
         <w:rPr>
           <w:rFonts w:ascii="Times New Roman" w:hAnsi="Times New Roman"/>
           <w:b w:val="0"/>
+          <w:color w:val="0000FF"/>
           <w:sz w:val="24"/>
         </w:rPr>
         <w:t>11.</w:t>
@@ -4571,6 +4589,7 @@
         <w:rPr>
           <w:rFonts w:ascii="Times New Roman" w:hAnsi="Times New Roman"/>
           <w:b w:val="0"/>
+          <w:color w:val="0000FF"/>
           <w:sz w:val="24"/>
         </w:rPr>
         <w:t>12.</w:t>
@@ -4593,6 +4612,7 @@
         <w:rPr>
           <w:rFonts w:ascii="Times New Roman" w:hAnsi="Times New Roman"/>
           <w:b w:val="0"/>
+          <w:color w:val="0000FF"/>
           <w:sz w:val="24"/>
         </w:rPr>
         <w:t>13.</w:t>
@@ -4615,6 +4635,7 @@
         <w:rPr>
           <w:rFonts w:ascii="Times New Roman" w:hAnsi="Times New Roman"/>
           <w:b w:val="0"/>
+          <w:color w:val="0000FF"/>
           <w:sz w:val="24"/>
         </w:rPr>
         <w:t>14.</w:t>
@@ -4637,6 +4658,7 @@
         <w:rPr>
           <w:rFonts w:ascii="Times New Roman" w:hAnsi="Times New Roman"/>
           <w:b w:val="0"/>
+          <w:color w:val="0000FF"/>
           <w:sz w:val="24"/>
         </w:rPr>
         <w:t>15.</w:t>
@@ -4659,6 +4681,7 @@
         <w:rPr>
           <w:rFonts w:ascii="Times New Roman" w:hAnsi="Times New Roman"/>
           <w:b w:val="0"/>
+          <w:color w:val="0000FF"/>
           <w:sz w:val="24"/>
         </w:rPr>
         <w:t>16.</w:t>
@@ -4681,6 +4704,7 @@
         <w:rPr>
           <w:rFonts w:ascii="Times New Roman" w:hAnsi="Times New Roman"/>
           <w:b w:val="0"/>
+          <w:color w:val="0000FF"/>
           <w:sz w:val="24"/>
         </w:rPr>
         <w:t>17.</w:t>
@@ -4703,6 +4727,7 @@
         <w:rPr>
           <w:rFonts w:ascii="Times New Roman" w:hAnsi="Times New Roman"/>
           <w:b w:val="0"/>
+          <w:color w:val="0000FF"/>
           <w:sz w:val="24"/>
         </w:rPr>
         <w:t>18.</w:t>
@@ -4725,6 +4750,7 @@
         <w:rPr>
           <w:rFonts w:ascii="Times New Roman" w:hAnsi="Times New Roman"/>
           <w:b w:val="0"/>
+          <w:color w:val="0000FF"/>
           <w:sz w:val="24"/>
         </w:rPr>
         <w:t>19.</w:t>
@@ -4747,6 +4773,7 @@
         <w:rPr>
           <w:rFonts w:ascii="Times New Roman" w:hAnsi="Times New Roman"/>
           <w:b w:val="0"/>
+          <w:color w:val="0000FF"/>
           <w:sz w:val="24"/>
         </w:rPr>
         <w:t>20.</w:t>
@@ -4769,6 +4796,7 @@
         <w:rPr>
           <w:rFonts w:ascii="Times New Roman" w:hAnsi="Times New Roman"/>
           <w:b w:val="0"/>
+          <w:color w:val="0000FF"/>
           <w:sz w:val="24"/>
         </w:rPr>
         <w:t>21.</w:t>
@@ -4791,6 +4819,7 @@
         <w:rPr>
           <w:rFonts w:ascii="Times New Roman" w:hAnsi="Times New Roman"/>
           <w:b w:val="0"/>
+          <w:color w:val="0000FF"/>
           <w:sz w:val="24"/>
         </w:rPr>
         <w:t>22.</w:t>
@@ -4813,6 +4842,7 @@
         <w:rPr>
           <w:rFonts w:ascii="Times New Roman" w:hAnsi="Times New Roman"/>
           <w:b w:val="0"/>
+          <w:color w:val="0000FF"/>
           <w:sz w:val="24"/>
         </w:rPr>
         <w:t>23.</w:t>
@@ -4835,6 +4865,7 @@
         <w:rPr>
           <w:rFonts w:ascii="Times New Roman" w:hAnsi="Times New Roman"/>
           <w:b w:val="0"/>
+          <w:color w:val="0000FF"/>
           <w:sz w:val="24"/>
         </w:rPr>
         <w:t>24.</w:t>
@@ -4857,6 +4888,7 @@
         <w:rPr>
           <w:rFonts w:ascii="Times New Roman" w:hAnsi="Times New Roman"/>
           <w:b w:val="0"/>
+          <w:color w:val="0000FF"/>
           <w:sz w:val="24"/>
         </w:rPr>
         <w:t>25.</w:t>

</xml_diff>